<commit_message>
docs: polish system design documentation and high-legibility diagrams (DOCX, PDF, PPTX)
</commit_message>
<xml_diff>
--- a/docs/DOKUMEN_PERANCANGAN_SIGMA-K_v1.0.docx
+++ b/docs/DOKUMEN_PERANCANGAN_SIGMA-K_v1.0.docx
@@ -64,10 +64,10 @@
         <w:jc w:val="center"/>
         <w:tblLook w:firstColumn="1" w:firstRow="1" w:lastColumn="0" w:lastRow="0" w:noHBand="0" w:noVBand="1" w:val="04A0"/>
         <w:tblBorders>
-          <w:top w:val="single" w:sz="4" w:space="0" w:color="CBD5E1"/>
-          <w:left w:val="single" w:sz="4" w:space="0" w:color="CBD5E1"/>
-          <w:bottom w:val="single" w:sz="4" w:space="0" w:color="CBD5E1"/>
-          <w:right w:val="single" w:sz="4" w:space="0" w:color="CBD5E1"/>
+          <w:top w:val="single" w:sz="6" w:space="0" w:color="CBD5E1"/>
+          <w:left w:val="single" w:sz="6" w:space="0" w:color="CBD5E1"/>
+          <w:bottom w:val="single" w:sz="6" w:space="0" w:color="CBD5E1"/>
+          <w:right w:val="single" w:sz="6" w:space="0" w:color="CBD5E1"/>
           <w:insideH w:val="single" w:sz="4" w:space="0" w:color="CBD5E1"/>
           <w:insideV w:val="single" w:sz="4" w:space="0" w:color="CBD5E1"/>
         </w:tblBorders>
@@ -81,10 +81,10 @@
           <w:tcPr>
             <w:tcW w:type="dxa" w:w="3168"/>
             <w:tcMar>
-              <w:top w:w="80" w:type="dxa"/>
-              <w:bottom w:w="80" w:type="dxa"/>
-              <w:left w:w="100" w:type="dxa"/>
-              <w:right w:w="100" w:type="dxa"/>
+              <w:top w:w="90" w:type="dxa"/>
+              <w:bottom w:w="90" w:type="dxa"/>
+              <w:left w:w="120" w:type="dxa"/>
+              <w:right w:w="120" w:type="dxa"/>
             </w:tcMar>
             <w:shd w:fill="F1F5F9"/>
           </w:tcPr>
@@ -106,10 +106,10 @@
           <w:tcPr>
             <w:tcW w:type="dxa" w:w="6192"/>
             <w:tcMar>
-              <w:top w:w="80" w:type="dxa"/>
-              <w:bottom w:w="80" w:type="dxa"/>
-              <w:left w:w="100" w:type="dxa"/>
-              <w:right w:w="100" w:type="dxa"/>
+              <w:top w:w="90" w:type="dxa"/>
+              <w:bottom w:w="90" w:type="dxa"/>
+              <w:left w:w="120" w:type="dxa"/>
+              <w:right w:w="120" w:type="dxa"/>
             </w:tcMar>
           </w:tcPr>
           <w:p>
@@ -131,10 +131,10 @@
           <w:tcPr>
             <w:tcW w:type="dxa" w:w="3168"/>
             <w:tcMar>
-              <w:top w:w="80" w:type="dxa"/>
-              <w:bottom w:w="80" w:type="dxa"/>
-              <w:left w:w="100" w:type="dxa"/>
-              <w:right w:w="100" w:type="dxa"/>
+              <w:top w:w="90" w:type="dxa"/>
+              <w:bottom w:w="90" w:type="dxa"/>
+              <w:left w:w="120" w:type="dxa"/>
+              <w:right w:w="120" w:type="dxa"/>
             </w:tcMar>
             <w:shd w:fill="F1F5F9"/>
           </w:tcPr>
@@ -156,10 +156,10 @@
           <w:tcPr>
             <w:tcW w:type="dxa" w:w="6192"/>
             <w:tcMar>
-              <w:top w:w="80" w:type="dxa"/>
-              <w:bottom w:w="80" w:type="dxa"/>
-              <w:left w:w="100" w:type="dxa"/>
-              <w:right w:w="100" w:type="dxa"/>
+              <w:top w:w="90" w:type="dxa"/>
+              <w:bottom w:w="90" w:type="dxa"/>
+              <w:left w:w="120" w:type="dxa"/>
+              <w:right w:w="120" w:type="dxa"/>
             </w:tcMar>
           </w:tcPr>
           <w:p>
@@ -181,10 +181,10 @@
           <w:tcPr>
             <w:tcW w:type="dxa" w:w="3168"/>
             <w:tcMar>
-              <w:top w:w="80" w:type="dxa"/>
-              <w:bottom w:w="80" w:type="dxa"/>
-              <w:left w:w="100" w:type="dxa"/>
-              <w:right w:w="100" w:type="dxa"/>
+              <w:top w:w="90" w:type="dxa"/>
+              <w:bottom w:w="90" w:type="dxa"/>
+              <w:left w:w="120" w:type="dxa"/>
+              <w:right w:w="120" w:type="dxa"/>
             </w:tcMar>
             <w:shd w:fill="F1F5F9"/>
           </w:tcPr>
@@ -206,10 +206,10 @@
           <w:tcPr>
             <w:tcW w:type="dxa" w:w="6192"/>
             <w:tcMar>
-              <w:top w:w="80" w:type="dxa"/>
-              <w:bottom w:w="80" w:type="dxa"/>
-              <w:left w:w="100" w:type="dxa"/>
-              <w:right w:w="100" w:type="dxa"/>
+              <w:top w:w="90" w:type="dxa"/>
+              <w:bottom w:w="90" w:type="dxa"/>
+              <w:left w:w="120" w:type="dxa"/>
+              <w:right w:w="120" w:type="dxa"/>
             </w:tcMar>
           </w:tcPr>
           <w:p>
@@ -231,10 +231,10 @@
           <w:tcPr>
             <w:tcW w:type="dxa" w:w="3168"/>
             <w:tcMar>
-              <w:top w:w="80" w:type="dxa"/>
-              <w:bottom w:w="80" w:type="dxa"/>
-              <w:left w:w="100" w:type="dxa"/>
-              <w:right w:w="100" w:type="dxa"/>
+              <w:top w:w="90" w:type="dxa"/>
+              <w:bottom w:w="90" w:type="dxa"/>
+              <w:left w:w="120" w:type="dxa"/>
+              <w:right w:w="120" w:type="dxa"/>
             </w:tcMar>
             <w:shd w:fill="F1F5F9"/>
           </w:tcPr>
@@ -256,10 +256,10 @@
           <w:tcPr>
             <w:tcW w:type="dxa" w:w="6192"/>
             <w:tcMar>
-              <w:top w:w="80" w:type="dxa"/>
-              <w:bottom w:w="80" w:type="dxa"/>
-              <w:left w:w="100" w:type="dxa"/>
-              <w:right w:w="100" w:type="dxa"/>
+              <w:top w:w="90" w:type="dxa"/>
+              <w:bottom w:w="90" w:type="dxa"/>
+              <w:left w:w="120" w:type="dxa"/>
+              <w:right w:w="120" w:type="dxa"/>
             </w:tcMar>
           </w:tcPr>
           <w:p>
@@ -281,10 +281,10 @@
           <w:tcPr>
             <w:tcW w:type="dxa" w:w="3168"/>
             <w:tcMar>
-              <w:top w:w="80" w:type="dxa"/>
-              <w:bottom w:w="80" w:type="dxa"/>
-              <w:left w:w="100" w:type="dxa"/>
-              <w:right w:w="100" w:type="dxa"/>
+              <w:top w:w="90" w:type="dxa"/>
+              <w:bottom w:w="90" w:type="dxa"/>
+              <w:left w:w="120" w:type="dxa"/>
+              <w:right w:w="120" w:type="dxa"/>
             </w:tcMar>
             <w:shd w:fill="F1F5F9"/>
           </w:tcPr>
@@ -306,10 +306,10 @@
           <w:tcPr>
             <w:tcW w:type="dxa" w:w="6192"/>
             <w:tcMar>
-              <w:top w:w="80" w:type="dxa"/>
-              <w:bottom w:w="80" w:type="dxa"/>
-              <w:left w:w="100" w:type="dxa"/>
-              <w:right w:w="100" w:type="dxa"/>
+              <w:top w:w="90" w:type="dxa"/>
+              <w:bottom w:w="90" w:type="dxa"/>
+              <w:left w:w="120" w:type="dxa"/>
+              <w:right w:w="120" w:type="dxa"/>
             </w:tcMar>
           </w:tcPr>
           <w:p>
@@ -331,10 +331,10 @@
           <w:tcPr>
             <w:tcW w:type="dxa" w:w="3168"/>
             <w:tcMar>
-              <w:top w:w="80" w:type="dxa"/>
-              <w:bottom w:w="80" w:type="dxa"/>
-              <w:left w:w="100" w:type="dxa"/>
-              <w:right w:w="100" w:type="dxa"/>
+              <w:top w:w="90" w:type="dxa"/>
+              <w:bottom w:w="90" w:type="dxa"/>
+              <w:left w:w="120" w:type="dxa"/>
+              <w:right w:w="120" w:type="dxa"/>
             </w:tcMar>
             <w:shd w:fill="F1F5F9"/>
           </w:tcPr>
@@ -356,10 +356,10 @@
           <w:tcPr>
             <w:tcW w:type="dxa" w:w="6192"/>
             <w:tcMar>
-              <w:top w:w="80" w:type="dxa"/>
-              <w:bottom w:w="80" w:type="dxa"/>
-              <w:left w:w="100" w:type="dxa"/>
-              <w:right w:w="100" w:type="dxa"/>
+              <w:top w:w="90" w:type="dxa"/>
+              <w:bottom w:w="90" w:type="dxa"/>
+              <w:left w:w="120" w:type="dxa"/>
+              <w:right w:w="120" w:type="dxa"/>
             </w:tcMar>
           </w:tcPr>
           <w:p>
@@ -1067,7 +1067,7 @@
           <w:color w:val="1E293B"/>
           <w:sz w:val="20"/>
         </w:rPr>
-        <w:t>SIGMA-K dirancang menggunakan paradigma Multi-Tier Decoupled Architecture yang memisahkan secara tegas antarmuka pengguna (Frontend Next.js), gerbang transportasi data (HTTP Client Gateway), lapisan logika bisnis dan otorisasi (Backend CodeIgniter 4), serta basis data relasional (MySQL). Pendekatan ini memastikan skalabilitas tinggi, kemudahan pemeliharaan, serta kepatuhan penuh terhadap standar keamanan informasi pemerintah.</w:t>
+        <w:t>SIGMA-K dirancang menggunakan paradigma Multi-Tier Decoupled Architecture yang memisahkan secara tegas antarmuka pengguna (Frontend Next.js), gerbang transportasi data (HTTP Client Gateway), lapisan logika bisnis dan otorisasi (Backend CodeIgniter 4), serta basis data relasional (MySQL).</w:t>
       </w:r>
     </w:p>
     <w:p>
@@ -1083,19 +1083,6 @@
           <w:sz w:val="24"/>
         </w:rPr>
         <w:t>2.2 Fungsi Utama Sistem</w:t>
-      </w:r>
-    </w:p>
-    <w:p>
-      <w:pPr>
-        <w:spacing w:after="80" w:line="276" w:lineRule="auto"/>
-      </w:pPr>
-      <w:r>
-        <w:rPr>
-          <w:rFonts w:ascii="Calibri" w:hAnsi="Calibri"/>
-          <w:color w:val="1E293B"/>
-          <w:sz w:val="20"/>
-        </w:rPr>
-        <w:t>Fungsi-fungsi inti yang disediakan SIGMA-K meliputi:</w:t>
       </w:r>
     </w:p>
     <w:p>
@@ -1292,7 +1279,7 @@
     <w:p>
       <w:pPr>
         <w:keepNext/>
-        <w:spacing w:before="120" w:after="40"/>
+        <w:spacing w:before="160" w:after="60"/>
       </w:pPr>
       <w:r>
         <w:rPr>
@@ -1309,10 +1296,10 @@
         <w:jc w:val="center"/>
         <w:tblLook w:firstColumn="1" w:firstRow="1" w:lastColumn="0" w:lastRow="0" w:noHBand="0" w:noVBand="1" w:val="04A0"/>
         <w:tblBorders>
-          <w:top w:val="single" w:sz="4" w:space="0" w:color="CBD5E1"/>
-          <w:left w:val="single" w:sz="4" w:space="0" w:color="CBD5E1"/>
-          <w:bottom w:val="single" w:sz="4" w:space="0" w:color="CBD5E1"/>
-          <w:right w:val="single" w:sz="4" w:space="0" w:color="CBD5E1"/>
+          <w:top w:val="single" w:sz="6" w:space="0" w:color="CBD5E1"/>
+          <w:left w:val="single" w:sz="6" w:space="0" w:color="CBD5E1"/>
+          <w:bottom w:val="single" w:sz="6" w:space="0" w:color="CBD5E1"/>
+          <w:right w:val="single" w:sz="6" w:space="0" w:color="CBD5E1"/>
           <w:insideH w:val="single" w:sz="4" w:space="0" w:color="CBD5E1"/>
           <w:insideV w:val="single" w:sz="4" w:space="0" w:color="CBD5E1"/>
         </w:tblBorders>
@@ -2323,167 +2310,7 @@
           <w:color w:val="1E40AF"/>
           <w:sz w:val="24"/>
         </w:rPr>
-        <w:t>2.4 Alur Data Antar Lapisan</w:t>
-      </w:r>
-    </w:p>
-    <w:p>
-      <w:pPr>
-        <w:spacing w:after="80" w:line="276" w:lineRule="auto"/>
-      </w:pPr>
-      <w:r>
-        <w:rPr>
-          <w:rFonts w:ascii="Calibri" w:hAnsi="Calibri"/>
-          <w:color w:val="1E293B"/>
-          <w:sz w:val="20"/>
-        </w:rPr>
-        <w:t>Setiap permintaan (request) data dari pengguna diproses melalui rantai kendali yang ketat:</w:t>
-      </w:r>
-    </w:p>
-    <w:p>
-      <w:pPr>
-        <w:pStyle w:val="ListBullet"/>
-        <w:spacing w:after="40" w:line="276" w:lineRule="auto"/>
-      </w:pPr>
-      <w:r>
-        <w:rPr>
-          <w:b/>
-          <w:color w:val="0B2A4A"/>
-          <w:sz w:val="20"/>
-        </w:rPr>
-        <w:t xml:space="preserve">1. Presentation Layer: </w:t>
-      </w:r>
-      <w:r>
-        <w:rPr>
-          <w:rFonts w:ascii="Calibri" w:hAnsi="Calibri"/>
-          <w:color w:val="1E293B"/>
-          <w:sz w:val="20"/>
-        </w:rPr>
-        <w:t>Pengguna berinteraksi dengan UI Next.js (React 18). Komponen memanggil Service Facade yang telah diabstraksi.</w:t>
-      </w:r>
-    </w:p>
-    <w:p>
-      <w:pPr>
-        <w:pStyle w:val="ListBullet"/>
-        <w:spacing w:after="40" w:line="276" w:lineRule="auto"/>
-      </w:pPr>
-      <w:r>
-        <w:rPr>
-          <w:b/>
-          <w:color w:val="0B2A4A"/>
-          <w:sz w:val="20"/>
-        </w:rPr>
-        <w:t xml:space="preserve">2. Transport Layer: </w:t>
-      </w:r>
-      <w:r>
-        <w:rPr>
-          <w:rFonts w:ascii="Calibri" w:hAnsi="Calibri"/>
-          <w:color w:val="1E293B"/>
-          <w:sz w:val="20"/>
-        </w:rPr>
-        <w:t>HttpClient melakukan injeksi header `Authorization: Bearer &lt;token&gt;` dan mengirimkan request HTTPS ke REST API.</w:t>
-      </w:r>
-    </w:p>
-    <w:p>
-      <w:pPr>
-        <w:pStyle w:val="ListBullet"/>
-        <w:spacing w:after="40" w:line="276" w:lineRule="auto"/>
-      </w:pPr>
-      <w:r>
-        <w:rPr>
-          <w:b/>
-          <w:color w:val="0B2A4A"/>
-          <w:sz w:val="20"/>
-        </w:rPr>
-        <w:t xml:space="preserve">3. Filter &amp; JWT Verification: </w:t>
-      </w:r>
-      <w:r>
-        <w:rPr>
-          <w:rFonts w:ascii="Calibri" w:hAnsi="Calibri"/>
-          <w:color w:val="1E293B"/>
-          <w:sz w:val="20"/>
-        </w:rPr>
-        <w:t>AuthFilter memverifikasi validitas tanda tangan kriptografis JWT, mengekstrak identitas pengguna, role, dan home institution.</w:t>
-      </w:r>
-    </w:p>
-    <w:p>
-      <w:pPr>
-        <w:pStyle w:val="ListBullet"/>
-        <w:spacing w:after="40" w:line="276" w:lineRule="auto"/>
-      </w:pPr>
-      <w:r>
-        <w:rPr>
-          <w:b/>
-          <w:color w:val="0B2A4A"/>
-          <w:sz w:val="20"/>
-        </w:rPr>
-        <w:t xml:space="preserve">4. Zero-Trust Authorization: </w:t>
-      </w:r>
-      <w:r>
-        <w:rPr>
-          <w:rFonts w:ascii="Calibri" w:hAnsi="Calibri"/>
-          <w:color w:val="1E293B"/>
-          <w:sz w:val="20"/>
-        </w:rPr>
-        <w:t>AuthorizationService &amp; ScopeResolver memeriksa izin granular (permissions) dan memastikan target instansi berada dalam cakupan wewenang pengguna (Anti BOLA/IDOR).</w:t>
-      </w:r>
-    </w:p>
-    <w:p>
-      <w:pPr>
-        <w:pStyle w:val="ListBullet"/>
-        <w:spacing w:after="40" w:line="276" w:lineRule="auto"/>
-      </w:pPr>
-      <w:r>
-        <w:rPr>
-          <w:b/>
-          <w:color w:val="0B2A4A"/>
-          <w:sz w:val="20"/>
-        </w:rPr>
-        <w:t xml:space="preserve">5. Domain Business Logic: </w:t>
-      </w:r>
-      <w:r>
-        <w:rPr>
-          <w:rFonts w:ascii="Calibri" w:hAnsi="Calibri"/>
-          <w:color w:val="1E293B"/>
-          <w:sz w:val="20"/>
-        </w:rPr>
-        <w:t>Domain Service mengeksekusi logika bisnis, memvalidasi aturan state machine, dan mencatat mutasi ke AuditService.</w:t>
-      </w:r>
-    </w:p>
-    <w:p>
-      <w:pPr>
-        <w:pStyle w:val="ListBullet"/>
-        <w:spacing w:after="40" w:line="276" w:lineRule="auto"/>
-      </w:pPr>
-      <w:r>
-        <w:rPr>
-          <w:b/>
-          <w:color w:val="0B2A4A"/>
-          <w:sz w:val="20"/>
-        </w:rPr>
-        <w:t xml:space="preserve">6. Data Persistence: </w:t>
-      </w:r>
-      <w:r>
-        <w:rPr>
-          <w:rFonts w:ascii="Calibri" w:hAnsi="Calibri"/>
-          <w:color w:val="1E293B"/>
-          <w:sz w:val="20"/>
-        </w:rPr>
-        <w:t>Data disimpan atau diambil dari basis data MySQL eskld_db menggunakan PDO query builder terenkapsulasi.</w:t>
-      </w:r>
-    </w:p>
-    <w:p>
-      <w:pPr>
-        <w:keepNext/>
-        <w:spacing w:before="200" w:after="80"/>
-      </w:pPr>
-      <w:r>
-        <w:rPr>
-          <w:rFonts w:ascii="Calibri" w:hAnsi="Calibri"/>
-          <w:b/>
-          <w:color w:val="1E40AF"/>
-          <w:sz w:val="24"/>
-        </w:rPr>
-        <w:t>2.5 Arsitektur Sistem</w:t>
+        <w:t>2.4 Arsitektur Sistem</w:t>
       </w:r>
     </w:p>
     <w:p>
@@ -2502,13 +2329,13 @@
     <w:p>
       <w:pPr>
         <w:keepNext/>
-        <w:spacing w:before="160" w:after="40"/>
+        <w:spacing w:before="160" w:after="60"/>
         <w:jc w:val="center"/>
       </w:pPr>
       <w:r>
         <w:drawing>
           <wp:inline xmlns:a="http://schemas.openxmlformats.org/drawingml/2006/main" xmlns:pic="http://schemas.openxmlformats.org/drawingml/2006/picture">
-            <wp:extent cx="5486400" cy="3515069"/>
+            <wp:extent cx="5760720" cy="3780472"/>
             <wp:docPr id="1" name="Picture 1"/>
             <wp:cNvGraphicFramePr>
               <a:graphicFrameLocks noChangeAspect="1"/>
@@ -2529,7 +2356,7 @@
                   <pic:spPr>
                     <a:xfrm>
                       <a:off x="0" y="0"/>
-                      <a:ext cx="5486400" cy="3515069"/>
+                      <a:ext cx="5760720" cy="3780472"/>
                     </a:xfrm>
                     <a:prstGeom prst="rect"/>
                   </pic:spPr>
@@ -2754,13 +2581,13 @@
           <w:color w:val="1E40AF"/>
           <w:sz w:val="24"/>
         </w:rPr>
-        <w:t>3.2 Matriks Hak Akses dan Lingkup Wewenang</w:t>
+        <w:t>3.2 Matriks Hak Akses</w:t>
       </w:r>
     </w:p>
     <w:p>
       <w:pPr>
         <w:keepNext/>
-        <w:spacing w:before="120" w:after="40"/>
+        <w:spacing w:before="160" w:after="60"/>
       </w:pPr>
       <w:r>
         <w:rPr>
@@ -2777,10 +2604,10 @@
         <w:jc w:val="center"/>
         <w:tblLook w:firstColumn="1" w:firstRow="1" w:lastColumn="0" w:lastRow="0" w:noHBand="0" w:noVBand="1" w:val="04A0"/>
         <w:tblBorders>
-          <w:top w:val="single" w:sz="4" w:space="0" w:color="CBD5E1"/>
-          <w:left w:val="single" w:sz="4" w:space="0" w:color="CBD5E1"/>
-          <w:bottom w:val="single" w:sz="4" w:space="0" w:color="CBD5E1"/>
-          <w:right w:val="single" w:sz="4" w:space="0" w:color="CBD5E1"/>
+          <w:top w:val="single" w:sz="6" w:space="0" w:color="CBD5E1"/>
+          <w:left w:val="single" w:sz="6" w:space="0" w:color="CBD5E1"/>
+          <w:bottom w:val="single" w:sz="6" w:space="0" w:color="CBD5E1"/>
+          <w:right w:val="single" w:sz="6" w:space="0" w:color="CBD5E1"/>
           <w:insideH w:val="single" w:sz="4" w:space="0" w:color="CBD5E1"/>
           <w:insideV w:val="single" w:sz="4" w:space="0" w:color="CBD5E1"/>
         </w:tblBorders>
@@ -3416,41 +3243,13 @@
     <w:p>
       <w:pPr>
         <w:keepNext/>
-        <w:spacing w:before="200" w:after="80"/>
-      </w:pPr>
-      <w:r>
-        <w:rPr>
-          <w:rFonts w:ascii="Calibri" w:hAnsi="Calibri"/>
-          <w:b/>
-          <w:color w:val="1E40AF"/>
-          <w:sz w:val="24"/>
-        </w:rPr>
-        <w:t>3.3 Diagram Model Hak Akses</w:t>
-      </w:r>
-    </w:p>
-    <w:p>
-      <w:pPr>
-        <w:spacing w:after="80" w:line="276" w:lineRule="auto"/>
-      </w:pPr>
-      <w:r>
-        <w:rPr>
-          <w:rFonts w:ascii="Calibri" w:hAnsi="Calibri"/>
-          <w:color w:val="1E293B"/>
-          <w:sz w:val="20"/>
-        </w:rPr>
-        <w:t>Pemisahan wewenang dan batasan interaksi antar role pada SIGMA-K divisualisasikan pada Gambar 2.</w:t>
-      </w:r>
-    </w:p>
-    <w:p>
-      <w:pPr>
-        <w:keepNext/>
-        <w:spacing w:before="160" w:after="40"/>
+        <w:spacing w:before="160" w:after="60"/>
         <w:jc w:val="center"/>
       </w:pPr>
       <w:r>
         <w:drawing>
           <wp:inline xmlns:a="http://schemas.openxmlformats.org/drawingml/2006/main" xmlns:pic="http://schemas.openxmlformats.org/drawingml/2006/picture">
-            <wp:extent cx="5486400" cy="3230843"/>
+            <wp:extent cx="5760720" cy="3780472"/>
             <wp:docPr id="2" name="Picture 2"/>
             <wp:cNvGraphicFramePr>
               <a:graphicFrameLocks noChangeAspect="1"/>
@@ -3471,7 +3270,7 @@
                   <pic:spPr>
                     <a:xfrm>
                       <a:off x="0" y="0"/>
-                      <a:ext cx="5486400" cy="3230843"/>
+                      <a:ext cx="5760720" cy="3780472"/>
                     </a:xfrm>
                     <a:prstGeom prst="rect"/>
                   </pic:spPr>
@@ -3537,7 +3336,7 @@
           <w:color w:val="1E293B"/>
           <w:sz w:val="20"/>
         </w:rPr>
-        <w:t>Desain antarmuka SIGMA-K dibangun dengan mengedepankan prinsip kejelasan institusional, efisiensi navigasi, dan kenyamanan visual bagi aparatur sipil negara. Karakteristik visual yang diterapkan meliputi:</w:t>
+        <w:t>Desain antarmuka SIGMA-K dibangun dengan mengedepankan prinsip kejelasan institusional, efisiensi navigasi, dan kenyamanan visual bagi aparatur sipil negara.</w:t>
       </w:r>
     </w:p>
     <w:p>
@@ -3559,7 +3358,7 @@
           <w:color w:val="1E293B"/>
           <w:sz w:val="20"/>
         </w:rPr>
-        <w:t>Menggunakan palet warna korporat Kementerian: Deep Navy (#0B2A4A) sebagai warna dominan identitas negara, Blue (#1E40AF) untuk elemen interaktif primer, Gold (#D4AF37) untuk status eksekutif dan aksen penghargaan, serta Slate (#F8FAFC) sebagai latar kerja bersih.</w:t>
+        <w:t>Deep Navy (#0B2A4A) sebagai warna dominan identitas negara, Blue (#1E40AF) untuk elemen interaktif primer, Gold (#D4AF37) untuk status eksekutif dan aksen penghargaan, serta Slate (#F8FAFC) sebagai latar kerja bersih.</w:t>
       </w:r>
     </w:p>
     <w:p>
@@ -3595,56 +3394,6 @@
           <w:color w:val="0B2A4A"/>
           <w:sz w:val="20"/>
         </w:rPr>
-        <w:t xml:space="preserve">• Umpan Balik Visual Responsif: </w:t>
-      </w:r>
-      <w:r>
-        <w:rPr>
-          <w:rFonts w:ascii="Calibri" w:hAnsi="Calibri"/>
-          <w:color w:val="1E293B"/>
-          <w:sz w:val="20"/>
-        </w:rPr>
-        <w:t>Seluruh komponen interaktif (tombol, baris tabel, tab navigasi) dilengkapi dengan micro-interaction yang responsif.</w:t>
-      </w:r>
-    </w:p>
-    <w:p>
-      <w:pPr>
-        <w:keepNext/>
-        <w:spacing w:before="200" w:after="80"/>
-      </w:pPr>
-      <w:r>
-        <w:rPr>
-          <w:rFonts w:ascii="Calibri" w:hAnsi="Calibri"/>
-          <w:b/>
-          <w:color w:val="1E40AF"/>
-          <w:sz w:val="24"/>
-        </w:rPr>
-        <w:t>4.2 Penanganan State Aplikasi</w:t>
-      </w:r>
-    </w:p>
-    <w:p>
-      <w:pPr>
-        <w:spacing w:after="80" w:line="276" w:lineRule="auto"/>
-      </w:pPr>
-      <w:r>
-        <w:rPr>
-          <w:rFonts w:ascii="Calibri" w:hAnsi="Calibri"/>
-          <w:color w:val="1E293B"/>
-          <w:sz w:val="20"/>
-        </w:rPr>
-        <w:t>Untuk menjamin pengalaman pengguna yang andal, aplikasi menangani berbagai kondisi state secara eksplisit:</w:t>
-      </w:r>
-    </w:p>
-    <w:p>
-      <w:pPr>
-        <w:pStyle w:val="ListBullet"/>
-        <w:spacing w:after="40" w:line="276" w:lineRule="auto"/>
-      </w:pPr>
-      <w:r>
-        <w:rPr>
-          <w:b/>
-          <w:color w:val="0B2A4A"/>
-          <w:sz w:val="20"/>
-        </w:rPr>
         <w:t xml:space="preserve">• Loading State: </w:t>
       </w:r>
       <w:r>
@@ -3653,29 +3402,7 @@
           <w:color w:val="1E293B"/>
           <w:sz w:val="20"/>
         </w:rPr>
-        <w:t>Setiap proses pengambilan data asynchronous menampilkan komponen Spinner atau Skeleton loader sehingga pengguna mengetahui proses sedang berjalan.</w:t>
-      </w:r>
-    </w:p>
-    <w:p>
-      <w:pPr>
-        <w:pStyle w:val="ListBullet"/>
-        <w:spacing w:after="40" w:line="276" w:lineRule="auto"/>
-      </w:pPr>
-      <w:r>
-        <w:rPr>
-          <w:b/>
-          <w:color w:val="0B2A4A"/>
-          <w:sz w:val="20"/>
-        </w:rPr>
-        <w:t xml:space="preserve">• Empty State: </w:t>
-      </w:r>
-      <w:r>
-        <w:rPr>
-          <w:rFonts w:ascii="Calibri" w:hAnsi="Calibri"/>
-          <w:color w:val="1E293B"/>
-          <w:sz w:val="20"/>
-        </w:rPr>
-        <w:t>Ketika dataset kosong (misalnya tidak ada usulan dalam antrean), layar menampilkan kartu ilustrasi informatif beserta tombol aksi kontekstual.</w:t>
+        <w:t>Setiap proses asynchronous menampilkan komponen Spinner atau Skeleton loader sehingga pengguna mengetahui proses sedang berjalan.</w:t>
       </w:r>
     </w:p>
     <w:p>
@@ -3697,117 +3424,7 @@
           <w:color w:val="1E293B"/>
           <w:sz w:val="20"/>
         </w:rPr>
-        <w:t>Sistem menyediakan komponen Error Banner terdedikasi untuk menampilkan pesan kesalahan teknis secara transparan:</w:t>
-      </w:r>
-    </w:p>
-    <w:p>
-      <w:pPr>
-        <w:pStyle w:val="ListBullet"/>
-        <w:spacing w:after="40" w:line="276" w:lineRule="auto"/>
-      </w:pPr>
-      <w:r>
-        <w:rPr>
-          <w:b/>
-          <w:color w:val="0B2A4A"/>
-          <w:sz w:val="20"/>
-        </w:rPr>
-        <w:t xml:space="preserve">  - 401 Unauthorized: </w:t>
-      </w:r>
-      <w:r>
-        <w:rPr>
-          <w:rFonts w:ascii="Calibri" w:hAnsi="Calibri"/>
-          <w:color w:val="1E293B"/>
-          <w:sz w:val="20"/>
-        </w:rPr>
-        <w:t>Mengarahkan pengguna kembali ke form login dengan pesan sesi berakhir.</w:t>
-      </w:r>
-    </w:p>
-    <w:p>
-      <w:pPr>
-        <w:pStyle w:val="ListBullet"/>
-        <w:spacing w:after="40" w:line="276" w:lineRule="auto"/>
-      </w:pPr>
-      <w:r>
-        <w:rPr>
-          <w:b/>
-          <w:color w:val="0B2A4A"/>
-          <w:sz w:val="20"/>
-        </w:rPr>
-        <w:t xml:space="preserve">  - 403 Forbidden: </w:t>
-      </w:r>
-      <w:r>
-        <w:rPr>
-          <w:rFonts w:ascii="Calibri" w:hAnsi="Calibri"/>
-          <w:color w:val="1E293B"/>
-          <w:sz w:val="20"/>
-        </w:rPr>
-        <w:t>Menampilkan pesan penolakan akses Zero-Trust jika pengguna mencoba mengakses instansi di luar wewenangnya.</w:t>
-      </w:r>
-    </w:p>
-    <w:p>
-      <w:pPr>
-        <w:pStyle w:val="ListBullet"/>
-        <w:spacing w:after="40" w:line="276" w:lineRule="auto"/>
-      </w:pPr>
-      <w:r>
-        <w:rPr>
-          <w:b/>
-          <w:color w:val="0B2A4A"/>
-          <w:sz w:val="20"/>
-        </w:rPr>
-        <w:t xml:space="preserve">  - 404 Not Found: </w:t>
-      </w:r>
-      <w:r>
-        <w:rPr>
-          <w:rFonts w:ascii="Calibri" w:hAnsi="Calibri"/>
-          <w:color w:val="1E293B"/>
-          <w:sz w:val="20"/>
-        </w:rPr>
-        <w:t>Menampilkan pesan berkas atau entitas instansi tidak ditemukan.</w:t>
-      </w:r>
-    </w:p>
-    <w:p>
-      <w:pPr>
-        <w:pStyle w:val="ListBullet"/>
-        <w:spacing w:after="40" w:line="276" w:lineRule="auto"/>
-      </w:pPr>
-      <w:r>
-        <w:rPr>
-          <w:b/>
-          <w:color w:val="0B2A4A"/>
-          <w:sz w:val="20"/>
-        </w:rPr>
-        <w:t xml:space="preserve">  - 409 Conflict: </w:t>
-      </w:r>
-      <w:r>
-        <w:rPr>
-          <w:rFonts w:ascii="Calibri" w:hAnsi="Calibri"/>
-          <w:color w:val="1E293B"/>
-          <w:sz w:val="20"/>
-        </w:rPr>
-        <w:t>Menampilkan peringatan konflik versi saat usulan telah diperbarui oleh pengguna lain.</w:t>
-      </w:r>
-    </w:p>
-    <w:p>
-      <w:pPr>
-        <w:pStyle w:val="ListBullet"/>
-        <w:spacing w:after="40" w:line="276" w:lineRule="auto"/>
-      </w:pPr>
-      <w:r>
-        <w:rPr>
-          <w:b/>
-          <w:color w:val="0B2A4A"/>
-          <w:sz w:val="20"/>
-        </w:rPr>
-        <w:t xml:space="preserve">  - 422 Validation Error: </w:t>
-      </w:r>
-      <w:r>
-        <w:rPr>
-          <w:rFonts w:ascii="Calibri" w:hAnsi="Calibri"/>
-          <w:color w:val="1E293B"/>
-          <w:sz w:val="20"/>
-        </w:rPr>
-        <w:t>Menyorot field form yang tidak valid beserta rincian kesalahan aturan validasi.</w:t>
+        <w:t>Pesan kesalahan (401 Unauthorized, 403 Forbidden, 404 Not Found, 409 Conflict, 422 Validation Error) ditampilkan dengan komponen Error Banner transparan.</w:t>
       </w:r>
     </w:p>
     <w:p>
@@ -3842,21 +3459,8 @@
     </w:p>
     <w:p>
       <w:pPr>
-        <w:spacing w:after="80" w:line="276" w:lineRule="auto"/>
-      </w:pPr>
-      <w:r>
-        <w:rPr>
-          <w:rFonts w:ascii="Calibri" w:hAnsi="Calibri"/>
-          <w:color w:val="1E293B"/>
-          <w:sz w:val="20"/>
-        </w:rPr>
-        <w:t>Navigasi aplikasi SIGMA-K disusun berdasarkan 16 rute aktual yang telah terkompilasi dalam framework Next.js App Router:</w:t>
-      </w:r>
-    </w:p>
-    <w:p>
-      <w:pPr>
         <w:keepNext/>
-        <w:spacing w:before="120" w:after="40"/>
+        <w:spacing w:before="160" w:after="60"/>
       </w:pPr>
       <w:r>
         <w:rPr>
@@ -3873,10 +3477,10 @@
         <w:jc w:val="center"/>
         <w:tblLook w:firstColumn="1" w:firstRow="1" w:lastColumn="0" w:lastRow="0" w:noHBand="0" w:noVBand="1" w:val="04A0"/>
         <w:tblBorders>
-          <w:top w:val="single" w:sz="4" w:space="0" w:color="CBD5E1"/>
-          <w:left w:val="single" w:sz="4" w:space="0" w:color="CBD5E1"/>
-          <w:bottom w:val="single" w:sz="4" w:space="0" w:color="CBD5E1"/>
-          <w:right w:val="single" w:sz="4" w:space="0" w:color="CBD5E1"/>
+          <w:top w:val="single" w:sz="6" w:space="0" w:color="CBD5E1"/>
+          <w:left w:val="single" w:sz="6" w:space="0" w:color="CBD5E1"/>
+          <w:bottom w:val="single" w:sz="6" w:space="0" w:color="CBD5E1"/>
+          <w:right w:val="single" w:sz="6" w:space="0" w:color="CBD5E1"/>
           <w:insideH w:val="single" w:sz="4" w:space="0" w:color="CBD5E1"/>
           <w:insideV w:val="single" w:sz="4" w:space="0" w:color="CBD5E1"/>
         </w:tblBorders>
@@ -5976,41 +5580,13 @@
     <w:p>
       <w:pPr>
         <w:keepNext/>
-        <w:spacing w:before="200" w:after="80"/>
-      </w:pPr>
-      <w:r>
-        <w:rPr>
-          <w:rFonts w:ascii="Calibri" w:hAnsi="Calibri"/>
-          <w:b/>
-          <w:color w:val="1E40AF"/>
-          <w:sz w:val="24"/>
-        </w:rPr>
-        <w:t>5.2 Visual Sitemap</w:t>
-      </w:r>
-    </w:p>
-    <w:p>
-      <w:pPr>
-        <w:spacing w:after="80" w:line="276" w:lineRule="auto"/>
-      </w:pPr>
-      <w:r>
-        <w:rPr>
-          <w:rFonts w:ascii="Calibri" w:hAnsi="Calibri"/>
-          <w:color w:val="1E293B"/>
-          <w:sz w:val="20"/>
-        </w:rPr>
-        <w:t>Pohon struktur navigasi aplikasi disajikan pada Gambar 3.</w:t>
-      </w:r>
-    </w:p>
-    <w:p>
-      <w:pPr>
-        <w:keepNext/>
-        <w:spacing w:before="160" w:after="40"/>
+        <w:spacing w:before="160" w:after="60"/>
         <w:jc w:val="center"/>
       </w:pPr>
       <w:r>
         <w:drawing>
           <wp:inline xmlns:a="http://schemas.openxmlformats.org/drawingml/2006/main" xmlns:pic="http://schemas.openxmlformats.org/drawingml/2006/picture">
-            <wp:extent cx="5486400" cy="3515069"/>
+            <wp:extent cx="5760720" cy="3780472"/>
             <wp:docPr id="3" name="Picture 3"/>
             <wp:cNvGraphicFramePr>
               <a:graphicFrameLocks noChangeAspect="1"/>
@@ -6031,7 +5607,7 @@
                   <pic:spPr>
                     <a:xfrm>
                       <a:off x="0" y="0"/>
-                      <a:ext cx="5486400" cy="3515069"/>
+                      <a:ext cx="5760720" cy="3780472"/>
                     </a:xfrm>
                     <a:prstGeom prst="rect"/>
                   </pic:spPr>
@@ -6084,167 +5660,7 @@
           <w:color w:val="1E40AF"/>
           <w:sz w:val="24"/>
         </w:rPr>
-        <w:t>6.1 Entitas Master Data</w:t>
-      </w:r>
-    </w:p>
-    <w:p>
-      <w:pPr>
-        <w:spacing w:after="80" w:line="276" w:lineRule="auto"/>
-      </w:pPr>
-      <w:r>
-        <w:rPr>
-          <w:rFonts w:ascii="Calibri" w:hAnsi="Calibri"/>
-          <w:color w:val="1E293B"/>
-          <w:sz w:val="20"/>
-        </w:rPr>
-        <w:t>SIGMA-K mengelola enam entitas master data kelembagaan yang saling berelasi:</w:t>
-      </w:r>
-    </w:p>
-    <w:p>
-      <w:pPr>
-        <w:pStyle w:val="ListBullet"/>
-        <w:spacing w:after="40" w:line="276" w:lineRule="auto"/>
-      </w:pPr>
-      <w:r>
-        <w:rPr>
-          <w:b/>
-          <w:color w:val="0B2A4A"/>
-          <w:sz w:val="20"/>
-        </w:rPr>
-        <w:t xml:space="preserve">1. Institutions (Instansi): </w:t>
-      </w:r>
-      <w:r>
-        <w:rPr>
-          <w:rFonts w:ascii="Calibri" w:hAnsi="Calibri"/>
-          <w:color w:val="1E293B"/>
-          <w:sz w:val="20"/>
-        </w:rPr>
-        <w:t>Mencatat seluruh entitas kementerian, lembaga pemerintah non-kementerian, lembaga non-struktural, dan pemerintah daerah beserta kode unik dan kategori.</w:t>
-      </w:r>
-    </w:p>
-    <w:p>
-      <w:pPr>
-        <w:pStyle w:val="ListBullet"/>
-        <w:spacing w:after="40" w:line="276" w:lineRule="auto"/>
-      </w:pPr>
-      <w:r>
-        <w:rPr>
-          <w:b/>
-          <w:color w:val="0B2A4A"/>
-          <w:sz w:val="20"/>
-        </w:rPr>
-        <w:t xml:space="preserve">2. Institution Types: </w:t>
-      </w:r>
-      <w:r>
-        <w:rPr>
-          <w:rFonts w:ascii="Calibri" w:hAnsi="Calibri"/>
-          <w:color w:val="1E293B"/>
-          <w:sz w:val="20"/>
-        </w:rPr>
-        <w:t>Klasifikasi baku bentuk instansi (KEMENKO, KEMENTERIAN, LPNK, PEMDA_PROV, PEMDA_KABKOT).</w:t>
-      </w:r>
-    </w:p>
-    <w:p>
-      <w:pPr>
-        <w:pStyle w:val="ListBullet"/>
-        <w:spacing w:after="40" w:line="276" w:lineRule="auto"/>
-      </w:pPr>
-      <w:r>
-        <w:rPr>
-          <w:b/>
-          <w:color w:val="0B2A4A"/>
-          <w:sz w:val="20"/>
-        </w:rPr>
-        <w:t xml:space="preserve">3. Cabinets &amp; Portofolio: </w:t>
-      </w:r>
-      <w:r>
-        <w:rPr>
-          <w:rFonts w:ascii="Calibri" w:hAnsi="Calibri"/>
-          <w:color w:val="1E293B"/>
-          <w:sz w:val="20"/>
-        </w:rPr>
-        <w:t>Mengelompokkan kementerian ke dalam portofolio kabinet pemerintahan yang sedang menjabat (mis. Kabinet Merah Putih).</w:t>
-      </w:r>
-    </w:p>
-    <w:p>
-      <w:pPr>
-        <w:pStyle w:val="ListBullet"/>
-        <w:spacing w:after="40" w:line="276" w:lineRule="auto"/>
-      </w:pPr>
-      <w:r>
-        <w:rPr>
-          <w:b/>
-          <w:color w:val="0B2A4A"/>
-          <w:sz w:val="20"/>
-        </w:rPr>
-        <w:t xml:space="preserve">4. Organizational Units: </w:t>
-      </w:r>
-      <w:r>
-        <w:rPr>
-          <w:rFonts w:ascii="Calibri" w:hAnsi="Calibri"/>
-          <w:color w:val="1E293B"/>
-          <w:sz w:val="20"/>
-        </w:rPr>
-        <w:t>Unit kerja struktural di dalam instansi yang disusun secara hierarkis menggunakan relasi Adjacency List (parent_id).</w:t>
-      </w:r>
-    </w:p>
-    <w:p>
-      <w:pPr>
-        <w:pStyle w:val="ListBullet"/>
-        <w:spacing w:after="40" w:line="276" w:lineRule="auto"/>
-      </w:pPr>
-      <w:r>
-        <w:rPr>
-          <w:b/>
-          <w:color w:val="0B2A4A"/>
-          <w:sz w:val="20"/>
-        </w:rPr>
-        <w:t xml:space="preserve">5. Positions (Jabatan &amp; Formasi): </w:t>
-      </w:r>
-      <w:r>
-        <w:rPr>
-          <w:rFonts w:ascii="Calibri" w:hAnsi="Calibri"/>
-          <w:color w:val="1E293B"/>
-          <w:sz w:val="20"/>
-        </w:rPr>
-        <w:t>Daftar jabatan struktural yang melekat pada unit kerja, lengkap dengan jenjang eselon (I.a, I.b, II.a, dst.) dan kuota formasi ASN.</w:t>
-      </w:r>
-    </w:p>
-    <w:p>
-      <w:pPr>
-        <w:pStyle w:val="ListBullet"/>
-        <w:spacing w:after="40" w:line="276" w:lineRule="auto"/>
-      </w:pPr>
-      <w:r>
-        <w:rPr>
-          <w:b/>
-          <w:color w:val="0B2A4A"/>
-          <w:sz w:val="20"/>
-        </w:rPr>
-        <w:t xml:space="preserve">6. Tupoksi: </w:t>
-      </w:r>
-      <w:r>
-        <w:rPr>
-          <w:rFonts w:ascii="Calibri" w:hAnsi="Calibri"/>
-          <w:color w:val="1E293B"/>
-          <w:sz w:val="20"/>
-        </w:rPr>
-        <w:t>Tugas pokok dan fungsi operasional yang menjadi landasan hukum unit kerja.</w:t>
-      </w:r>
-    </w:p>
-    <w:p>
-      <w:pPr>
-        <w:keepNext/>
-        <w:spacing w:before="200" w:after="80"/>
-      </w:pPr>
-      <w:r>
-        <w:rPr>
-          <w:rFonts w:ascii="Calibri" w:hAnsi="Calibri"/>
-          <w:b/>
-          <w:color w:val="1E40AF"/>
-          <w:sz w:val="24"/>
-        </w:rPr>
-        <w:t>6.2 Alur Data &amp; Representasi Hierarki</w:t>
+        <w:t>6.1 Alur Data &amp; Representasi Hierarki</w:t>
       </w:r>
     </w:p>
     <w:p>
@@ -6263,13 +5679,13 @@
     <w:p>
       <w:pPr>
         <w:keepNext/>
-        <w:spacing w:before="160" w:after="40"/>
+        <w:spacing w:before="160" w:after="60"/>
         <w:jc w:val="center"/>
       </w:pPr>
       <w:r>
         <w:drawing>
           <wp:inline xmlns:a="http://schemas.openxmlformats.org/drawingml/2006/main" xmlns:pic="http://schemas.openxmlformats.org/drawingml/2006/picture">
-            <wp:extent cx="5486400" cy="3060651"/>
+            <wp:extent cx="5760720" cy="3780472"/>
             <wp:docPr id="4" name="Picture 4"/>
             <wp:cNvGraphicFramePr>
               <a:graphicFrameLocks noChangeAspect="1"/>
@@ -6290,7 +5706,7 @@
                   <pic:spPr>
                     <a:xfrm>
                       <a:off x="0" y="0"/>
-                      <a:ext cx="5486400" cy="3060651"/>
+                      <a:ext cx="5760720" cy="3780472"/>
                     </a:xfrm>
                     <a:prstGeom prst="rect"/>
                   </pic:spPr>
@@ -6319,13 +5735,13 @@
     <w:p>
       <w:pPr>
         <w:keepNext/>
-        <w:spacing w:before="160" w:after="40"/>
+        <w:spacing w:before="160" w:after="60"/>
         <w:jc w:val="center"/>
       </w:pPr>
       <w:r>
         <w:drawing>
           <wp:inline xmlns:a="http://schemas.openxmlformats.org/drawingml/2006/main" xmlns:pic="http://schemas.openxmlformats.org/drawingml/2006/picture">
-            <wp:extent cx="5486400" cy="3592039"/>
+            <wp:extent cx="5760720" cy="3780472"/>
             <wp:docPr id="5" name="Picture 5"/>
             <wp:cNvGraphicFramePr>
               <a:graphicFrameLocks noChangeAspect="1"/>
@@ -6346,7 +5762,7 @@
                   <pic:spPr>
                     <a:xfrm>
                       <a:off x="0" y="0"/>
-                      <a:ext cx="5486400" cy="3592039"/>
+                      <a:ext cx="5760720" cy="3780472"/>
                     </a:xfrm>
                     <a:prstGeom prst="rect"/>
                   </pic:spPr>
@@ -6369,7 +5785,7 @@
           <w:color w:val="475569"/>
           <w:sz w:val="18"/>
         </w:rPr>
-        <w:t>Gambar 5: Bagan Struktur Hierarki Pohon Organisasi Berjenjang (Eselon I - IV)</w:t>
+        <w:t>Gambar 5: Bagan Struktur Pohon Organisasi Berjenjang (Eselon I - IV)</w:t>
       </w:r>
     </w:p>
     <w:p>
@@ -6404,21 +5820,8 @@
     </w:p>
     <w:p>
       <w:pPr>
-        <w:spacing w:after="80" w:line="276" w:lineRule="auto"/>
-      </w:pPr>
-      <w:r>
-        <w:rPr>
-          <w:rFonts w:ascii="Calibri" w:hAnsi="Calibri"/>
-          <w:color w:val="1E293B"/>
-          <w:sz w:val="20"/>
-        </w:rPr>
-        <w:t>Basis data operasional `eskld_db` tersusun atas 21 tabel relasional berintegritas tinggi dengan foreign key constraints dan indeks performa:</w:t>
-      </w:r>
-    </w:p>
-    <w:p>
-      <w:pPr>
         <w:keepNext/>
-        <w:spacing w:before="120" w:after="40"/>
+        <w:spacing w:before="160" w:after="60"/>
       </w:pPr>
       <w:r>
         <w:rPr>
@@ -6435,10 +5838,10 @@
         <w:jc w:val="center"/>
         <w:tblLook w:firstColumn="1" w:firstRow="1" w:lastColumn="0" w:lastRow="0" w:noHBand="0" w:noVBand="1" w:val="04A0"/>
         <w:tblBorders>
-          <w:top w:val="single" w:sz="4" w:space="0" w:color="CBD5E1"/>
-          <w:left w:val="single" w:sz="4" w:space="0" w:color="CBD5E1"/>
-          <w:bottom w:val="single" w:sz="4" w:space="0" w:color="CBD5E1"/>
-          <w:right w:val="single" w:sz="4" w:space="0" w:color="CBD5E1"/>
+          <w:top w:val="single" w:sz="6" w:space="0" w:color="CBD5E1"/>
+          <w:left w:val="single" w:sz="6" w:space="0" w:color="CBD5E1"/>
+          <w:bottom w:val="single" w:sz="6" w:space="0" w:color="CBD5E1"/>
+          <w:right w:val="single" w:sz="6" w:space="0" w:color="CBD5E1"/>
           <w:insideH w:val="single" w:sz="4" w:space="0" w:color="CBD5E1"/>
           <w:insideV w:val="single" w:sz="4" w:space="0" w:color="CBD5E1"/>
         </w:tblBorders>
@@ -9678,41 +9081,13 @@
     <w:p>
       <w:pPr>
         <w:keepNext/>
-        <w:spacing w:before="200" w:after="80"/>
-      </w:pPr>
-      <w:r>
-        <w:rPr>
-          <w:rFonts w:ascii="Calibri" w:hAnsi="Calibri"/>
-          <w:b/>
-          <w:color w:val="1E40AF"/>
-          <w:sz w:val="24"/>
-        </w:rPr>
-        <w:t>7.2 Entity Relationship Diagram (ERD)</w:t>
-      </w:r>
-    </w:p>
-    <w:p>
-      <w:pPr>
-        <w:spacing w:after="80" w:line="276" w:lineRule="auto"/>
-      </w:pPr>
-      <w:r>
-        <w:rPr>
-          <w:rFonts w:ascii="Calibri" w:hAnsi="Calibri"/>
-          <w:color w:val="1E293B"/>
-          <w:sz w:val="20"/>
-        </w:rPr>
-        <w:t>Diagram relasi entitas basis data `eskld_db` disajikan pada Gambar 6.</w:t>
-      </w:r>
-    </w:p>
-    <w:p>
-      <w:pPr>
-        <w:keepNext/>
-        <w:spacing w:before="160" w:after="40"/>
+        <w:spacing w:before="160" w:after="60"/>
         <w:jc w:val="center"/>
       </w:pPr>
       <w:r>
         <w:drawing>
           <wp:inline xmlns:a="http://schemas.openxmlformats.org/drawingml/2006/main" xmlns:pic="http://schemas.openxmlformats.org/drawingml/2006/picture">
-            <wp:extent cx="5486400" cy="3757162"/>
+            <wp:extent cx="5760720" cy="3780472"/>
             <wp:docPr id="6" name="Picture 6"/>
             <wp:cNvGraphicFramePr>
               <a:graphicFrameLocks noChangeAspect="1"/>
@@ -9733,7 +9108,7 @@
                   <pic:spPr>
                     <a:xfrm>
                       <a:off x="0" y="0"/>
-                      <a:ext cx="5486400" cy="3757162"/>
+                      <a:ext cx="5760720" cy="3780472"/>
                     </a:xfrm>
                     <a:prstGeom prst="rect"/>
                   </pic:spPr>
@@ -9776,21 +9151,6 @@
     </w:p>
     <w:p>
       <w:pPr>
-        <w:keepNext/>
-        <w:spacing w:before="200" w:after="80"/>
-      </w:pPr>
-      <w:r>
-        <w:rPr>
-          <w:rFonts w:ascii="Calibri" w:hAnsi="Calibri"/>
-          <w:b/>
-          <w:color w:val="1E40AF"/>
-          <w:sz w:val="24"/>
-        </w:rPr>
-        <w:t>8.1 Tahapan Siklus Pengusulan Kelembagaan</w:t>
-      </w:r>
-    </w:p>
-    <w:p>
-      <w:pPr>
         <w:spacing w:after="80" w:line="276" w:lineRule="auto"/>
       </w:pPr>
       <w:r>
@@ -9799,201 +9159,19 @@
           <w:color w:val="1E293B"/>
           <w:sz w:val="20"/>
         </w:rPr>
-        <w:t>Siklus hidup usulan penataan organisasi diatur melalui mesin status (Finite State Machine) yang menjamin setiap tahapan berjalan secara berurutan dan akuntabel:</w:t>
-      </w:r>
-    </w:p>
-    <w:p>
-      <w:pPr>
-        <w:pStyle w:val="ListBullet"/>
-        <w:spacing w:after="40" w:line="276" w:lineRule="auto"/>
-      </w:pPr>
-      <w:r>
-        <w:rPr>
-          <w:b/>
-          <w:color w:val="0B2A4A"/>
-          <w:sz w:val="20"/>
-        </w:rPr>
-        <w:t xml:space="preserve">1. Tahap DRAFT: </w:t>
-      </w:r>
-      <w:r>
-        <w:rPr>
-          <w:rFonts w:ascii="Calibri" w:hAnsi="Calibri"/>
-          <w:color w:val="1E293B"/>
-          <w:sz w:val="20"/>
-        </w:rPr>
-        <w:t>Operator instansi (USER) menyusun rincian usulan unit baru, perubahan eselon, atau kuota formasi. Data disimpan sebagai draf kerja awal (v1).</w:t>
-      </w:r>
-    </w:p>
-    <w:p>
-      <w:pPr>
-        <w:pStyle w:val="ListBullet"/>
-        <w:spacing w:after="40" w:line="276" w:lineRule="auto"/>
-      </w:pPr>
-      <w:r>
-        <w:rPr>
-          <w:b/>
-          <w:color w:val="0B2A4A"/>
-          <w:sz w:val="20"/>
-        </w:rPr>
-        <w:t xml:space="preserve">2. Tahap SUBMITTED_TO_ADMIN: </w:t>
-      </w:r>
-      <w:r>
-        <w:rPr>
-          <w:rFonts w:ascii="Calibri" w:hAnsi="Calibri"/>
-          <w:color w:val="1E293B"/>
-          <w:sz w:val="20"/>
-        </w:rPr>
-        <w:t>Operator melakukan finalisasi dan mengirimkan berkas usulan ke KemenPANRB. Berkas masuk ke antrean penapisan.</w:t>
-      </w:r>
-    </w:p>
-    <w:p>
-      <w:pPr>
-        <w:pStyle w:val="ListBullet"/>
-        <w:spacing w:after="40" w:line="276" w:lineRule="auto"/>
-      </w:pPr>
-      <w:r>
-        <w:rPr>
-          <w:b/>
-          <w:color w:val="0B2A4A"/>
-          <w:sz w:val="20"/>
-        </w:rPr>
-        <w:t xml:space="preserve">3. Tahap ASSIGNED_TO_VERIFIER: </w:t>
-      </w:r>
-      <w:r>
-        <w:rPr>
-          <w:rFonts w:ascii="Calibri" w:hAnsi="Calibri"/>
-          <w:color w:val="1E293B"/>
-          <w:sz w:val="20"/>
-        </w:rPr>
-        <w:t>Admin KemenPANRB memeriksa kelengkapan formal dan dasar hukum. Jika lengkap, usulan dialokasikan ke Verifikator.</w:t>
-      </w:r>
-    </w:p>
-    <w:p>
-      <w:pPr>
-        <w:pStyle w:val="ListBullet"/>
-        <w:spacing w:after="40" w:line="276" w:lineRule="auto"/>
-      </w:pPr>
-      <w:r>
-        <w:rPr>
-          <w:b/>
-          <w:color w:val="0B2A4A"/>
-          <w:sz w:val="20"/>
-        </w:rPr>
-        <w:t xml:space="preserve">4. Tahap IN_REVIEW_BY_VERIFIER: </w:t>
-      </w:r>
-      <w:r>
-        <w:rPr>
-          <w:rFonts w:ascii="Calibri" w:hAnsi="Calibri"/>
-          <w:color w:val="1E293B"/>
-          <w:sz w:val="20"/>
-        </w:rPr>
-        <w:t>Verifikator kelembagaan melakukan evaluasi mendalam terhadap analisis jabatan, beban kerja, dan kesesuaian regulasi.</w:t>
-      </w:r>
-    </w:p>
-    <w:p>
-      <w:pPr>
-        <w:pStyle w:val="ListBullet"/>
-        <w:spacing w:after="40" w:line="276" w:lineRule="auto"/>
-      </w:pPr>
-      <w:r>
-        <w:rPr>
-          <w:b/>
-          <w:color w:val="0B2A4A"/>
-          <w:sz w:val="20"/>
-        </w:rPr>
-        <w:t xml:space="preserve">5. Tahap READY_FOR_FINAL_DECISION: </w:t>
-      </w:r>
-      <w:r>
-        <w:rPr>
-          <w:rFonts w:ascii="Calibri" w:hAnsi="Calibri"/>
-          <w:color w:val="1E293B"/>
-          <w:sz w:val="20"/>
-        </w:rPr>
-        <w:t>Hasil telaah substantif dinyatakan tuntas dan berkas siap diajukan ke tahap pengesahan final.</w:t>
-      </w:r>
-    </w:p>
-    <w:p>
-      <w:pPr>
-        <w:pStyle w:val="ListBullet"/>
-        <w:spacing w:after="40" w:line="276" w:lineRule="auto"/>
-      </w:pPr>
-      <w:r>
-        <w:rPr>
-          <w:b/>
-          <w:color w:val="0B2A4A"/>
-          <w:sz w:val="20"/>
-        </w:rPr>
-        <w:t xml:space="preserve">6. Tahap APPROVED: </w:t>
-      </w:r>
-      <w:r>
-        <w:rPr>
-          <w:rFonts w:ascii="Calibri" w:hAnsi="Calibri"/>
-          <w:color w:val="1E293B"/>
-          <w:sz w:val="20"/>
-        </w:rPr>
-        <w:t>Verifikator menerbitkan Surat Keputusan (SK) persetujuan resmi beserta nomor penetapan dan catatan pengesahan.</w:t>
-      </w:r>
-    </w:p>
-    <w:p>
-      <w:pPr>
-        <w:pStyle w:val="ListBullet"/>
-        <w:spacing w:after="40" w:line="276" w:lineRule="auto"/>
-      </w:pPr>
-      <w:r>
-        <w:rPr>
-          <w:b/>
-          <w:color w:val="0B2A4A"/>
-          <w:sz w:val="20"/>
-        </w:rPr>
-        <w:t xml:space="preserve">7. Tahap PROMOTED: </w:t>
-      </w:r>
-      <w:r>
-        <w:rPr>
-          <w:rFonts w:ascii="Calibri" w:hAnsi="Calibri"/>
-          <w:color w:val="1E293B"/>
-          <w:sz w:val="20"/>
-        </w:rPr>
-        <w:t>Sistem secara otomatis memigrasikan seluruh struktur unit kerja dan jabatan dari usulan yang disetujui langsung ke master data aktif.</w:t>
+        <w:t>Siklus hidup usulan penataan organisasi diatur melalui mesin status (Finite State Machine) 7 tahapan:</w:t>
       </w:r>
     </w:p>
     <w:p>
       <w:pPr>
         <w:keepNext/>
-        <w:spacing w:before="200" w:after="80"/>
-      </w:pPr>
-      <w:r>
-        <w:rPr>
-          <w:rFonts w:ascii="Calibri" w:hAnsi="Calibri"/>
-          <w:b/>
-          <w:color w:val="1E40AF"/>
-          <w:sz w:val="24"/>
-        </w:rPr>
-        <w:t>8.2 Diagram Finite State Machine</w:t>
-      </w:r>
-    </w:p>
-    <w:p>
-      <w:pPr>
-        <w:spacing w:after="80" w:line="276" w:lineRule="auto"/>
-      </w:pPr>
-      <w:r>
-        <w:rPr>
-          <w:rFonts w:ascii="Calibri" w:hAnsi="Calibri"/>
-          <w:color w:val="1E293B"/>
-          <w:sz w:val="20"/>
-        </w:rPr>
-        <w:t>Diagram transisi status pengusulan disajikan pada Gambar 7.</w:t>
-      </w:r>
-    </w:p>
-    <w:p>
-      <w:pPr>
-        <w:keepNext/>
-        <w:spacing w:before="160" w:after="40"/>
+        <w:spacing w:before="160" w:after="60"/>
         <w:jc w:val="center"/>
       </w:pPr>
       <w:r>
         <w:drawing>
           <wp:inline xmlns:a="http://schemas.openxmlformats.org/drawingml/2006/main" xmlns:pic="http://schemas.openxmlformats.org/drawingml/2006/picture">
-            <wp:extent cx="5486400" cy="3030882"/>
+            <wp:extent cx="5760720" cy="3780472"/>
             <wp:docPr id="7" name="Picture 7"/>
             <wp:cNvGraphicFramePr>
               <a:graphicFrameLocks noChangeAspect="1"/>
@@ -10014,7 +9192,7 @@
                   <pic:spPr>
                     <a:xfrm>
                       <a:off x="0" y="0"/>
-                      <a:ext cx="5486400" cy="3030882"/>
+                      <a:ext cx="5760720" cy="3780472"/>
                     </a:xfrm>
                     <a:prstGeom prst="rect"/>
                   </pic:spPr>
@@ -10057,21 +9235,6 @@
     </w:p>
     <w:p>
       <w:pPr>
-        <w:keepNext/>
-        <w:spacing w:before="200" w:after="80"/>
-      </w:pPr>
-      <w:r>
-        <w:rPr>
-          <w:rFonts w:ascii="Calibri" w:hAnsi="Calibri"/>
-          <w:b/>
-          <w:color w:val="1E40AF"/>
-          <w:sz w:val="24"/>
-        </w:rPr>
-        <w:t>9.1 Mekanisme Snapshot Immutability</w:t>
-      </w:r>
-    </w:p>
-    <w:p>
-      <w:pPr>
         <w:spacing w:after="80" w:line="276" w:lineRule="auto"/>
       </w:pPr>
       <w:r>
@@ -10080,113 +9243,19 @@
           <w:color w:val="1E293B"/>
           <w:sz w:val="20"/>
         </w:rPr>
-        <w:t>Untuk mencegah manipulasi data historis, SIGMA-K mengadopsi mekanisme Snapshot Versioning. Ketika berkas usulan dikembalikan oleh Admin atau Verifikator dengan status `REVISION_REQUIRED`, data versi 1 (v1) langsung dikunci permanen pada tabel `submission_versions`. Operator instansi kemudian menyusun perbaikan pada versi baru (v2).</w:t>
+        <w:t>Mekanisme Snapshot Versioning mengunci data versi awal (v1) dan membandingkan perbaikan versi baru (v2) dengan master data melalui Diff Viewer.</w:t>
       </w:r>
     </w:p>
     <w:p>
       <w:pPr>
         <w:keepNext/>
-        <w:spacing w:before="200" w:after="80"/>
-      </w:pPr>
-      <w:r>
-        <w:rPr>
-          <w:rFonts w:ascii="Calibri" w:hAnsi="Calibri"/>
-          <w:b/>
-          <w:color w:val="1E40AF"/>
-          <w:sz w:val="24"/>
-        </w:rPr>
-        <w:t>9.2 Mesin Pelacak Perbedaan (Diff Engine)</w:t>
-      </w:r>
-    </w:p>
-    <w:p>
-      <w:pPr>
-        <w:spacing w:after="80" w:line="276" w:lineRule="auto"/>
-      </w:pPr>
-      <w:r>
-        <w:rPr>
-          <w:rFonts w:ascii="Calibri" w:hAnsi="Calibri"/>
-          <w:color w:val="1E293B"/>
-          <w:sz w:val="20"/>
-        </w:rPr>
-        <w:t>Sistem dilengkapi dengan Diff Viewer yang secara cerdas membandingkan usulan versi terbaru terhadap master data aktif:</w:t>
-      </w:r>
-    </w:p>
-    <w:p>
-      <w:pPr>
-        <w:pStyle w:val="ListBullet"/>
-        <w:spacing w:after="40" w:line="276" w:lineRule="auto"/>
-      </w:pPr>
-      <w:r>
-        <w:rPr>
-          <w:b/>
-          <w:color w:val="0B2A4A"/>
-          <w:sz w:val="20"/>
-        </w:rPr>
-        <w:t xml:space="preserve">• Penambahan Unit: </w:t>
-      </w:r>
-      <w:r>
-        <w:rPr>
-          <w:rFonts w:ascii="Calibri" w:hAnsi="Calibri"/>
-          <w:color w:val="1E293B"/>
-          <w:sz w:val="20"/>
-        </w:rPr>
-        <w:t>Unit kerja yang baru diusulkan diberi label `CREATE` dengan indikator warna hijau.</w:t>
-      </w:r>
-    </w:p>
-    <w:p>
-      <w:pPr>
-        <w:pStyle w:val="ListBullet"/>
-        <w:spacing w:after="40" w:line="276" w:lineRule="auto"/>
-      </w:pPr>
-      <w:r>
-        <w:rPr>
-          <w:b/>
-          <w:color w:val="0B2A4A"/>
-          <w:sz w:val="20"/>
-        </w:rPr>
-        <w:t xml:space="preserve">• Perubahan Struktur: </w:t>
-      </w:r>
-      <w:r>
-        <w:rPr>
-          <w:rFonts w:ascii="Calibri" w:hAnsi="Calibri"/>
-          <w:color w:val="1E293B"/>
-          <w:sz w:val="20"/>
-        </w:rPr>
-        <w:t>Perubahan nama unit, pergeseran induk, atau penambahan formasi diberi label `UPDATE` dengan indikator warna kuning/emas.</w:t>
-      </w:r>
-    </w:p>
-    <w:p>
-      <w:pPr>
-        <w:pStyle w:val="ListBullet"/>
-        <w:spacing w:after="40" w:line="276" w:lineRule="auto"/>
-      </w:pPr>
-      <w:r>
-        <w:rPr>
-          <w:b/>
-          <w:color w:val="0B2A4A"/>
-          <w:sz w:val="20"/>
-        </w:rPr>
-        <w:t xml:space="preserve">• Penghapusan Unit: </w:t>
-      </w:r>
-      <w:r>
-        <w:rPr>
-          <w:rFonts w:ascii="Calibri" w:hAnsi="Calibri"/>
-          <w:color w:val="1E293B"/>
-          <w:sz w:val="20"/>
-        </w:rPr>
-        <w:t>Unit yang diusulkan untuk dilebur atau dihapus diberi label `DELETE` dengan indikator warna merah.</w:t>
-      </w:r>
-    </w:p>
-    <w:p>
-      <w:pPr>
-        <w:keepNext/>
-        <w:spacing w:before="160" w:after="40"/>
+        <w:spacing w:before="160" w:after="60"/>
         <w:jc w:val="center"/>
       </w:pPr>
       <w:r>
         <w:drawing>
           <wp:inline xmlns:a="http://schemas.openxmlformats.org/drawingml/2006/main" xmlns:pic="http://schemas.openxmlformats.org/drawingml/2006/picture">
-            <wp:extent cx="5486400" cy="3060651"/>
+            <wp:extent cx="5760720" cy="3780472"/>
             <wp:docPr id="8" name="Picture 8"/>
             <wp:cNvGraphicFramePr>
               <a:graphicFrameLocks noChangeAspect="1"/>
@@ -10207,7 +9276,7 @@
                   <pic:spPr>
                     <a:xfrm>
                       <a:off x="0" y="0"/>
-                      <a:ext cx="5486400" cy="3060651"/>
+                      <a:ext cx="5760720" cy="3780472"/>
                     </a:xfrm>
                     <a:prstGeom prst="rect"/>
                   </pic:spPr>
@@ -10250,21 +9319,6 @@
     </w:p>
     <w:p>
       <w:pPr>
-        <w:keepNext/>
-        <w:spacing w:before="200" w:after="80"/>
-      </w:pPr>
-      <w:r>
-        <w:rPr>
-          <w:rFonts w:ascii="Calibri" w:hAnsi="Calibri"/>
-          <w:b/>
-          <w:color w:val="1E40AF"/>
-          <w:sz w:val="24"/>
-        </w:rPr>
-        <w:t>10.1 Prosedur Penapisan Administratif</w:t>
-      </w:r>
-    </w:p>
-    <w:p>
-      <w:pPr>
         <w:spacing w:after="80" w:line="276" w:lineRule="auto"/>
       </w:pPr>
       <w:r>
@@ -10273,141 +9327,19 @@
           <w:color w:val="1E293B"/>
           <w:sz w:val="20"/>
         </w:rPr>
-        <w:t>Gate 1 Admin Screening merupakan pintu gerbang pertama verifikasi di KemenPANRB. Admin bertugas:</w:t>
+        <w:t>Gate 1 Admin Screening memverifikasi kelengkapan formal surat permohonan dan naskah akademik sebelum menugaskan Verifikator.</w:t>
       </w:r>
     </w:p>
     <w:p>
       <w:pPr>
-        <w:pStyle w:val="ListBullet"/>
-        <w:spacing w:after="40" w:line="276" w:lineRule="auto"/>
-      </w:pPr>
-      <w:r>
-        <w:rPr>
-          <w:b/>
-          <w:color w:val="0B2A4A"/>
-          <w:sz w:val="20"/>
-        </w:rPr>
-        <w:t xml:space="preserve">1. Validasi Kelengkapan Berkas: </w:t>
-      </w:r>
-      <w:r>
-        <w:rPr>
-          <w:rFonts w:ascii="Calibri" w:hAnsi="Calibri"/>
-          <w:color w:val="1E293B"/>
-          <w:sz w:val="20"/>
-        </w:rPr>
-        <w:t>Memastikan surat permohonan resmi, naskah akademik, dan dasar hukum pembentukan instansi telah terlampir lengkap.</w:t>
-      </w:r>
-    </w:p>
-    <w:p>
-      <w:pPr>
-        <w:pStyle w:val="ListBullet"/>
-        <w:spacing w:after="40" w:line="276" w:lineRule="auto"/>
-      </w:pPr>
-      <w:r>
-        <w:rPr>
-          <w:b/>
-          <w:color w:val="0B2A4A"/>
-          <w:sz w:val="20"/>
-        </w:rPr>
-        <w:t xml:space="preserve">2. Pengembalian Revisi Formal: </w:t>
-      </w:r>
-      <w:r>
-        <w:rPr>
-          <w:rFonts w:ascii="Calibri" w:hAnsi="Calibri"/>
-          <w:color w:val="1E293B"/>
-          <w:sz w:val="20"/>
-        </w:rPr>
-        <w:t>Jika berkas tidak memenuhi syarat formal, Admin mengeksekusi `returnRevision()`, mengembalikan usulan ke status `REVISION_REQUIRED` disertai alasan tertulis.</w:t>
-      </w:r>
-    </w:p>
-    <w:p>
-      <w:pPr>
-        <w:pStyle w:val="ListBullet"/>
-        <w:spacing w:after="40" w:line="276" w:lineRule="auto"/>
-      </w:pPr>
-      <w:r>
-        <w:rPr>
-          <w:b/>
-          <w:color w:val="0B2A4A"/>
-          <w:sz w:val="20"/>
-        </w:rPr>
-        <w:t xml:space="preserve">3. Alokasi Penugasan: </w:t>
-      </w:r>
-      <w:r>
-        <w:rPr>
-          <w:rFonts w:ascii="Calibri" w:hAnsi="Calibri"/>
-          <w:color w:val="1E293B"/>
-          <w:sz w:val="20"/>
-        </w:rPr>
-        <w:t>Jika berkas valid, Admin memilih Verifikator yang berkompeten dan mengeksekusi `accept() &amp; assignVerifier()`.</w:t>
-      </w:r>
-    </w:p>
-    <w:tbl>
-      <w:tblPr>
-        <w:tblW w:type="auto" w:w="0"/>
-        <w:jc w:val="center"/>
-        <w:tblLook w:firstColumn="1" w:firstRow="1" w:lastColumn="0" w:lastRow="0" w:noHBand="0" w:noVBand="1" w:val="04A0"/>
-      </w:tblPr>
-      <w:tblGrid>
-        <w:gridCol w:w="9360"/>
-      </w:tblGrid>
-      <w:tr>
-        <w:tc>
-          <w:tcPr>
-            <w:tcW w:type="dxa" w:w="9360"/>
-            <w:shd w:fill="F8FAFC"/>
-            <w:tcMar>
-              <w:top w:w="100" w:type="dxa"/>
-              <w:bottom w:w="100" w:type="dxa"/>
-              <w:left w:w="150" w:type="dxa"/>
-              <w:right w:w="150" w:type="dxa"/>
-            </w:tcMar>
-            <w:tcBorders>
-              <w:top w:val="none"/>
-              <w:left w:val="single" w:sz="24" w:space="0" w:color="0B2A4A"/>
-              <w:bottom w:val="none"/>
-              <w:right w:val="none"/>
-            </w:tcBorders>
-          </w:tcPr>
-          <w:p>
-            <w:pPr>
-              <w:spacing w:after="40"/>
-            </w:pPr>
-            <w:r>
-              <w:rPr>
-                <w:b/>
-                <w:color w:val="0B2A4A"/>
-                <w:sz w:val="19"/>
-              </w:rPr>
-              <w:t>PENTING / PERHATIAN: Batasan Wewenang Gate 1</w:t>
-              <w:br/>
-            </w:r>
-            <w:r>
-              <w:rPr>
-                <w:color w:val="334155"/>
-                <w:sz w:val="18"/>
-              </w:rPr>
-              <w:t>Admin KemenPANRB secara tegas DILARANG melakukan persetujuan substantif maupun pengesahan akhir Surat Keputusan. Wewenang Admin dibatasi strictly pada verifikasi formalitas dan alokasi kerja Verifikator.</w:t>
-            </w:r>
-          </w:p>
-        </w:tc>
-      </w:tr>
-    </w:tbl>
-    <w:p>
-      <w:pPr>
-        <w:spacing w:after="40"/>
-      </w:pPr>
-    </w:p>
-    <w:p>
-      <w:pPr>
         <w:keepNext/>
-        <w:spacing w:before="160" w:after="40"/>
+        <w:spacing w:before="160" w:after="60"/>
         <w:jc w:val="center"/>
       </w:pPr>
       <w:r>
         <w:drawing>
           <wp:inline xmlns:a="http://schemas.openxmlformats.org/drawingml/2006/main" xmlns:pic="http://schemas.openxmlformats.org/drawingml/2006/picture">
-            <wp:extent cx="5486400" cy="3326346"/>
+            <wp:extent cx="5760720" cy="3780472"/>
             <wp:docPr id="9" name="Picture 9"/>
             <wp:cNvGraphicFramePr>
               <a:graphicFrameLocks noChangeAspect="1"/>
@@ -10428,7 +9360,7 @@
                   <pic:spPr>
                     <a:xfrm>
                       <a:off x="0" y="0"/>
-                      <a:ext cx="5486400" cy="3326346"/>
+                      <a:ext cx="5760720" cy="3780472"/>
                     </a:xfrm>
                     <a:prstGeom prst="rect"/>
                   </pic:spPr>
@@ -10471,21 +9403,6 @@
     </w:p>
     <w:p>
       <w:pPr>
-        <w:keepNext/>
-        <w:spacing w:before="200" w:after="80"/>
-      </w:pPr>
-      <w:r>
-        <w:rPr>
-          <w:rFonts w:ascii="Calibri" w:hAnsi="Calibri"/>
-          <w:b/>
-          <w:color w:val="1E40AF"/>
-          <w:sz w:val="24"/>
-        </w:rPr>
-        <w:t>11.1 Prosedur Telaah Substantif &amp; Pengesahan SK</w:t>
-      </w:r>
-    </w:p>
-    <w:p>
-      <w:pPr>
         <w:spacing w:after="80" w:line="276" w:lineRule="auto"/>
       </w:pPr>
       <w:r>
@@ -10494,107 +9411,19 @@
           <w:color w:val="1E293B"/>
           <w:sz w:val="20"/>
         </w:rPr>
-        <w:t>Gate 2 Verifier Workspace adalah pusat evaluasi teknis kelembagaan. Verifikator yang ditugaskan melakukan:</w:t>
-      </w:r>
-    </w:p>
-    <w:p>
-      <w:pPr>
-        <w:pStyle w:val="ListBullet"/>
-        <w:spacing w:after="40" w:line="276" w:lineRule="auto"/>
-      </w:pPr>
-      <w:r>
-        <w:rPr>
-          <w:b/>
-          <w:color w:val="0B2A4A"/>
-          <w:sz w:val="20"/>
-        </w:rPr>
-        <w:t xml:space="preserve">1. Analisis Beban Kerja &amp; Formasi: </w:t>
-      </w:r>
-      <w:r>
-        <w:rPr>
-          <w:rFonts w:ascii="Calibri" w:hAnsi="Calibri"/>
-          <w:color w:val="1E293B"/>
-          <w:sz w:val="20"/>
-        </w:rPr>
-        <w:t>Mengevaluasi kesesuaian rentang kendali (span of control), analisis beban kerja, dan batas kuota formasi ASN.</w:t>
-      </w:r>
-    </w:p>
-    <w:p>
-      <w:pPr>
-        <w:pStyle w:val="ListBullet"/>
-        <w:spacing w:after="40" w:line="276" w:lineRule="auto"/>
-      </w:pPr>
-      <w:r>
-        <w:rPr>
-          <w:b/>
-          <w:color w:val="0B2A4A"/>
-          <w:sz w:val="20"/>
-        </w:rPr>
-        <w:t xml:space="preserve">2. Penerbitan Catatan Teknis: </w:t>
-      </w:r>
-      <w:r>
-        <w:rPr>
-          <w:rFonts w:ascii="Calibri" w:hAnsi="Calibri"/>
-          <w:color w:val="1E293B"/>
-          <w:sz w:val="20"/>
-        </w:rPr>
-        <w:t>Menginputkan koreksi teknis terinci pada form `verifier_review_notes` jika ditemukan ketidaksesuaian substantif.</w:t>
-      </w:r>
-    </w:p>
-    <w:p>
-      <w:pPr>
-        <w:pStyle w:val="ListBullet"/>
-        <w:spacing w:after="40" w:line="276" w:lineRule="auto"/>
-      </w:pPr>
-      <w:r>
-        <w:rPr>
-          <w:b/>
-          <w:color w:val="0B2A4A"/>
-          <w:sz w:val="20"/>
-        </w:rPr>
-        <w:t xml:space="preserve">3. Pengesahan Final (Final Approval Authority): </w:t>
-      </w:r>
-      <w:r>
-        <w:rPr>
-          <w:rFonts w:ascii="Calibri" w:hAnsi="Calibri"/>
-          <w:color w:val="1E293B"/>
-          <w:sz w:val="20"/>
-        </w:rPr>
-        <w:t>Verifikator memiliki hak wewenang tunggal untuk menerbitkan SK persetujuan resmi melalui perintah `finalApprove()`.</w:t>
-      </w:r>
-    </w:p>
-    <w:p>
-      <w:pPr>
-        <w:pStyle w:val="ListBullet"/>
-        <w:spacing w:after="40" w:line="276" w:lineRule="auto"/>
-      </w:pPr>
-      <w:r>
-        <w:rPr>
-          <w:b/>
-          <w:color w:val="0B2A4A"/>
-          <w:sz w:val="20"/>
-        </w:rPr>
-        <w:t xml:space="preserve">4. Promosi Master Data Otomatis: </w:t>
-      </w:r>
-      <w:r>
-        <w:rPr>
-          <w:rFonts w:ascii="Calibri" w:hAnsi="Calibri"/>
-          <w:color w:val="1E293B"/>
-          <w:sz w:val="20"/>
-        </w:rPr>
-        <w:t>Pasca pengesahan, sistem secara otomatis mengeksekusi `promote()`, mentransfer seluruh struktur baru ke master data aktif tanpa intervensi manual.</w:t>
+        <w:t>Gate 2 Verifier Workspace mengevaluasi beban kerja organisasi, formasi ASN, menandatangani pengesahan SK resmi, dan mengeksekusi promosi data.</w:t>
       </w:r>
     </w:p>
     <w:p>
       <w:pPr>
         <w:keepNext/>
-        <w:spacing w:before="160" w:after="40"/>
+        <w:spacing w:before="160" w:after="60"/>
         <w:jc w:val="center"/>
       </w:pPr>
       <w:r>
         <w:drawing>
           <wp:inline xmlns:a="http://schemas.openxmlformats.org/drawingml/2006/main" xmlns:pic="http://schemas.openxmlformats.org/drawingml/2006/picture">
-            <wp:extent cx="5486400" cy="3326346"/>
+            <wp:extent cx="5760720" cy="3780472"/>
             <wp:docPr id="10" name="Picture 10"/>
             <wp:cNvGraphicFramePr>
               <a:graphicFrameLocks noChangeAspect="1"/>
@@ -10615,7 +9444,7 @@
                   <pic:spPr>
                     <a:xfrm>
                       <a:off x="0" y="0"/>
-                      <a:ext cx="5486400" cy="3326346"/>
+                      <a:ext cx="5760720" cy="3780472"/>
                     </a:xfrm>
                     <a:prstGeom prst="rect"/>
                   </pic:spPr>
@@ -10658,21 +9487,6 @@
     </w:p>
     <w:p>
       <w:pPr>
-        <w:keepNext/>
-        <w:spacing w:before="200" w:after="80"/>
-      </w:pPr>
-      <w:r>
-        <w:rPr>
-          <w:rFonts w:ascii="Calibri" w:hAnsi="Calibri"/>
-          <w:b/>
-          <w:color w:val="1E40AF"/>
-          <w:sz w:val="24"/>
-        </w:rPr>
-        <w:t>12.1 Alur Otentikasi dan Pengelolaan Token</w:t>
-      </w:r>
-    </w:p>
-    <w:p>
-      <w:pPr>
         <w:spacing w:after="80" w:line="276" w:lineRule="auto"/>
       </w:pPr>
       <w:r>
@@ -10681,107 +9495,19 @@
           <w:color w:val="1E293B"/>
           <w:sz w:val="20"/>
         </w:rPr>
-        <w:t>Siklus otentikasi pengguna pada SIGMA-K menggunakan standar industri JSON Web Token (JWT):</w:t>
-      </w:r>
-    </w:p>
-    <w:p>
-      <w:pPr>
-        <w:pStyle w:val="ListBullet"/>
-        <w:spacing w:after="40" w:line="276" w:lineRule="auto"/>
-      </w:pPr>
-      <w:r>
-        <w:rPr>
-          <w:b/>
-          <w:color w:val="0B2A4A"/>
-          <w:sz w:val="20"/>
-        </w:rPr>
-        <w:t xml:space="preserve">1. Login Kredensial: </w:t>
-      </w:r>
-      <w:r>
-        <w:rPr>
-          <w:rFonts w:ascii="Calibri" w:hAnsi="Calibri"/>
-          <w:color w:val="1E293B"/>
-          <w:sz w:val="20"/>
-        </w:rPr>
-        <w:t>Klien mengirimkan kredensial NIP/Username dan Password melalui endpoint `POST /api/v1/auth/login`.</w:t>
-      </w:r>
-    </w:p>
-    <w:p>
-      <w:pPr>
-        <w:pStyle w:val="ListBullet"/>
-        <w:spacing w:after="40" w:line="276" w:lineRule="auto"/>
-      </w:pPr>
-      <w:r>
-        <w:rPr>
-          <w:b/>
-          <w:color w:val="0B2A4A"/>
-          <w:sz w:val="20"/>
-        </w:rPr>
-        <w:t xml:space="preserve">2. Penerbitan JWT: </w:t>
-      </w:r>
-      <w:r>
-        <w:rPr>
-          <w:rFonts w:ascii="Calibri" w:hAnsi="Calibri"/>
-          <w:color w:val="1E293B"/>
-          <w:sz w:val="20"/>
-        </w:rPr>
-        <w:t>Backend memvalidasi kredensial terhadap tabel `users`, lalu menerbitkan JWT bertanda tangan HMAC-SHA256 yang memuat klaim identitas, role, dan home institution.</w:t>
-      </w:r>
-    </w:p>
-    <w:p>
-      <w:pPr>
-        <w:pStyle w:val="ListBullet"/>
-        <w:spacing w:after="40" w:line="276" w:lineRule="auto"/>
-      </w:pPr>
-      <w:r>
-        <w:rPr>
-          <w:b/>
-          <w:color w:val="0B2A4A"/>
-          <w:sz w:val="20"/>
-        </w:rPr>
-        <w:t xml:space="preserve">3. Injeksi Otomatis: </w:t>
-      </w:r>
-      <w:r>
-        <w:rPr>
-          <w:rFonts w:ascii="Calibri" w:hAnsi="Calibri"/>
-          <w:color w:val="1E293B"/>
-          <w:sz w:val="20"/>
-        </w:rPr>
-        <w:t>Token disimpan di Browser Storage melalui `BrowserStorageTokenProvider`. Setiap request HTTP berikutnya otomatis menyisipkan header `Authorization: Bearer &lt;token&gt;`.</w:t>
-      </w:r>
-    </w:p>
-    <w:p>
-      <w:pPr>
-        <w:pStyle w:val="ListBullet"/>
-        <w:spacing w:after="40" w:line="276" w:lineRule="auto"/>
-      </w:pPr>
-      <w:r>
-        <w:rPr>
-          <w:b/>
-          <w:color w:val="0B2A4A"/>
-          <w:sz w:val="20"/>
-        </w:rPr>
-        <w:t xml:space="preserve">4. Resolusi Profil &amp; Sesi: </w:t>
-      </w:r>
-      <w:r>
-        <w:rPr>
-          <w:rFonts w:ascii="Calibri" w:hAnsi="Calibri"/>
-          <w:color w:val="1E293B"/>
-          <w:sz w:val="20"/>
-        </w:rPr>
-        <w:t>Saat aplikasi dimuat, endpoint `GET /api/v1/auth/me` dipanggil untuk menginisialisasi profil pengguna, daftar izin, dan cakupan instansi yang sah.</w:t>
+        <w:t>Alur autentikasi JWT mengelola siklus hidup token kriptografis dan verifikasi profil pengguna.</w:t>
       </w:r>
     </w:p>
     <w:p>
       <w:pPr>
         <w:keepNext/>
-        <w:spacing w:before="160" w:after="40"/>
+        <w:spacing w:before="160" w:after="60"/>
         <w:jc w:val="center"/>
       </w:pPr>
       <w:r>
         <w:drawing>
           <wp:inline xmlns:a="http://schemas.openxmlformats.org/drawingml/2006/main" xmlns:pic="http://schemas.openxmlformats.org/drawingml/2006/picture">
-            <wp:extent cx="5486400" cy="3326346"/>
+            <wp:extent cx="5760720" cy="3780472"/>
             <wp:docPr id="11" name="Picture 11"/>
             <wp:cNvGraphicFramePr>
               <a:graphicFrameLocks noChangeAspect="1"/>
@@ -10802,7 +9528,7 @@
                   <pic:spPr>
                     <a:xfrm>
                       <a:off x="0" y="0"/>
-                      <a:ext cx="5486400" cy="3326346"/>
+                      <a:ext cx="5760720" cy="3780472"/>
                     </a:xfrm>
                     <a:prstGeom prst="rect"/>
                   </pic:spPr>
@@ -10845,21 +9571,6 @@
     </w:p>
     <w:p>
       <w:pPr>
-        <w:keepNext/>
-        <w:spacing w:before="200" w:after="80"/>
-      </w:pPr>
-      <w:r>
-        <w:rPr>
-          <w:rFonts w:ascii="Calibri" w:hAnsi="Calibri"/>
-          <w:b/>
-          <w:color w:val="1E40AF"/>
-          <w:sz w:val="24"/>
-        </w:rPr>
-        <w:t>13.1 Prinsip Keamanan Zero-Trust</w:t>
-      </w:r>
-    </w:p>
-    <w:p>
-      <w:pPr>
         <w:spacing w:after="80" w:line="276" w:lineRule="auto"/>
       </w:pPr>
       <w:r>
@@ -10868,95 +9579,7 @@
           <w:color w:val="1E293B"/>
           <w:sz w:val="20"/>
         </w:rPr>
-        <w:t>SIGMA-K menerapkan arsitektur keamanan Zero-Trust yang ketat:</w:t>
-      </w:r>
-    </w:p>
-    <w:p>
-      <w:pPr>
-        <w:pStyle w:val="ListBullet"/>
-        <w:spacing w:after="40" w:line="276" w:lineRule="auto"/>
-      </w:pPr>
-      <w:r>
-        <w:rPr>
-          <w:b/>
-          <w:color w:val="0B2A4A"/>
-          <w:sz w:val="20"/>
-        </w:rPr>
-        <w:t xml:space="preserve">1. Backend Single Source of Truth: </w:t>
-      </w:r>
-      <w:r>
-        <w:rPr>
-          <w:rFonts w:ascii="Calibri" w:hAnsi="Calibri"/>
-          <w:color w:val="1E293B"/>
-          <w:sz w:val="20"/>
-        </w:rPr>
-        <w:t>Frontend Next.js tidak pernah membuat keputusan otorisasi secara mandiri. Backend `AuthorizationService` dan `ScopeResolver` menjadi otoritas mutlak.</w:t>
-      </w:r>
-    </w:p>
-    <w:p>
-      <w:pPr>
-        <w:pStyle w:val="ListBullet"/>
-        <w:spacing w:after="40" w:line="276" w:lineRule="auto"/>
-      </w:pPr>
-      <w:r>
-        <w:rPr>
-          <w:b/>
-          <w:color w:val="0B2A4A"/>
-          <w:sz w:val="20"/>
-        </w:rPr>
-        <w:t xml:space="preserve">2. Proteksi BOLA / IDOR Scoping: </w:t>
-      </w:r>
-      <w:r>
-        <w:rPr>
-          <w:rFonts w:ascii="Calibri" w:hAnsi="Calibri"/>
-          <w:color w:val="1E293B"/>
-          <w:sz w:val="20"/>
-        </w:rPr>
-        <w:t>Setiap kueri data instansi, usulan, dan telaah diverifikasi kepemilikannya terhadap `user_scopes` dan `access_grants` pengguna untuk mencegah eksploitasi BOLA/IDOR.</w:t>
-      </w:r>
-    </w:p>
-    <w:p>
-      <w:pPr>
-        <w:pStyle w:val="ListBullet"/>
-        <w:spacing w:after="40" w:line="276" w:lineRule="auto"/>
-      </w:pPr>
-      <w:r>
-        <w:rPr>
-          <w:b/>
-          <w:color w:val="0B2A4A"/>
-          <w:sz w:val="20"/>
-        </w:rPr>
-        <w:t xml:space="preserve">3. Anti Self-Approval Guard: </w:t>
-      </w:r>
-      <w:r>
-        <w:rPr>
-          <w:rFonts w:ascii="Calibri" w:hAnsi="Calibri"/>
-          <w:color w:val="1E293B"/>
-          <w:sz w:val="20"/>
-        </w:rPr>
-        <w:t>Penulis usulan (author) secara sistematis diblokir dari melakukan telaah atau pengesahan atas usulan buatannya sendiri.</w:t>
-      </w:r>
-    </w:p>
-    <w:p>
-      <w:pPr>
-        <w:pStyle w:val="ListBullet"/>
-        <w:spacing w:after="40" w:line="276" w:lineRule="auto"/>
-      </w:pPr>
-      <w:r>
-        <w:rPr>
-          <w:b/>
-          <w:color w:val="0B2A4A"/>
-          <w:sz w:val="20"/>
-        </w:rPr>
-        <w:t xml:space="preserve">4. Isolasi Persona Produksi: </w:t>
-      </w:r>
-      <w:r>
-        <w:rPr>
-          <w:rFonts w:ascii="Calibri" w:hAnsi="Calibri"/>
-          <w:color w:val="1E293B"/>
-          <w:sz w:val="20"/>
-        </w:rPr>
-        <w:t>Pada mode API produksi, persona switcher di TopBar dinonaktifkan menjadi Read-Only Badge guna mencegah eskalasi wewenang ilegal pada sisi klien.</w:t>
+        <w:t>Backend CodeIgniter 4 AuthorizationService dan ScopeResolver bertindak sebagai otoritas mutlak pengendali izin dan proteksi BOLA/IDOR.</w:t>
       </w:r>
     </w:p>
     <w:p>
@@ -10976,21 +9599,6 @@
     </w:p>
     <w:p>
       <w:pPr>
-        <w:keepNext/>
-        <w:spacing w:before="200" w:after="80"/>
-      </w:pPr>
-      <w:r>
-        <w:rPr>
-          <w:rFonts w:ascii="Calibri" w:hAnsi="Calibri"/>
-          <w:b/>
-          <w:color w:val="1E40AF"/>
-          <w:sz w:val="24"/>
-        </w:rPr>
-        <w:t>14.1 Arsitektur Pelaporan Eksekutif</w:t>
-      </w:r>
-    </w:p>
-    <w:p>
-      <w:pPr>
         <w:spacing w:after="80" w:line="276" w:lineRule="auto"/>
       </w:pPr>
       <w:r>
@@ -10999,139 +9607,7 @@
           <w:color w:val="1E293B"/>
           <w:sz w:val="20"/>
         </w:rPr>
-        <w:t>Modul pelaporan pada SIGMA-K didukung oleh `ReportController` dan `ExecutiveReportService` backend yang menyajikan data analitik secara real-time dari basis data `eskld_db`:</w:t>
-      </w:r>
-    </w:p>
-    <w:p>
-      <w:pPr>
-        <w:pStyle w:val="ListBullet"/>
-        <w:spacing w:after="40" w:line="276" w:lineRule="auto"/>
-      </w:pPr>
-      <w:r>
-        <w:rPr>
-          <w:b/>
-          <w:color w:val="0B2A4A"/>
-          <w:sz w:val="20"/>
-        </w:rPr>
-        <w:t xml:space="preserve">• GET /api/v1/reports/summary: </w:t>
-      </w:r>
-      <w:r>
-        <w:rPr>
-          <w:rFonts w:ascii="Calibri" w:hAnsi="Calibri"/>
-          <w:color w:val="1E293B"/>
-          <w:sz w:val="20"/>
-        </w:rPr>
-        <w:t>Menyajikan metrik total instansi, total unit aktif, total jabatan, total formasi ASN, ringkasan status funnel, dan pengesahan SK terkini.</w:t>
-      </w:r>
-    </w:p>
-    <w:p>
-      <w:pPr>
-        <w:pStyle w:val="ListBullet"/>
-        <w:spacing w:after="40" w:line="276" w:lineRule="auto"/>
-      </w:pPr>
-      <w:r>
-        <w:rPr>
-          <w:b/>
-          <w:color w:val="0B2A4A"/>
-          <w:sz w:val="20"/>
-        </w:rPr>
-        <w:t xml:space="preserve">• GET /api/v1/reports/submissions: </w:t>
-      </w:r>
-      <w:r>
-        <w:rPr>
-          <w:rFonts w:ascii="Calibri" w:hAnsi="Calibri"/>
-          <w:color w:val="1E293B"/>
-          <w:sz w:val="20"/>
-        </w:rPr>
-        <w:t>Laporan rincian usulan terfilter berdasarkan instansi, status, dan tahun usulan.</w:t>
-      </w:r>
-    </w:p>
-    <w:p>
-      <w:pPr>
-        <w:pStyle w:val="ListBullet"/>
-        <w:spacing w:after="40" w:line="276" w:lineRule="auto"/>
-      </w:pPr>
-      <w:r>
-        <w:rPr>
-          <w:b/>
-          <w:color w:val="0B2A4A"/>
-          <w:sz w:val="20"/>
-        </w:rPr>
-        <w:t xml:space="preserve">• GET /api/v1/reports/institutions: </w:t>
-      </w:r>
-      <w:r>
-        <w:rPr>
-          <w:rFonts w:ascii="Calibri" w:hAnsi="Calibri"/>
-          <w:color w:val="1E293B"/>
-          <w:sz w:val="20"/>
-        </w:rPr>
-        <w:t>Rekapitulasi beban kelembagaan per instansi pemerintah.</w:t>
-      </w:r>
-    </w:p>
-    <w:p>
-      <w:pPr>
-        <w:pStyle w:val="ListBullet"/>
-        <w:spacing w:after="40" w:line="276" w:lineRule="auto"/>
-      </w:pPr>
-      <w:r>
-        <w:rPr>
-          <w:b/>
-          <w:color w:val="0B2A4A"/>
-          <w:sz w:val="20"/>
-        </w:rPr>
-        <w:t xml:space="preserve">• GET /api/v1/reports/approvals: </w:t>
-      </w:r>
-      <w:r>
-        <w:rPr>
-          <w:rFonts w:ascii="Calibri" w:hAnsi="Calibri"/>
-          <w:color w:val="1E293B"/>
-          <w:sz w:val="20"/>
-        </w:rPr>
-        <w:t>Daftar rekam pengesahan SK resmi yang disahkan oleh Verifikator.</w:t>
-      </w:r>
-    </w:p>
-    <w:p>
-      <w:pPr>
-        <w:pStyle w:val="ListBullet"/>
-        <w:spacing w:after="40" w:line="276" w:lineRule="auto"/>
-      </w:pPr>
-      <w:r>
-        <w:rPr>
-          <w:b/>
-          <w:color w:val="0B2A4A"/>
-          <w:sz w:val="20"/>
-        </w:rPr>
-        <w:t xml:space="preserve">• GET /api/v1/reports/promotions: </w:t>
-      </w:r>
-      <w:r>
-        <w:rPr>
-          <w:rFonts w:ascii="Calibri" w:hAnsi="Calibri"/>
-          <w:color w:val="1E293B"/>
-          <w:sz w:val="20"/>
-        </w:rPr>
-        <w:t>Riwayat migrasi usulan ke master data aktif.</w:t>
-      </w:r>
-    </w:p>
-    <w:p>
-      <w:pPr>
-        <w:pStyle w:val="ListBullet"/>
-        <w:spacing w:after="40" w:line="276" w:lineRule="auto"/>
-      </w:pPr>
-      <w:r>
-        <w:rPr>
-          <w:b/>
-          <w:color w:val="0B2A4A"/>
-          <w:sz w:val="20"/>
-        </w:rPr>
-        <w:t xml:space="preserve">• GET /api/v1/reports/export: </w:t>
-      </w:r>
-      <w:r>
-        <w:rPr>
-          <w:rFonts w:ascii="Calibri" w:hAnsi="Calibri"/>
-          <w:color w:val="1E293B"/>
-          <w:sz w:val="20"/>
-        </w:rPr>
-        <w:t>Layanan unduh dataset resmi dalam format CSV stream dan JSON.</w:t>
+        <w:t>Modul pelaporan menyajikan agregasi metrik kelembagaan nasional, status funnel usulan, serta layanan ekspor dataset CSV/JSON.</w:t>
       </w:r>
     </w:p>
     <w:p>
@@ -11151,21 +9627,6 @@
     </w:p>
     <w:p>
       <w:pPr>
-        <w:keepNext/>
-        <w:spacing w:before="200" w:after="80"/>
-      </w:pPr>
-      <w:r>
-        <w:rPr>
-          <w:rFonts w:ascii="Calibri" w:hAnsi="Calibri"/>
-          <w:b/>
-          <w:color w:val="1E40AF"/>
-          <w:sz w:val="24"/>
-        </w:rPr>
-        <w:t>15.1 Rekam Jejak Append-Only Mutlak</w:t>
-      </w:r>
-    </w:p>
-    <w:p>
-      <w:pPr>
         <w:spacing w:after="80" w:line="276" w:lineRule="auto"/>
       </w:pPr>
       <w:r>
@@ -11174,117 +9635,7 @@
           <w:color w:val="1E293B"/>
           <w:sz w:val="20"/>
         </w:rPr>
-        <w:t>Setiap aksi manipulasi data pada sistem dicatat secara otomatis ke dalam tabel `audit_logs` melalui `AuditService`. Struktur data audit mencatat secara detail:</w:t>
-      </w:r>
-    </w:p>
-    <w:p>
-      <w:pPr>
-        <w:pStyle w:val="ListBullet"/>
-        <w:spacing w:after="40" w:line="276" w:lineRule="auto"/>
-      </w:pPr>
-      <w:r>
-        <w:rPr>
-          <w:b/>
-          <w:color w:val="0B2A4A"/>
-          <w:sz w:val="20"/>
-        </w:rPr>
-        <w:t xml:space="preserve">• Data Aktor: </w:t>
-      </w:r>
-      <w:r>
-        <w:rPr>
-          <w:rFonts w:ascii="Calibri" w:hAnsi="Calibri"/>
-          <w:color w:val="1E293B"/>
-          <w:sz w:val="20"/>
-        </w:rPr>
-        <w:t>Identitas unik aktor yang melakukan tindakan (actor_id, actor_name, actor_role).</w:t>
-      </w:r>
-    </w:p>
-    <w:p>
-      <w:pPr>
-        <w:pStyle w:val="ListBullet"/>
-        <w:spacing w:after="40" w:line="276" w:lineRule="auto"/>
-      </w:pPr>
-      <w:r>
-        <w:rPr>
-          <w:b/>
-          <w:color w:val="0B2A4A"/>
-          <w:sz w:val="20"/>
-        </w:rPr>
-        <w:t xml:space="preserve">• Event Aksi: </w:t>
-      </w:r>
-      <w:r>
-        <w:rPr>
-          <w:rFonts w:ascii="Calibri" w:hAnsi="Calibri"/>
-          <w:color w:val="1E293B"/>
-          <w:sz w:val="20"/>
-        </w:rPr>
-        <w:t>Klasifikasi aksi (CREATE, UPDATE, DELETE, SUBMIT, VERIFY, APPROVE, REJECT, PROMOTE).</w:t>
-      </w:r>
-    </w:p>
-    <w:p>
-      <w:pPr>
-        <w:pStyle w:val="ListBullet"/>
-        <w:spacing w:after="40" w:line="276" w:lineRule="auto"/>
-      </w:pPr>
-      <w:r>
-        <w:rPr>
-          <w:b/>
-          <w:color w:val="0B2A4A"/>
-          <w:sz w:val="20"/>
-        </w:rPr>
-        <w:t xml:space="preserve">• Entitas Target: </w:t>
-      </w:r>
-      <w:r>
-        <w:rPr>
-          <w:rFonts w:ascii="Calibri" w:hAnsi="Calibri"/>
-          <w:color w:val="1E293B"/>
-          <w:sz w:val="20"/>
-        </w:rPr>
-        <w:t>Tipe entitas yang dimanipulasi (SUBMISSION, INSTITUTION, UNIT, POSITION, ACCESS) beserta ID target.</w:t>
-      </w:r>
-    </w:p>
-    <w:p>
-      <w:pPr>
-        <w:pStyle w:val="ListBullet"/>
-        <w:spacing w:after="40" w:line="276" w:lineRule="auto"/>
-      </w:pPr>
-      <w:r>
-        <w:rPr>
-          <w:b/>
-          <w:color w:val="0B2A4A"/>
-          <w:sz w:val="20"/>
-        </w:rPr>
-        <w:t xml:space="preserve">• Payload Diffing: </w:t>
-      </w:r>
-      <w:r>
-        <w:rPr>
-          <w:rFonts w:ascii="Calibri" w:hAnsi="Calibri"/>
-          <w:color w:val="1E293B"/>
-          <w:sz w:val="20"/>
-        </w:rPr>
-        <w:t>Snapshot JSON data sebelum dan sesudah perubahan guna memungkinkan rekonstruksi forensik penuh.</w:t>
-      </w:r>
-    </w:p>
-    <w:p>
-      <w:pPr>
-        <w:pStyle w:val="ListBullet"/>
-        <w:spacing w:after="40" w:line="276" w:lineRule="auto"/>
-      </w:pPr>
-      <w:r>
-        <w:rPr>
-          <w:b/>
-          <w:color w:val="0B2A4A"/>
-          <w:sz w:val="20"/>
-        </w:rPr>
-        <w:t xml:space="preserve">• Konteks Jaringan: </w:t>
-      </w:r>
-      <w:r>
-        <w:rPr>
-          <w:rFonts w:ascii="Calibri" w:hAnsi="Calibri"/>
-          <w:color w:val="1E293B"/>
-          <w:sz w:val="20"/>
-        </w:rPr>
-        <w:t>Alamat IP klien, informasi user agent, dan timestamp berpresisi tinggi.</w:t>
+        <w:t>Pencatatan rekam jejak append-only mutlak pada tabel audit_logs mendokumentasikan setiap aksi mutasi data secara transparan.</w:t>
       </w:r>
     </w:p>
     <w:p>
@@ -11305,35 +9656,7 @@
     <w:p>
       <w:pPr>
         <w:keepNext/>
-        <w:spacing w:before="200" w:after="80"/>
-      </w:pPr>
-      <w:r>
-        <w:rPr>
-          <w:rFonts w:ascii="Calibri" w:hAnsi="Calibri"/>
-          <w:b/>
-          <w:color w:val="1E40AF"/>
-          <w:sz w:val="24"/>
-        </w:rPr>
-        <w:t>16.1 Katalog Lengkap REST API Terverifikasi</w:t>
-      </w:r>
-    </w:p>
-    <w:p>
-      <w:pPr>
-        <w:spacing w:after="80" w:line="276" w:lineRule="auto"/>
-      </w:pPr>
-      <w:r>
-        <w:rPr>
-          <w:rFonts w:ascii="Calibri" w:hAnsi="Calibri"/>
-          <w:color w:val="1E293B"/>
-          <w:sz w:val="20"/>
-        </w:rPr>
-        <w:t>Berikut adalah tabel spesifikasi seluruh endpoint REST API CodeIgniter 4 yang telah terintegrasi dengan frontend Next.js:</w:t>
-      </w:r>
-    </w:p>
-    <w:p>
-      <w:pPr>
-        <w:keepNext/>
-        <w:spacing w:before="120" w:after="40"/>
+        <w:spacing w:before="160" w:after="60"/>
       </w:pPr>
       <w:r>
         <w:rPr>
@@ -11350,10 +9673,10 @@
         <w:jc w:val="center"/>
         <w:tblLook w:firstColumn="1" w:firstRow="1" w:lastColumn="0" w:lastRow="0" w:noHBand="0" w:noVBand="1" w:val="04A0"/>
         <w:tblBorders>
-          <w:top w:val="single" w:sz="4" w:space="0" w:color="CBD5E1"/>
-          <w:left w:val="single" w:sz="4" w:space="0" w:color="CBD5E1"/>
-          <w:bottom w:val="single" w:sz="4" w:space="0" w:color="CBD5E1"/>
-          <w:right w:val="single" w:sz="4" w:space="0" w:color="CBD5E1"/>
+          <w:top w:val="single" w:sz="6" w:space="0" w:color="CBD5E1"/>
+          <w:left w:val="single" w:sz="6" w:space="0" w:color="CBD5E1"/>
+          <w:bottom w:val="single" w:sz="6" w:space="0" w:color="CBD5E1"/>
+          <w:right w:val="single" w:sz="6" w:space="0" w:color="CBD5E1"/>
           <w:insideH w:val="single" w:sz="4" w:space="0" w:color="CBD5E1"/>
           <w:insideV w:val="single" w:sz="4" w:space="0" w:color="CBD5E1"/>
         </w:tblBorders>
@@ -13848,27 +12171,14 @@
     </w:p>
     <w:p>
       <w:pPr>
-        <w:spacing w:after="80" w:line="276" w:lineRule="auto"/>
-      </w:pPr>
-      <w:r>
-        <w:rPr>
-          <w:rFonts w:ascii="Calibri" w:hAnsi="Calibri"/>
-          <w:color w:val="1E293B"/>
-          <w:sz w:val="20"/>
-        </w:rPr>
-        <w:t>Layar autentikasi awal yang menyajikan form input NIP dan Password dengan indikator mode API, validasi format, dan tombol preset akun.</w:t>
-      </w:r>
-    </w:p>
-    <w:p>
-      <w:pPr>
         <w:keepNext/>
-        <w:spacing w:before="160" w:after="40"/>
+        <w:spacing w:before="160" w:after="60"/>
         <w:jc w:val="center"/>
       </w:pPr>
       <w:r>
         <w:drawing>
           <wp:inline xmlns:a="http://schemas.openxmlformats.org/drawingml/2006/main" xmlns:pic="http://schemas.openxmlformats.org/drawingml/2006/picture">
-            <wp:extent cx="5486400" cy="3060651"/>
+            <wp:extent cx="5760720" cy="3780472"/>
             <wp:docPr id="12" name="Picture 12"/>
             <wp:cNvGraphicFramePr>
               <a:graphicFrameLocks noChangeAspect="1"/>
@@ -13889,7 +12199,7 @@
                   <pic:spPr>
                     <a:xfrm>
                       <a:off x="0" y="0"/>
-                      <a:ext cx="5486400" cy="3060651"/>
+                      <a:ext cx="5760720" cy="3780472"/>
                     </a:xfrm>
                     <a:prstGeom prst="rect"/>
                   </pic:spPr>
@@ -13932,27 +12242,14 @@
     </w:p>
     <w:p>
       <w:pPr>
-        <w:spacing w:after="80" w:line="276" w:lineRule="auto"/>
-      </w:pPr>
-      <w:r>
-        <w:rPr>
-          <w:rFonts w:ascii="Calibri" w:hAnsi="Calibri"/>
-          <w:color w:val="1E293B"/>
-          <w:sz w:val="20"/>
-        </w:rPr>
-        <w:t>Layar beranda eksekutif yang menampilkan 4 kartu KPI utama (Total Usulan, Dalam Proses, Disetujui, Promosi), sorotan kabinet aktif, antrean usulan terkini, dan widget SK pengesahan terbaru.</w:t>
-      </w:r>
-    </w:p>
-    <w:p>
-      <w:pPr>
         <w:keepNext/>
-        <w:spacing w:before="160" w:after="40"/>
+        <w:spacing w:before="160" w:after="60"/>
         <w:jc w:val="center"/>
       </w:pPr>
       <w:r>
         <w:drawing>
           <wp:inline xmlns:a="http://schemas.openxmlformats.org/drawingml/2006/main" xmlns:pic="http://schemas.openxmlformats.org/drawingml/2006/picture">
-            <wp:extent cx="5486400" cy="3060651"/>
+            <wp:extent cx="5760720" cy="3780472"/>
             <wp:docPr id="13" name="Picture 13"/>
             <wp:cNvGraphicFramePr>
               <a:graphicFrameLocks noChangeAspect="1"/>
@@ -13973,7 +12270,7 @@
                   <pic:spPr>
                     <a:xfrm>
                       <a:off x="0" y="0"/>
-                      <a:ext cx="5486400" cy="3060651"/>
+                      <a:ext cx="5760720" cy="3780472"/>
                     </a:xfrm>
                     <a:prstGeom prst="rect"/>
                   </pic:spPr>
@@ -14016,27 +12313,14 @@
     </w:p>
     <w:p>
       <w:pPr>
-        <w:spacing w:after="80" w:line="276" w:lineRule="auto"/>
-      </w:pPr>
-      <w:r>
-        <w:rPr>
-          <w:rFonts w:ascii="Calibri" w:hAnsi="Calibri"/>
-          <w:color w:val="1E293B"/>
-          <w:sz w:val="20"/>
-        </w:rPr>
-        <w:t>Katalog terpadu kementerian/lembaga/daerah dengan filter kategori (Kemenko, Kementerian, LPNK, Pemda), pencarian instan, dan statistik ringkas beban unit kerja.</w:t>
-      </w:r>
-    </w:p>
-    <w:p>
-      <w:pPr>
         <w:keepNext/>
-        <w:spacing w:before="160" w:after="40"/>
+        <w:spacing w:before="160" w:after="60"/>
         <w:jc w:val="center"/>
       </w:pPr>
       <w:r>
         <w:drawing>
           <wp:inline xmlns:a="http://schemas.openxmlformats.org/drawingml/2006/main" xmlns:pic="http://schemas.openxmlformats.org/drawingml/2006/picture">
-            <wp:extent cx="5486400" cy="3060651"/>
+            <wp:extent cx="5760720" cy="3780472"/>
             <wp:docPr id="14" name="Picture 14"/>
             <wp:cNvGraphicFramePr>
               <a:graphicFrameLocks noChangeAspect="1"/>
@@ -14057,7 +12341,7 @@
                   <pic:spPr>
                     <a:xfrm>
                       <a:off x="0" y="0"/>
-                      <a:ext cx="5486400" cy="3060651"/>
+                      <a:ext cx="5760720" cy="3780472"/>
                     </a:xfrm>
                     <a:prstGeom prst="rect"/>
                   </pic:spPr>
@@ -14100,27 +12384,14 @@
     </w:p>
     <w:p>
       <w:pPr>
-        <w:spacing w:after="80" w:line="276" w:lineRule="auto"/>
-      </w:pPr>
-      <w:r>
-        <w:rPr>
-          <w:rFonts w:ascii="Calibri" w:hAnsi="Calibri"/>
-          <w:color w:val="1E293B"/>
-          <w:sz w:val="20"/>
-        </w:rPr>
-        <w:t>Kanvas graf interaktif berteknologi React Flow yang menyajikan pohon hierarki unit kerja lengkap dengan garis konektor parent-child, level eselon, MiniMap, dan drawer detail formasi jabatan.</w:t>
-      </w:r>
-    </w:p>
-    <w:p>
-      <w:pPr>
         <w:keepNext/>
-        <w:spacing w:before="160" w:after="40"/>
+        <w:spacing w:before="160" w:after="60"/>
         <w:jc w:val="center"/>
       </w:pPr>
       <w:r>
         <w:drawing>
           <wp:inline xmlns:a="http://schemas.openxmlformats.org/drawingml/2006/main" xmlns:pic="http://schemas.openxmlformats.org/drawingml/2006/picture">
-            <wp:extent cx="5486400" cy="3060651"/>
+            <wp:extent cx="5760720" cy="3780472"/>
             <wp:docPr id="15" name="Picture 15"/>
             <wp:cNvGraphicFramePr>
               <a:graphicFrameLocks noChangeAspect="1"/>
@@ -14141,7 +12412,7 @@
                   <pic:spPr>
                     <a:xfrm>
                       <a:off x="0" y="0"/>
-                      <a:ext cx="5486400" cy="3060651"/>
+                      <a:ext cx="5760720" cy="3780472"/>
                     </a:xfrm>
                     <a:prstGeom prst="rect"/>
                   </pic:spPr>
@@ -14184,27 +12455,14 @@
     </w:p>
     <w:p>
       <w:pPr>
-        <w:spacing w:after="80" w:line="276" w:lineRule="auto"/>
-      </w:pPr>
-      <w:r>
-        <w:rPr>
-          <w:rFonts w:ascii="Calibri" w:hAnsi="Calibri"/>
-          <w:color w:val="1E293B"/>
-          <w:sz w:val="20"/>
-        </w:rPr>
-        <w:t>Ruang pemeriksaan berkas pengusulan yang dilengkapi dengan Workflow Stepper penunjuk status, tabel komparasi Before vs After (Diff Viewer), serta tab riwayat catatan telaah.</w:t>
-      </w:r>
-    </w:p>
-    <w:p>
-      <w:pPr>
         <w:keepNext/>
-        <w:spacing w:before="160" w:after="40"/>
+        <w:spacing w:before="160" w:after="60"/>
         <w:jc w:val="center"/>
       </w:pPr>
       <w:r>
         <w:drawing>
           <wp:inline xmlns:a="http://schemas.openxmlformats.org/drawingml/2006/main" xmlns:pic="http://schemas.openxmlformats.org/drawingml/2006/picture">
-            <wp:extent cx="5486400" cy="3060651"/>
+            <wp:extent cx="5760720" cy="3780472"/>
             <wp:docPr id="16" name="Picture 16"/>
             <wp:cNvGraphicFramePr>
               <a:graphicFrameLocks noChangeAspect="1"/>
@@ -14225,7 +12483,7 @@
                   <pic:spPr>
                     <a:xfrm>
                       <a:off x="0" y="0"/>
-                      <a:ext cx="5486400" cy="3060651"/>
+                      <a:ext cx="5760720" cy="3780472"/>
                     </a:xfrm>
                     <a:prstGeom prst="rect"/>
                   </pic:spPr>
@@ -14268,27 +12526,14 @@
     </w:p>
     <w:p>
       <w:pPr>
-        <w:spacing w:after="80" w:line="276" w:lineRule="auto"/>
-      </w:pPr>
-      <w:r>
-        <w:rPr>
-          <w:rFonts w:ascii="Calibri" w:hAnsi="Calibri"/>
-          <w:color w:val="1E293B"/>
-          <w:sz w:val="20"/>
-        </w:rPr>
-        <w:t>Ruang kerja khusus Verifikator kelembagaan untuk menganalisis beban kerja organisasi, menginput catatan rekomendasi teknis, menandatangani pengesahan SK resmi, dan mengeksekusi promosi data.</w:t>
-      </w:r>
-    </w:p>
-    <w:p>
-      <w:pPr>
         <w:keepNext/>
-        <w:spacing w:before="160" w:after="40"/>
+        <w:spacing w:before="160" w:after="60"/>
         <w:jc w:val="center"/>
       </w:pPr>
       <w:r>
         <w:drawing>
           <wp:inline xmlns:a="http://schemas.openxmlformats.org/drawingml/2006/main" xmlns:pic="http://schemas.openxmlformats.org/drawingml/2006/picture">
-            <wp:extent cx="5486400" cy="3060651"/>
+            <wp:extent cx="5760720" cy="3780472"/>
             <wp:docPr id="17" name="Picture 17"/>
             <wp:cNvGraphicFramePr>
               <a:graphicFrameLocks noChangeAspect="1"/>
@@ -14309,7 +12554,7 @@
                   <pic:spPr>
                     <a:xfrm>
                       <a:off x="0" y="0"/>
-                      <a:ext cx="5486400" cy="3060651"/>
+                      <a:ext cx="5760720" cy="3780472"/>
                     </a:xfrm>
                     <a:prstGeom prst="rect"/>
                   </pic:spPr>
@@ -14352,27 +12597,14 @@
     </w:p>
     <w:p>
       <w:pPr>
-        <w:spacing w:after="80" w:line="276" w:lineRule="auto"/>
-      </w:pPr>
-      <w:r>
-        <w:rPr>
-          <w:rFonts w:ascii="Calibri" w:hAnsi="Calibri"/>
-          <w:color w:val="1E293B"/>
-          <w:sz w:val="20"/>
-        </w:rPr>
-        <w:t>Studio analitik eksekutif yang menyajikan indikator KPI kinerja kelembagaan, piramida distribusi jabatan struktural Eselon I s.d. IV, rata-rata durasi SLA layanan, dan tombol ekspor laporan CSV.</w:t>
-      </w:r>
-    </w:p>
-    <w:p>
-      <w:pPr>
         <w:keepNext/>
-        <w:spacing w:before="160" w:after="40"/>
+        <w:spacing w:before="160" w:after="60"/>
         <w:jc w:val="center"/>
       </w:pPr>
       <w:r>
         <w:drawing>
           <wp:inline xmlns:a="http://schemas.openxmlformats.org/drawingml/2006/main" xmlns:pic="http://schemas.openxmlformats.org/drawingml/2006/picture">
-            <wp:extent cx="5486400" cy="3060651"/>
+            <wp:extent cx="5760720" cy="3780472"/>
             <wp:docPr id="18" name="Picture 18"/>
             <wp:cNvGraphicFramePr>
               <a:graphicFrameLocks noChangeAspect="1"/>
@@ -14393,7 +12625,7 @@
                   <pic:spPr>
                     <a:xfrm>
                       <a:off x="0" y="0"/>
-                      <a:ext cx="5486400" cy="3060651"/>
+                      <a:ext cx="5760720" cy="3780472"/>
                     </a:xfrm>
                     <a:prstGeom prst="rect"/>
                   </pic:spPr>
@@ -14436,27 +12668,14 @@
     </w:p>
     <w:p>
       <w:pPr>
-        <w:spacing w:after="80" w:line="276" w:lineRule="auto"/>
-      </w:pPr>
-      <w:r>
-        <w:rPr>
-          <w:rFonts w:ascii="Calibri" w:hAnsi="Calibri"/>
-          <w:color w:val="1E293B"/>
-          <w:sz w:val="20"/>
-        </w:rPr>
-        <w:t>Tabel rekam jejak kepatuhan dan audit forensik mutlak yang mencatat setiap timestamp, nama aktor, role, event aksi, modul target, alamat IP, dan modal perbandingan payload JSON.</w:t>
-      </w:r>
-    </w:p>
-    <w:p>
-      <w:pPr>
         <w:keepNext/>
-        <w:spacing w:before="160" w:after="40"/>
+        <w:spacing w:before="160" w:after="60"/>
         <w:jc w:val="center"/>
       </w:pPr>
       <w:r>
         <w:drawing>
           <wp:inline xmlns:a="http://schemas.openxmlformats.org/drawingml/2006/main" xmlns:pic="http://schemas.openxmlformats.org/drawingml/2006/picture">
-            <wp:extent cx="5486400" cy="3060651"/>
+            <wp:extent cx="5760720" cy="3780472"/>
             <wp:docPr id="19" name="Picture 19"/>
             <wp:cNvGraphicFramePr>
               <a:graphicFrameLocks noChangeAspect="1"/>
@@ -14477,7 +12696,7 @@
                   <pic:spPr>
                     <a:xfrm>
                       <a:off x="0" y="0"/>
-                      <a:ext cx="5486400" cy="3060651"/>
+                      <a:ext cx="5760720" cy="3780472"/>
                     </a:xfrm>
                     <a:prstGeom prst="rect"/>
                   </pic:spPr>
@@ -14521,35 +12740,7 @@
     <w:p>
       <w:pPr>
         <w:keepNext/>
-        <w:spacing w:before="200" w:after="80"/>
-      </w:pPr>
-      <w:r>
-        <w:rPr>
-          <w:rFonts w:ascii="Calibri" w:hAnsi="Calibri"/>
-          <w:b/>
-          <w:color w:val="1E40AF"/>
-          <w:sz w:val="24"/>
-        </w:rPr>
-        <w:t>18.1 Hasil Pengujian Otomatis Frontend &amp; Backend</w:t>
-      </w:r>
-    </w:p>
-    <w:p>
-      <w:pPr>
-        <w:spacing w:after="80" w:line="276" w:lineRule="auto"/>
-      </w:pPr>
-      <w:r>
-        <w:rPr>
-          <w:rFonts w:ascii="Calibri" w:hAnsi="Calibri"/>
-          <w:color w:val="1E293B"/>
-          <w:sz w:val="20"/>
-        </w:rPr>
-        <w:t>Kualitas, stabilitas, dan kepatuhan arsitektur sistem SIGMA-K telah divalidasi secara ketat melalui pengujian otomatis komprehensif pada lapisan frontend dan backend:</w:t>
-      </w:r>
-    </w:p>
-    <w:p>
-      <w:pPr>
-        <w:keepNext/>
-        <w:spacing w:before="120" w:after="40"/>
+        <w:spacing w:before="160" w:after="60"/>
       </w:pPr>
       <w:r>
         <w:rPr>
@@ -14566,10 +12757,10 @@
         <w:jc w:val="center"/>
         <w:tblLook w:firstColumn="1" w:firstRow="1" w:lastColumn="0" w:lastRow="0" w:noHBand="0" w:noVBand="1" w:val="04A0"/>
         <w:tblBorders>
-          <w:top w:val="single" w:sz="4" w:space="0" w:color="CBD5E1"/>
-          <w:left w:val="single" w:sz="4" w:space="0" w:color="CBD5E1"/>
-          <w:bottom w:val="single" w:sz="4" w:space="0" w:color="CBD5E1"/>
-          <w:right w:val="single" w:sz="4" w:space="0" w:color="CBD5E1"/>
+          <w:top w:val="single" w:sz="6" w:space="0" w:color="CBD5E1"/>
+          <w:left w:val="single" w:sz="6" w:space="0" w:color="CBD5E1"/>
+          <w:bottom w:val="single" w:sz="6" w:space="0" w:color="CBD5E1"/>
+          <w:right w:val="single" w:sz="6" w:space="0" w:color="CBD5E1"/>
           <w:insideH w:val="single" w:sz="4" w:space="0" w:color="CBD5E1"/>
           <w:insideV w:val="single" w:sz="4" w:space="0" w:color="CBD5E1"/>
         </w:tblBorders>
@@ -15830,35 +14021,7 @@
     <w:p>
       <w:pPr>
         <w:keepNext/>
-        <w:spacing w:before="200" w:after="80"/>
-      </w:pPr>
-      <w:r>
-        <w:rPr>
-          <w:rFonts w:ascii="Calibri" w:hAnsi="Calibri"/>
-          <w:b/>
-          <w:color w:val="1E40AF"/>
-          <w:sz w:val="24"/>
-        </w:rPr>
-        <w:t>19.1 Matriks Kesiapan Fungsionalitas</w:t>
-      </w:r>
-    </w:p>
-    <w:p>
-      <w:pPr>
-        <w:spacing w:after="80" w:line="276" w:lineRule="auto"/>
-      </w:pPr>
-      <w:r>
-        <w:rPr>
-          <w:rFonts w:ascii="Calibri" w:hAnsi="Calibri"/>
-          <w:color w:val="1E293B"/>
-          <w:sz w:val="20"/>
-        </w:rPr>
-        <w:t>Tabel berikut menyajikan status implementasi aktual dari seluruh fitur sistem berdasarkan verifikasi source code repository:</w:t>
-      </w:r>
-    </w:p>
-    <w:p>
-      <w:pPr>
-        <w:keepNext/>
-        <w:spacing w:before="120" w:after="40"/>
+        <w:spacing w:before="160" w:after="60"/>
       </w:pPr>
       <w:r>
         <w:rPr>
@@ -15875,10 +14038,10 @@
         <w:jc w:val="center"/>
         <w:tblLook w:firstColumn="1" w:firstRow="1" w:lastColumn="0" w:lastRow="0" w:noHBand="0" w:noVBand="1" w:val="04A0"/>
         <w:tblBorders>
-          <w:top w:val="single" w:sz="4" w:space="0" w:color="CBD5E1"/>
-          <w:left w:val="single" w:sz="4" w:space="0" w:color="CBD5E1"/>
-          <w:bottom w:val="single" w:sz="4" w:space="0" w:color="CBD5E1"/>
-          <w:right w:val="single" w:sz="4" w:space="0" w:color="CBD5E1"/>
+          <w:top w:val="single" w:sz="6" w:space="0" w:color="CBD5E1"/>
+          <w:left w:val="single" w:sz="6" w:space="0" w:color="CBD5E1"/>
+          <w:bottom w:val="single" w:sz="6" w:space="0" w:color="CBD5E1"/>
+          <w:right w:val="single" w:sz="6" w:space="0" w:color="CBD5E1"/>
           <w:insideH w:val="single" w:sz="4" w:space="0" w:color="CBD5E1"/>
           <w:insideV w:val="single" w:sz="4" w:space="0" w:color="CBD5E1"/>
         </w:tblBorders>
@@ -17744,34 +15907,6 @@
           <w:sz w:val="28"/>
         </w:rPr>
         <w:t>BAB 20 — RENCANA PENGEMBANGAN LANJUTAN</w:t>
-      </w:r>
-    </w:p>
-    <w:p>
-      <w:pPr>
-        <w:keepNext/>
-        <w:spacing w:before="200" w:after="80"/>
-      </w:pPr>
-      <w:r>
-        <w:rPr>
-          <w:rFonts w:ascii="Calibri" w:hAnsi="Calibri"/>
-          <w:b/>
-          <w:color w:val="1E40AF"/>
-          <w:sz w:val="24"/>
-        </w:rPr>
-        <w:t>20.1 Kebutuhan Masa Depan Tercatat Resmi</w:t>
-      </w:r>
-    </w:p>
-    <w:p>
-      <w:pPr>
-        <w:spacing w:after="80" w:line="276" w:lineRule="auto"/>
-      </w:pPr>
-      <w:r>
-        <w:rPr>
-          <w:rFonts w:ascii="Calibri" w:hAnsi="Calibri"/>
-          <w:color w:val="1E293B"/>
-          <w:sz w:val="20"/>
-        </w:rPr>
-        <w:t>Berdasarkan register kebutuhan resmi project, item pengembangan lanjutan yang telah dipetakan untuk rilis berikutnya mencakup:</w:t>
       </w:r>
     </w:p>
     <w:p>
@@ -17853,21 +15988,6 @@
           <w:sz w:val="28"/>
         </w:rPr>
         <w:t>BAB 21 — KESIMPULAN &amp; PENUTUP</w:t>
-      </w:r>
-    </w:p>
-    <w:p>
-      <w:pPr>
-        <w:keepNext/>
-        <w:spacing w:before="200" w:after="80"/>
-      </w:pPr>
-      <w:r>
-        <w:rPr>
-          <w:rFonts w:ascii="Calibri" w:hAnsi="Calibri"/>
-          <w:b/>
-          <w:color w:val="1E40AF"/>
-          <w:sz w:val="24"/>
-        </w:rPr>
-        <w:t>21.1 Kesimpulan Capaian Perancangan</w:t>
       </w:r>
     </w:p>
     <w:p>

</xml_diff>

<commit_message>
docs: translate all diagrams, ERD, DOCX, PDF, and PPTX to executive-friendly Bahasa Indonesia
</commit_message>
<xml_diff>
--- a/docs/DOKUMEN_PERANCANGAN_SIGMA-K_v1.0.docx
+++ b/docs/DOKUMEN_PERANCANGAN_SIGMA-K_v1.0.docx
@@ -221,7 +221,7 @@
                 <w:color w:val="1E293B"/>
                 <w:sz w:val="19"/>
               </w:rPr>
-              <w:t>Versi 1.0 (Final Architecture &amp; Implementation Baseline)</w:t>
+              <w:t>Versi 1.0 (Arsitektur Resmi &amp; Baseline Implementasi)</w:t>
             </w:r>
           </w:p>
         </w:tc>
@@ -321,7 +321,7 @@
                 <w:color w:val="1E293B"/>
                 <w:sz w:val="19"/>
               </w:rPr>
-              <w:t>Tim Pengembang &amp; System Analyst Kelembagaan KemenPANRB</w:t>
+              <w:t>Tim Pengembang &amp; Analis Kelembagaan KemenPANRB</w:t>
             </w:r>
           </w:p>
         </w:tc>
@@ -348,7 +348,7 @@
                 <w:color w:val="0B2A4A"/>
                 <w:sz w:val="19"/>
               </w:rPr>
-              <w:t>Status Validasi</w:t>
+              <w:t>Status Pengujian</w:t>
             </w:r>
           </w:p>
         </w:tc>
@@ -371,7 +371,7 @@
                 <w:color w:val="1E293B"/>
                 <w:sz w:val="19"/>
               </w:rPr>
-              <w:t>100% Lolos Uji (105 Frontend Tests &amp; 198 Backend Unit Tests)</w:t>
+              <w:t>100% Lolos Uji (105 Pengujian Frontend &amp; 198 Pengujian Backend)</w:t>
             </w:r>
           </w:p>
         </w:tc>
@@ -394,7 +394,7 @@
           <w:color w:val="0B2A4A"/>
           <w:sz w:val="28"/>
         </w:rPr>
-        <w:t>BAB 1 — GAMBARAN UMUM</w:t>
+        <w:t>BAB 1 — GAMBARAN UMUM &amp; LATAR BELAKANG</w:t>
       </w:r>
     </w:p>
     <w:p>
@@ -409,7 +409,7 @@
           <w:color w:val="1E40AF"/>
           <w:sz w:val="24"/>
         </w:rPr>
-        <w:t>1.1 Nama Sistem</w:t>
+        <w:t>1.1 Nama dan Identitas Sistem</w:t>
       </w:r>
     </w:p>
     <w:p>
@@ -422,7 +422,7 @@
           <w:color w:val="1E293B"/>
           <w:sz w:val="20"/>
         </w:rPr>
-        <w:t>Nama resmi sistem adalah E-SKLD / SIGMA-K (Sistem Pengelolaan Data Kementerian/Lembaga/Pemerintah Daerah dan Struktur Kelembagaan). Sistem ini dikembangkan sebagai platform tunggal (single source of truth) terpadu di lingkungan Kementerian Pendayagunaan Aparatur Negara dan Reformasi Birokrasi (KemenPANRB) untuk mengelola data kelembagaan instansi pemerintah di seluruh Indonesia.</w:t>
+        <w:t>Nama resmi aplikasi ini adalah E-SKLD / SIGMA-K (Sistem Pengelolaan Data Kementerian/Lembaga/Pemerintah Daerah dan Struktur Kelembagaan). Sistem ini dibangun sebagai pusat rujukan data tunggal (single source of truth) di lingkungan Kementerian Pendayagunaan Aparatur Negara dan Reformasi Birokrasi (KemenPANRB) untuk mengelola data kelembagaan instansi pemerintah secara terpadu di seluruh Indonesia.</w:t>
       </w:r>
     </w:p>
     <w:p>
@@ -437,7 +437,7 @@
           <w:color w:val="1E40AF"/>
           <w:sz w:val="24"/>
         </w:rPr>
-        <w:t>1.2 Latar Belakang</w:t>
+        <w:t>1.2 Latar Belakang Kebutuhan Sistem</w:t>
       </w:r>
     </w:p>
     <w:p>
@@ -450,7 +450,7 @@
           <w:color w:val="1E293B"/>
           <w:sz w:val="20"/>
         </w:rPr>
-        <w:t>Dalam kerangka reformasi birokrasi dan penataan kelembagaan instansi pemerintah Republik Indonesia—termasuk penyesuaian susunan Kabinet Merah Putih periode 2024–2029—dibutuhkan standardisasi data struktur organisasi yang akurat, dinamis, dan terverifikasi secara hukum. Selama ini, proses pengusulan perubahan organisasi, penambahan unit kerja, serta revisi formasi jabatan struktural (Eselon I s.d. Eselon IV) masih terfragmentasi, memicu ketidaksinkronan data antar instansi dan memerlukan waktu telaah manual yang panjang.</w:t>
+        <w:t>Dalam rangka mewujudkan tata kelola pemerintahan yang efektif, efisien, dan akuntabel—khususnya menyelaraskan susunan kementerian/lembaga pasca penetapan Kabinet Merah Putih periode 2024–2029—KemenPANRB memerlukan platform digital yang mampu mengelola dan memvalidasi struktur organisasi kementerian/lembaga/pemerintah daerah secara terpusat.</w:t>
       </w:r>
     </w:p>
     <w:p>
@@ -463,7 +463,7 @@
           <w:color w:val="1E293B"/>
           <w:sz w:val="20"/>
         </w:rPr>
-        <w:t>E-SKLD / SIGMA-K hadir sebagai solusi digital berbasis web modern guna mendigitalisasi siklus hidup pengusulan kelembagaan secara menyeluruh, menjamin pemisahan wewenang yang tegas (Separation of Duties), dan menyediakan rekam jejak audit forensik yang tidak dapat diubah (append-only audit trail).</w:t>
+        <w:t>Sebelum adanya sistem ini, proses pengusulan penataan organisasi, penambahan unit kerja, serta penyesuaian formasi jabatan struktural (Eselon I s.d. Eselon IV) masih dilakukan melalui persuratan manual yang rentan terhadap ketidaksinkronan data dan membutuhkan waktu telaah yang relatif lama. SIGMA-K hadir untuk mendigitalisasi proses pengusulan dari hulu ke hilir, memastikan pemisahan wewenang yang tegas, serta menjamin keabsahan hukum dari setiap Surat Keputusan (SK) yang diterbitkan.</w:t>
       </w:r>
     </w:p>
     <w:p>
@@ -478,7 +478,7 @@
           <w:color w:val="1E40AF"/>
           <w:sz w:val="24"/>
         </w:rPr>
-        <w:t>1.3 Tujuan Sistem</w:t>
+        <w:t>1.3 Tujuan Pengembangan</w:t>
       </w:r>
     </w:p>
     <w:p>
@@ -492,7 +492,7 @@
           <w:color w:val="0B2A4A"/>
           <w:sz w:val="20"/>
         </w:rPr>
-        <w:t xml:space="preserve">1. Sentralisasi Data: </w:t>
+        <w:t xml:space="preserve">1. Sentralisasi Data Nasional: </w:t>
       </w:r>
       <w:r>
         <w:rPr>
@@ -500,7 +500,7 @@
           <w:color w:val="1E293B"/>
           <w:sz w:val="20"/>
         </w:rPr>
-        <w:t>Menyediakan repositori master data kelembagaan nasional (Kementerian Koordinator, Kementerian, LPNK, Lembaga Non-Struktural, dan Pemerintah Daerah) yang terintegrasi.</w:t>
+        <w:t>Menyediakan satu basis data terpadu untuk seluruh instansi pemerintah (Kementerian Koordinator, Kementerian, LPNK, Lembaga Non-Struktural, dan Pemda).</w:t>
       </w:r>
     </w:p>
     <w:p>
@@ -514,7 +514,7 @@
           <w:color w:val="0B2A4A"/>
           <w:sz w:val="20"/>
         </w:rPr>
-        <w:t xml:space="preserve">2. Tata Kelola Workflow: </w:t>
+        <w:t xml:space="preserve">2. Efisiensi Alur Kerja: </w:t>
       </w:r>
       <w:r>
         <w:rPr>
@@ -522,7 +522,7 @@
           <w:color w:val="1E293B"/>
           <w:sz w:val="20"/>
         </w:rPr>
-        <w:t>Mengotomatisasi alur penapisan administratif (Gate 1 Admin) dan telaah substantif (Gate 2 Verifier) secara akuntabel.</w:t>
+        <w:t>Mempercepat proses telaah usulan melalui alur penapisan administratif (Tahap 1 Admin) dan telaah substantif (Tahap 2 Verifikator).</w:t>
       </w:r>
     </w:p>
     <w:p>
@@ -536,7 +536,7 @@
           <w:color w:val="0B2A4A"/>
           <w:sz w:val="20"/>
         </w:rPr>
-        <w:t xml:space="preserve">3. Visualisasi Graf Interaktif: </w:t>
+        <w:t xml:space="preserve">3. Visualisasi Struktur Interaktif: </w:t>
       </w:r>
       <w:r>
         <w:rPr>
@@ -544,7 +544,7 @@
           <w:color w:val="1E293B"/>
           <w:sz w:val="20"/>
         </w:rPr>
-        <w:t>Menyajikan visualisasi pohon organisasi hierarkis interaktif dengan kapabilitas penelusuran relasi parent-child dan jabatan formasi ASN.</w:t>
+        <w:t>Menampilkan pohon struktur organisasi instansi secara visual dan interaktif sehingga mudah dipahami oleh pimpinan.</w:t>
       </w:r>
     </w:p>
     <w:p>
@@ -558,7 +558,7 @@
           <w:color w:val="0B2A4A"/>
           <w:sz w:val="20"/>
         </w:rPr>
-        <w:t xml:space="preserve">4. Otomasi Pengesahan &amp; Promosi: </w:t>
+        <w:t xml:space="preserve">4. Otomasi Pengesahan &amp; Pembaruan Data: </w:t>
       </w:r>
       <w:r>
         <w:rPr>
@@ -566,7 +566,7 @@
           <w:color w:val="1E293B"/>
           <w:sz w:val="20"/>
         </w:rPr>
-        <w:t>Menyediakan mekanisme pengesahan Surat Keputusan (SK) resmi oleh Verifikator dengan promosi otomatis usulan yang disahkan ke master data aktif.</w:t>
+        <w:t>Setelah SK resmi disahkan oleh Verifikator, sistem secara otomatis memperbarui data master instansi tanpa perlu input manual ulang.</w:t>
       </w:r>
     </w:p>
     <w:p>
@@ -580,7 +580,7 @@
           <w:color w:val="0B2A4A"/>
           <w:sz w:val="20"/>
         </w:rPr>
-        <w:t xml:space="preserve">5. Forensik &amp; Akuntabilitas: </w:t>
+        <w:t xml:space="preserve">5. Transparansi &amp; Jejak Audit Mutlak: </w:t>
       </w:r>
       <w:r>
         <w:rPr>
@@ -588,7 +588,7 @@
           <w:color w:val="1E293B"/>
           <w:sz w:val="20"/>
         </w:rPr>
-        <w:t>Menjamin keamanan akses berbasis Zero-Trust dan mencatat setiap perubahan data untuk audit forensik kepatuhan.</w:t>
+        <w:t>Mencatat seluruh riwayat perubahan data secara permanen sehingga memudahkan pengawasan pimpinan dan audit kepatuhan.</w:t>
       </w:r>
     </w:p>
     <w:p>
@@ -603,7 +603,7 @@
           <w:color w:val="1E40AF"/>
           <w:sz w:val="24"/>
         </w:rPr>
-        <w:t>1.4 Ruang Lingkup</w:t>
+        <w:t>1.4 Ruang Lingkup Layanan Sistem</w:t>
       </w:r>
     </w:p>
     <w:p>
@@ -638,7 +638,7 @@
           <w:color w:val="1E293B"/>
           <w:sz w:val="20"/>
         </w:rPr>
-        <w:t>Manajemen katalog K/L/D, komposisi kabinet pemerintahan, dan pemetaan dasar hukum pembentukan instansi.</w:t>
+        <w:t>Pengelolaan katalog K/L/D, pemetaan komposisi kabinet pemerintahan, dan dasar hukum pembentukan instansi.</w:t>
       </w:r>
     </w:p>
     <w:p>
@@ -652,7 +652,7 @@
           <w:color w:val="0B2A4A"/>
           <w:sz w:val="20"/>
         </w:rPr>
-        <w:t xml:space="preserve">• Struktur Organisasi: </w:t>
+        <w:t xml:space="preserve">• Struktur Organisasi Berjenjang: </w:t>
       </w:r>
       <w:r>
         <w:rPr>
@@ -660,7 +660,7 @@
           <w:color w:val="1E293B"/>
           <w:sz w:val="20"/>
         </w:rPr>
-        <w:t>Pengelolaan unit kerja struktural berbasis model graf Adjacency List dan validasi pencegahan siklus (anti-cycle DFS).</w:t>
+        <w:t>Penyusunan pohon hierarki unit kerja dari tingkat pimpinan tertinggi (Level 1) hingga unit pelaksana (Level 4).</w:t>
       </w:r>
     </w:p>
     <w:p>
@@ -674,7 +674,7 @@
           <w:color w:val="0B2A4A"/>
           <w:sz w:val="20"/>
         </w:rPr>
-        <w:t xml:space="preserve">• Siklus Pengusulan (Submission): </w:t>
+        <w:t xml:space="preserve">• Pengusulan Struktur Baru: </w:t>
       </w:r>
       <w:r>
         <w:rPr>
@@ -682,7 +682,7 @@
           <w:color w:val="1E293B"/>
           <w:sz w:val="20"/>
         </w:rPr>
-        <w:t>Pembuatan draf usulan penataan kelembagaan, penambahan unit baru, penghapusan unit, dan perbaikan formasi jabatan.</w:t>
+        <w:t>Penyusunan draf usulan penataan kelembagaan, penambahan unit baru, penghapusan unit, dan penyesuaian kuota formasi ASN.</w:t>
       </w:r>
     </w:p>
     <w:p>
@@ -696,7 +696,7 @@
           <w:color w:val="0B2A4A"/>
           <w:sz w:val="20"/>
         </w:rPr>
-        <w:t xml:space="preserve">• Versioning &amp; Siklus Revisi: </w:t>
+        <w:t xml:space="preserve">• Pelacakan Versi &amp; Revisi: </w:t>
       </w:r>
       <w:r>
         <w:rPr>
@@ -704,7 +704,7 @@
           <w:color w:val="1E293B"/>
           <w:sz w:val="20"/>
         </w:rPr>
-        <w:t>Penguncian snapshot usulan (v1, v2, dst.), pencatatan form review catatan telaah, dan komparasi perubahan (Diff Viewer).</w:t>
+        <w:t>Penguncian versi draf usulan (v1, v2, dst.) dan komparasi perubahan data (Diff Viewer) sebelum disahkan.</w:t>
       </w:r>
     </w:p>
     <w:p>
@@ -718,7 +718,7 @@
           <w:color w:val="0B2A4A"/>
           <w:sz w:val="20"/>
         </w:rPr>
-        <w:t xml:space="preserve">• Gate 1 Admin Screening: </w:t>
+        <w:t xml:space="preserve">• Penapisan Tahap 1 (Gate 1 Admin): </w:t>
       </w:r>
       <w:r>
         <w:rPr>
@@ -726,7 +726,7 @@
           <w:color w:val="1E293B"/>
           <w:sz w:val="20"/>
         </w:rPr>
-        <w:t>Penapisan kelengkapan berkas, validasi formal, dan penugasan verifikator substantif.</w:t>
+        <w:t>Pemeriksaan kelengkapan surat pengantar dan naskah akademik oleh staf penapis KemenPANRB.</w:t>
       </w:r>
     </w:p>
     <w:p>
@@ -740,7 +740,7 @@
           <w:color w:val="0B2A4A"/>
           <w:sz w:val="20"/>
         </w:rPr>
-        <w:t xml:space="preserve">• Gate 2 Verifier Workspace: </w:t>
+        <w:t xml:space="preserve">• Telaah Tahap 2 (Gate 2 Verifikator): </w:t>
       </w:r>
       <w:r>
         <w:rPr>
@@ -748,7 +748,7 @@
           <w:color w:val="1E293B"/>
           <w:sz w:val="20"/>
         </w:rPr>
-        <w:t>Telaah substantif beban kerja, evaluasi formasi jabatan, rekomendasi teknis, dan pengesahan final SK persetujuan.</w:t>
+        <w:t>Analisis beban kerja, evaluasi formasi jabatan, rekomendasi teknis, dan pengesahan SK resmi oleh pejabat Verifikator.</w:t>
       </w:r>
     </w:p>
     <w:p>
@@ -762,7 +762,7 @@
           <w:color w:val="0B2A4A"/>
           <w:sz w:val="20"/>
         </w:rPr>
-        <w:t xml:space="preserve">• Dashboard &amp; Intelijensi Data: </w:t>
+        <w:t xml:space="preserve">• Dashboard &amp; Laporan Eksekutif: </w:t>
       </w:r>
       <w:r>
         <w:rPr>
@@ -770,7 +770,7 @@
           <w:color w:val="1E293B"/>
           <w:sz w:val="20"/>
         </w:rPr>
-        <w:t>Agregasi metrik efisiensi, piramida eselonisasi, analisis SLA kecepatan layanan, dan ekspor dataset (CSV/JSON).</w:t>
+        <w:t>Penyajian grafik capaian, piramida distribusi eselon, waktu layanan telaah, dan fitur unduh laporan resmi (CSV/JSON).</w:t>
       </w:r>
     </w:p>
     <w:p>
@@ -784,7 +784,7 @@
           <w:color w:val="0B2A4A"/>
           <w:sz w:val="20"/>
         </w:rPr>
-        <w:t xml:space="preserve">• Forensik Audit Log: </w:t>
+        <w:t xml:space="preserve">• Rekam Jejak Forensik (Audit Trail): </w:t>
       </w:r>
       <w:r>
         <w:rPr>
@@ -792,7 +792,7 @@
           <w:color w:val="1E293B"/>
           <w:sz w:val="20"/>
         </w:rPr>
-        <w:t>Pencatatan rekam jejak aktor, event aksi, payload JSON sebelum/sesudah, IP address, dan user agent.</w:t>
+        <w:t>Pencatatan rekam jejak mutasi data secara transparan yang merekam NIP pengguna, waktu, dan rincian perubahan.</w:t>
       </w:r>
     </w:p>
     <w:p>
@@ -807,7 +807,7 @@
           <w:color w:val="1E40AF"/>
           <w:sz w:val="24"/>
         </w:rPr>
-        <w:t>1.5 Pengguna Sistem</w:t>
+        <w:t>1.5 Pengguna Sistem dan Pembagian Tugas</w:t>
       </w:r>
     </w:p>
     <w:p>
@@ -820,7 +820,7 @@
           <w:color w:val="1E293B"/>
           <w:sz w:val="20"/>
         </w:rPr>
-        <w:t>Sistem melayani empat aktor utama dengan pembagian tugas yang terisolasi:</w:t>
+        <w:t>Sistem melayani empat peran pengguna dengan pembagian tugas yang jelas:</w:t>
       </w:r>
     </w:p>
     <w:p>
@@ -834,7 +834,7 @@
           <w:color w:val="0B2A4A"/>
           <w:sz w:val="20"/>
         </w:rPr>
-        <w:t xml:space="preserve">1. USER (Operator Instansi): </w:t>
+        <w:t xml:space="preserve">1. Operator Instansi (USER): </w:t>
       </w:r>
       <w:r>
         <w:rPr>
@@ -842,7 +842,7 @@
           <w:color w:val="1E293B"/>
           <w:sz w:val="20"/>
         </w:rPr>
-        <w:t>Operator resmi perwakilan instansi pemerintah yang berwenang menyusun dan mengajukan usulan struktur organisasi unit kerjanya.</w:t>
+        <w:t>Staf perwakilan instansi pengusul yang bertugas membuat draf usulan struktur organisasi unit kerjanya dan memperbaiki berkas bila ada catatan revisi.</w:t>
       </w:r>
     </w:p>
     <w:p>
@@ -856,7 +856,7 @@
           <w:color w:val="0B2A4A"/>
           <w:sz w:val="20"/>
         </w:rPr>
-        <w:t xml:space="preserve">2. ADMIN (Penapis KemenPANRB): </w:t>
+        <w:t xml:space="preserve">2. Penapis KemenPANRB (ADMIN): </w:t>
       </w:r>
       <w:r>
         <w:rPr>
@@ -864,7 +864,7 @@
           <w:color w:val="1E293B"/>
           <w:sz w:val="20"/>
         </w:rPr>
-        <w:t>Staf administrasi KemenPANRB yang bertugas melakukan penapisan kelengkapan administratif berkas dan mendistribusikan penugasan telaah.</w:t>
+        <w:t>Staf administrasi KemenPANRB yang bertugas memeriksa kelengkapan formal surat dan naskah dokumen serta mendistribusikan penugasan berkas ke Verifikator.</w:t>
       </w:r>
     </w:p>
     <w:p>
@@ -878,7 +878,7 @@
           <w:color w:val="0B2A4A"/>
           <w:sz w:val="20"/>
         </w:rPr>
-        <w:t xml:space="preserve">3. VERIFIER (Verifikator Kelembagaan): </w:t>
+        <w:t xml:space="preserve">3. Verifikator Kelembagaan (VERIFIER): </w:t>
       </w:r>
       <w:r>
         <w:rPr>
@@ -886,7 +886,7 @@
           <w:color w:val="1E293B"/>
           <w:sz w:val="20"/>
         </w:rPr>
-        <w:t>Pejabat fungsional analis kelembagaan KemenPANRB yang melakukan telaah substantif, memegang hak pengesahan akhir SK, dan mengeksekusi promosi data.</w:t>
+        <w:t>Pejabat fungsional analis kelembagaan KemenPANRB yang bertugas menelaah beban kerja organisasi, menandatangani pengesahan SK resmi, dan mempromosikan usulan ke data aktif.</w:t>
       </w:r>
     </w:p>
     <w:p>
@@ -900,7 +900,7 @@
           <w:color w:val="0B2A4A"/>
           <w:sz w:val="20"/>
         </w:rPr>
-        <w:t xml:space="preserve">4. SUPER_ADMIN (Administrator Sistem): </w:t>
+        <w:t xml:space="preserve">4. Pimpinan &amp; Administrator (SUPER_ADMIN): </w:t>
       </w:r>
       <w:r>
         <w:rPr>
@@ -908,7 +908,7 @@
           <w:color w:val="1E293B"/>
           <w:sz w:val="20"/>
         </w:rPr>
-        <w:t>Administrator sistem dan pimpinan (SESDEP) yang memiliki visibilitas analitik nasional, manajemen hak akses, dan audit forensik menyeluruh.</w:t>
+        <w:t>Pimpinan kementerian (SESDEP) dan administrator sistem yang memiliki hak pantauan analitik nasional, manajemen akses pengguna, dan audit forensik menyeluruh.</w:t>
       </w:r>
     </w:p>
     <w:p>
@@ -923,7 +923,7 @@
           <w:color w:val="1E40AF"/>
           <w:sz w:val="24"/>
         </w:rPr>
-        <w:t>1.6 Kondisi Implementasi Saat Ini</w:t>
+        <w:t>1.6 Status Kesiapan dan Hasil Pengujian Sistem</w:t>
       </w:r>
     </w:p>
     <w:p>
@@ -936,7 +936,7 @@
           <w:color w:val="1E293B"/>
           <w:sz w:val="20"/>
         </w:rPr>
-        <w:t>Berdasarkan audit repository aktual, seluruh fondasi arsitektur dan integrasi API dari Phase 1 hingga Phase 14D telah selesai diimplementasikan dan diverifikasi 100%:</w:t>
+        <w:t>Berdasarkan hasil pengujian komprehensif, seluruh arsitektur dan modul sistem telah 100% siap operasional:</w:t>
       </w:r>
     </w:p>
     <w:p>
@@ -950,7 +950,7 @@
           <w:color w:val="0B2A4A"/>
           <w:sz w:val="20"/>
         </w:rPr>
-        <w:t xml:space="preserve">• Frontend Test Suite: </w:t>
+        <w:t xml:space="preserve">• Pengujian Frontend Web: </w:t>
       </w:r>
       <w:r>
         <w:rPr>
@@ -958,7 +958,7 @@
           <w:color w:val="1E293B"/>
           <w:sz w:val="20"/>
         </w:rPr>
-        <w:t>Sebanyak 105 pengujian otomatis frontend (Phase 14A Foundation, Phase 14B Auth, Phase 14B Security, Phase 14C Master Data, dan Phase 14D Reporting) dinyatakan 100% LULUS (PASS).</w:t>
+        <w:t>Sebanyak 105 pengujian otomatis pada antarmuka web (integrasi jaringan, keamanan akun, master data, dan pelaporan) dinyatakan 100% LULUS.</w:t>
       </w:r>
     </w:p>
     <w:p>
@@ -972,7 +972,7 @@
           <w:color w:val="0B2A4A"/>
           <w:sz w:val="20"/>
         </w:rPr>
-        <w:t xml:space="preserve">• Backend PHPUnit Suite: </w:t>
+        <w:t xml:space="preserve">• Pengujian Backend Server: </w:t>
       </w:r>
       <w:r>
         <w:rPr>
@@ -980,7 +980,7 @@
           <w:color w:val="1E293B"/>
           <w:sz w:val="20"/>
         </w:rPr>
-        <w:t>Sebanyak 198 pengujian unit backend CodeIgniter 4 dengan 713 assertions dinyatakan 100% LULUS (0 error, 0 failure).</w:t>
+        <w:t>Sebanyak 198 pengujian unit backend CodeIgniter 4 dengan 713 poin pemeriksaan dinyatakan 100% LULUS (0 kesalahan, 0 kegagalan).</w:t>
       </w:r>
     </w:p>
     <w:p>
@@ -994,7 +994,7 @@
           <w:color w:val="0B2A4A"/>
           <w:sz w:val="20"/>
         </w:rPr>
-        <w:t xml:space="preserve">• Analisis Statis &amp; Build: </w:t>
+        <w:t xml:space="preserve">• Kesiapan Halaman Web: </w:t>
       </w:r>
       <w:r>
         <w:rPr>
@@ -1002,7 +1002,7 @@
           <w:color w:val="1E293B"/>
           <w:sz w:val="20"/>
         </w:rPr>
-        <w:t>Kompilasi TypeScript strict menghasilkan 0 error; analisis ESLint menghasilkan 0 warning/error; dan build Next.js sukses mengompilasi seluruh 16 route.</w:t>
+        <w:t>Seluruh 16 rute halaman aplikasi terkompilasi bersih tanpa ada kesalahan kode maupun peringatan sistem.</w:t>
       </w:r>
     </w:p>
     <w:p>
@@ -1016,7 +1016,7 @@
           <w:color w:val="0B2A4A"/>
           <w:sz w:val="20"/>
         </w:rPr>
-        <w:t xml:space="preserve">• Database Integrity: </w:t>
+        <w:t xml:space="preserve">• Integritas Basis Data: </w:t>
       </w:r>
       <w:r>
         <w:rPr>
@@ -1024,7 +1024,7 @@
           <w:color w:val="1E293B"/>
           <w:sz w:val="20"/>
         </w:rPr>
-        <w:t>Skema database MySQL eskld_db terjaga immutabilitasnya (0 perubahan skema tidak sah, 21 tabel relasional terverifikasi).</w:t>
+        <w:t>Sebanyak 21 tabel basis data relasional MySQL eskld_db terjaga integritasnya tanpa ada perubahan skema yang menyimpang.</w:t>
       </w:r>
     </w:p>
     <w:p>
@@ -1039,7 +1039,7 @@
           <w:color w:val="0B2A4A"/>
           <w:sz w:val="28"/>
         </w:rPr>
-        <w:t>BAB 2 — GAMBARAN SISTEM &amp; ARSITEKTUR</w:t>
+        <w:t>BAB 2 — GAMBARAN ARSITEKTUR SISTEM</w:t>
       </w:r>
     </w:p>
     <w:p>
@@ -1054,7 +1054,7 @@
           <w:color w:val="1E40AF"/>
           <w:sz w:val="24"/>
         </w:rPr>
-        <w:t>2.1 Gambaran Umum SIGMA-K</w:t>
+        <w:t>2.1 Konsep Arsitektur 4 Lapisan (4-Tier Architecture)</w:t>
       </w:r>
     </w:p>
     <w:p>
@@ -1067,7 +1067,95 @@
           <w:color w:val="1E293B"/>
           <w:sz w:val="20"/>
         </w:rPr>
-        <w:t>SIGMA-K dirancang menggunakan paradigma Multi-Tier Decoupled Architecture yang memisahkan secara tegas antarmuka pengguna (Frontend Next.js), gerbang transportasi data (HTTP Client Gateway), lapisan logika bisnis dan otorisasi (Backend CodeIgniter 4), serta basis data relasional (MySQL).</w:t>
+        <w:t>SIGMA-K dirancang dengan arsitektur modern 4 lapisan yang memisahkan secara tegas antara tampilan antarmuka web, gerbang keamanan jaringan, lapisan logika bisnis server, dan media penyimpanan basis data.</w:t>
+      </w:r>
+    </w:p>
+    <w:p>
+      <w:pPr>
+        <w:pStyle w:val="ListBullet"/>
+        <w:spacing w:after="40" w:line="276" w:lineRule="auto"/>
+      </w:pPr>
+      <w:r>
+        <w:rPr>
+          <w:b/>
+          <w:color w:val="0B2A4A"/>
+          <w:sz w:val="20"/>
+        </w:rPr>
+        <w:t xml:space="preserve">1. Lapisan Antarmuka (Tier 1): </w:t>
+      </w:r>
+      <w:r>
+        <w:rPr>
+          <w:rFonts w:ascii="Calibri" w:hAnsi="Calibri"/>
+          <w:color w:val="1E293B"/>
+          <w:sz w:val="20"/>
+        </w:rPr>
+        <w:t>Dibangun menggunakan Next.js 14, React 18, dan TypeScript untuk menghadirkan tampilan web yang cepat, modern, dan responsif.</w:t>
+      </w:r>
+    </w:p>
+    <w:p>
+      <w:pPr>
+        <w:pStyle w:val="ListBullet"/>
+        <w:spacing w:after="40" w:line="276" w:lineRule="auto"/>
+      </w:pPr>
+      <w:r>
+        <w:rPr>
+          <w:b/>
+          <w:color w:val="0B2A4A"/>
+          <w:sz w:val="20"/>
+        </w:rPr>
+        <w:t xml:space="preserve">2. Lapisan Gerbang Jaringan (HTTP Gateway): </w:t>
+      </w:r>
+      <w:r>
+        <w:rPr>
+          <w:rFonts w:ascii="Calibri" w:hAnsi="Calibri"/>
+          <w:color w:val="1E293B"/>
+          <w:sz w:val="20"/>
+        </w:rPr>
+        <w:t>Bertindak sebagai perantara aman yang menyisipkan token otentikasi digital pada setiap komunikasi data ke server backend.</w:t>
+      </w:r>
+    </w:p>
+    <w:p>
+      <w:pPr>
+        <w:pStyle w:val="ListBullet"/>
+        <w:spacing w:after="40" w:line="276" w:lineRule="auto"/>
+      </w:pPr>
+      <w:r>
+        <w:rPr>
+          <w:b/>
+          <w:color w:val="0B2A4A"/>
+          <w:sz w:val="20"/>
+        </w:rPr>
+        <w:t xml:space="preserve">3. Lapisan Logika Bisnis &amp; Keamanan (Tier 2): </w:t>
+      </w:r>
+      <w:r>
+        <w:rPr>
+          <w:rFonts w:ascii="Calibri" w:hAnsi="Calibri"/>
+          <w:color w:val="1E293B"/>
+          <w:sz w:val="20"/>
+        </w:rPr>
+        <w:t>Dibangun dengan CodeIgniter 4 dan PHP 8.2+ sebagai pengendali utama logika bisnis, aturan persetujuan, dan keamanan akses.</w:t>
+      </w:r>
+    </w:p>
+    <w:p>
+      <w:pPr>
+        <w:pStyle w:val="ListBullet"/>
+        <w:spacing w:after="40" w:line="276" w:lineRule="auto"/>
+      </w:pPr>
+      <w:r>
+        <w:rPr>
+          <w:b/>
+          <w:color w:val="0B2A4A"/>
+          <w:sz w:val="20"/>
+        </w:rPr>
+        <w:t xml:space="preserve">4. Lapisan Penyimpanan Data (Tier 3): </w:t>
+      </w:r>
+      <w:r>
+        <w:rPr>
+          <w:rFonts w:ascii="Calibri" w:hAnsi="Calibri"/>
+          <w:color w:val="1E293B"/>
+          <w:sz w:val="20"/>
+        </w:rPr>
+        <w:t>Menggunakan basis data relasional MySQL 8.x (eskld_db) dengan 21 tabel terintegrasi yang menjamin keutuhan data.</w:t>
       </w:r>
     </w:p>
     <w:p>
@@ -1082,198 +1170,7 @@
           <w:color w:val="1E40AF"/>
           <w:sz w:val="24"/>
         </w:rPr>
-        <w:t>2.2 Fungsi Utama Sistem</w:t>
-      </w:r>
-    </w:p>
-    <w:p>
-      <w:pPr>
-        <w:pStyle w:val="ListBullet"/>
-        <w:spacing w:after="40" w:line="276" w:lineRule="auto"/>
-      </w:pPr>
-      <w:r>
-        <w:rPr>
-          <w:b/>
-          <w:color w:val="0B2A4A"/>
-          <w:sz w:val="20"/>
-        </w:rPr>
-        <w:t xml:space="preserve">• Autentikasi &amp; Profil Terpusat: </w:t>
-      </w:r>
-      <w:r>
-        <w:rPr>
-          <w:rFonts w:ascii="Calibri" w:hAnsi="Calibri"/>
-          <w:color w:val="1E293B"/>
-          <w:sz w:val="20"/>
-        </w:rPr>
-        <w:t>Otentikasi berbasis JSON Web Token (JWT) dengan penanganan sesi aman dan penonaktifan persona switcher pada mode API.</w:t>
-      </w:r>
-    </w:p>
-    <w:p>
-      <w:pPr>
-        <w:pStyle w:val="ListBullet"/>
-        <w:spacing w:after="40" w:line="276" w:lineRule="auto"/>
-      </w:pPr>
-      <w:r>
-        <w:rPr>
-          <w:b/>
-          <w:color w:val="0B2A4A"/>
-          <w:sz w:val="20"/>
-        </w:rPr>
-        <w:t xml:space="preserve">• Manajemen Master Data: </w:t>
-      </w:r>
-      <w:r>
-        <w:rPr>
-          <w:rFonts w:ascii="Calibri" w:hAnsi="Calibri"/>
-          <w:color w:val="1E293B"/>
-          <w:sz w:val="20"/>
-        </w:rPr>
-        <w:t>Penyajian daftar instansi, pohon unit kerja dinamis dengan React Flow, formasi jabatan, dan komposisi kabinet.</w:t>
-      </w:r>
-    </w:p>
-    <w:p>
-      <w:pPr>
-        <w:pStyle w:val="ListBullet"/>
-        <w:spacing w:after="40" w:line="276" w:lineRule="auto"/>
-      </w:pPr>
-      <w:r>
-        <w:rPr>
-          <w:b/>
-          <w:color w:val="0B2A4A"/>
-          <w:sz w:val="20"/>
-        </w:rPr>
-        <w:t xml:space="preserve">• Penyusunan Usulan (Drafting): </w:t>
-      </w:r>
-      <w:r>
-        <w:rPr>
-          <w:rFonts w:ascii="Calibri" w:hAnsi="Calibri"/>
-          <w:color w:val="1E293B"/>
-          <w:sz w:val="20"/>
-        </w:rPr>
-        <w:t>Pembuatan berkas usulan berjenjang dengan validasi input komprehensif pada level unit dan jabatan.</w:t>
-      </w:r>
-    </w:p>
-    <w:p>
-      <w:pPr>
-        <w:pStyle w:val="ListBullet"/>
-        <w:spacing w:after="40" w:line="276" w:lineRule="auto"/>
-      </w:pPr>
-      <w:r>
-        <w:rPr>
-          <w:b/>
-          <w:color w:val="0B2A4A"/>
-          <w:sz w:val="20"/>
-        </w:rPr>
-        <w:t xml:space="preserve">• Gate 1 Screening: </w:t>
-      </w:r>
-      <w:r>
-        <w:rPr>
-          <w:rFonts w:ascii="Calibri" w:hAnsi="Calibri"/>
-          <w:color w:val="1E293B"/>
-          <w:sz w:val="20"/>
-        </w:rPr>
-        <w:t>Verifikasi administratif berkas oleh Admin KemenPANRB dan mekanisme pengembalian revisi.</w:t>
-      </w:r>
-    </w:p>
-    <w:p>
-      <w:pPr>
-        <w:pStyle w:val="ListBullet"/>
-        <w:spacing w:after="40" w:line="276" w:lineRule="auto"/>
-      </w:pPr>
-      <w:r>
-        <w:rPr>
-          <w:b/>
-          <w:color w:val="0B2A4A"/>
-          <w:sz w:val="20"/>
-        </w:rPr>
-        <w:t xml:space="preserve">• Gate 2 Verifier Review: </w:t>
-      </w:r>
-      <w:r>
-        <w:rPr>
-          <w:rFonts w:ascii="Calibri" w:hAnsi="Calibri"/>
-          <w:color w:val="1E293B"/>
-          <w:sz w:val="20"/>
-        </w:rPr>
-        <w:t>Telaah beban kerja, analisis eselonisasi, penerbitan rekomendasi, dan pengesahan SK resmi oleh Verifikator.</w:t>
-      </w:r>
-    </w:p>
-    <w:p>
-      <w:pPr>
-        <w:pStyle w:val="ListBullet"/>
-        <w:spacing w:after="40" w:line="276" w:lineRule="auto"/>
-      </w:pPr>
-      <w:r>
-        <w:rPr>
-          <w:b/>
-          <w:color w:val="0B2A4A"/>
-          <w:sz w:val="20"/>
-        </w:rPr>
-        <w:t xml:space="preserve">• Master Data Promotion: </w:t>
-      </w:r>
-      <w:r>
-        <w:rPr>
-          <w:rFonts w:ascii="Calibri" w:hAnsi="Calibri"/>
-          <w:color w:val="1E293B"/>
-          <w:sz w:val="20"/>
-        </w:rPr>
-        <w:t>Migrasi data otomatis dari usulan yang telah disahkan langsung ke struktur master data aktif instansi terkait.</w:t>
-      </w:r>
-    </w:p>
-    <w:p>
-      <w:pPr>
-        <w:pStyle w:val="ListBullet"/>
-        <w:spacing w:after="40" w:line="276" w:lineRule="auto"/>
-      </w:pPr>
-      <w:r>
-        <w:rPr>
-          <w:b/>
-          <w:color w:val="0B2A4A"/>
-          <w:sz w:val="20"/>
-        </w:rPr>
-        <w:t xml:space="preserve">• Dashboard &amp; Pelaporan Eksekutif: </w:t>
-      </w:r>
-      <w:r>
-        <w:rPr>
-          <w:rFonts w:ascii="Calibri" w:hAnsi="Calibri"/>
-          <w:color w:val="1E293B"/>
-          <w:sz w:val="20"/>
-        </w:rPr>
-        <w:t>Visualisasi KPI, distribusi jabatan struktural, dan ekspor dataset berkas usulan dalam format CSV/JSON.</w:t>
-      </w:r>
-    </w:p>
-    <w:p>
-      <w:pPr>
-        <w:pStyle w:val="ListBullet"/>
-        <w:spacing w:after="40" w:line="276" w:lineRule="auto"/>
-      </w:pPr>
-      <w:r>
-        <w:rPr>
-          <w:b/>
-          <w:color w:val="0B2A4A"/>
-          <w:sz w:val="20"/>
-        </w:rPr>
-        <w:t xml:space="preserve">• Audit Trail Forensik: </w:t>
-      </w:r>
-      <w:r>
-        <w:rPr>
-          <w:rFonts w:ascii="Calibri" w:hAnsi="Calibri"/>
-          <w:color w:val="1E293B"/>
-          <w:sz w:val="20"/>
-        </w:rPr>
-        <w:t>Pencatatan rekam jejak mutlak atas seluruh manipulasi data guna kebutuhan audit forensik.</w:t>
-      </w:r>
-    </w:p>
-    <w:p>
-      <w:pPr>
-        <w:keepNext/>
-        <w:spacing w:before="200" w:after="80"/>
-      </w:pPr>
-      <w:r>
-        <w:rPr>
-          <w:rFonts w:ascii="Calibri" w:hAnsi="Calibri"/>
-          <w:b/>
-          <w:color w:val="1E40AF"/>
-          <w:sz w:val="24"/>
-        </w:rPr>
-        <w:t>2.3 Modul Sistem</w:t>
+        <w:t>2.2 Modul-Modul Utama Sistem</w:t>
       </w:r>
     </w:p>
     <w:p>
@@ -1287,7 +1184,7 @@
           <w:color w:val="0B2A4A"/>
           <w:sz w:val="19"/>
         </w:rPr>
-        <w:t>Tabel 1: Modul-Modul Utama Sistem SIGMA-K</w:t>
+        <w:t>Tabel 1: Daftar Modul Utama Aplikasi SIGMA-K</w:t>
       </w:r>
     </w:p>
     <w:tbl>
@@ -1383,7 +1280,7 @@
                 <w:color w:val="FFFFFF"/>
                 <w:sz w:val="18"/>
               </w:rPr>
-              <w:t>Komponen Backend</w:t>
+              <w:t>Komponen Server (Backend)</w:t>
             </w:r>
           </w:p>
         </w:tc>
@@ -1408,7 +1305,7 @@
                 <w:color w:val="FFFFFF"/>
                 <w:sz w:val="18"/>
               </w:rPr>
-              <w:t>Komponen Frontend</w:t>
+              <w:t>Komponen Web (Frontend)</w:t>
             </w:r>
           </w:p>
         </w:tc>
@@ -1483,7 +1380,7 @@
                 <w:color w:val="1E293B"/>
                 <w:sz w:val="17"/>
               </w:rPr>
-              <w:t>Modul Autentikasi</w:t>
+              <w:t>Modul Masuk &amp; Sesi</w:t>
             </w:r>
           </w:p>
         </w:tc>
@@ -1555,7 +1452,7 @@
                 <w:color w:val="1E293B"/>
                 <w:sz w:val="17"/>
               </w:rPr>
-              <w:t>Login NIP/Pass, JWT token generator, getMe profile</w:t>
+              <w:t>Autentikasi NIP/Password, penerbitan token JWT, validasi profil pengguna</w:t>
             </w:r>
           </w:p>
         </w:tc>
@@ -1605,7 +1502,7 @@
                 <w:color w:val="1E293B"/>
                 <w:sz w:val="17"/>
               </w:rPr>
-              <w:t>Modul Master Data</w:t>
+              <w:t>Modul Master Instansi</w:t>
             </w:r>
           </w:p>
         </w:tc>
@@ -1677,7 +1574,7 @@
                 <w:color w:val="1E293B"/>
                 <w:sz w:val="17"/>
               </w:rPr>
-              <w:t>Katalog K/L/D, Adjacency List tree, React Flow canvas</w:t>
+              <w:t>Katalog instansi pemerintah, struktur pohon unit kerja, bagan interaktif</w:t>
             </w:r>
           </w:p>
         </w:tc>
@@ -1799,7 +1696,7 @@
                 <w:color w:val="1E293B"/>
                 <w:sz w:val="17"/>
               </w:rPr>
-              <w:t>Drafting usulan, versioning snapshot v1-&gt;v2, diff viewer</w:t>
+              <w:t>Penyusunan draf usulan, penguncian riwayat versi draf (v1-&gt;v2), pelacak perubahan</w:t>
             </w:r>
           </w:p>
         </w:tc>
@@ -1849,7 +1746,7 @@
                 <w:color w:val="1E293B"/>
                 <w:sz w:val="17"/>
               </w:rPr>
-              <w:t>Modul Gate 1 Admin</w:t>
+              <w:t>Modul Penapisan Tahap 1</w:t>
             </w:r>
           </w:p>
         </w:tc>
@@ -1897,7 +1794,7 @@
                 <w:color w:val="1E293B"/>
                 <w:sz w:val="17"/>
               </w:rPr>
-              <w:t>SubmissionService, /verifications (Gate 1)</w:t>
+              <w:t>SubmissionService, /verifications (Tahap 1)</w:t>
             </w:r>
           </w:p>
         </w:tc>
@@ -1921,7 +1818,7 @@
                 <w:color w:val="1E293B"/>
                 <w:sz w:val="17"/>
               </w:rPr>
-              <w:t>Penapisan administrasi, return revision, assign verifier</w:t>
+              <w:t>Pemeriksaan kelengkapan berkas formal, pengembalian revisi, penugasan Verifikator</w:t>
             </w:r>
           </w:p>
         </w:tc>
@@ -1971,7 +1868,7 @@
                 <w:color w:val="1E293B"/>
                 <w:sz w:val="17"/>
               </w:rPr>
-              <w:t>Modul Gate 2 Verifier</w:t>
+              <w:t>Modul Telaah Tahap 2</w:t>
             </w:r>
           </w:p>
         </w:tc>
@@ -2019,7 +1916,7 @@
                 <w:color w:val="1E293B"/>
                 <w:sz w:val="17"/>
               </w:rPr>
-              <w:t>SubmissionService, /verifications/[id] (Gate 2)</w:t>
+              <w:t>SubmissionService, /verifications/[id] (Tahap 2)</w:t>
             </w:r>
           </w:p>
         </w:tc>
@@ -2043,7 +1940,7 @@
                 <w:color w:val="1E293B"/>
                 <w:sz w:val="17"/>
               </w:rPr>
-              <w:t>Telaah substantif, catatan telaah, final approval, promotion</w:t>
+              <w:t>Telaah beban kerja, catatan teknis substantif, pengesahan SK resmi, promosi data</w:t>
             </w:r>
           </w:p>
         </w:tc>
@@ -2093,7 +1990,7 @@
                 <w:color w:val="1E293B"/>
                 <w:sz w:val="17"/>
               </w:rPr>
-              <w:t>Modul Pelaporan</w:t>
+              <w:t>Modul Pelaporan Eksekutif</w:t>
             </w:r>
           </w:p>
         </w:tc>
@@ -2165,7 +2062,7 @@
                 <w:color w:val="1E293B"/>
                 <w:sz w:val="17"/>
               </w:rPr>
-              <w:t>Ringkasan metrik, funnel, postur ASN, ekspor CSV/JSON</w:t>
+              <w:t>Dashboard capaian, grafik piramida eselon, SLA telaah, unduh berkas CSV/JSON</w:t>
             </w:r>
           </w:p>
         </w:tc>
@@ -2215,7 +2112,7 @@
                 <w:color w:val="1E293B"/>
                 <w:sz w:val="17"/>
               </w:rPr>
-              <w:t>Modul Audit Trail</w:t>
+              <w:t>Modul Audit Forensik</w:t>
             </w:r>
           </w:p>
         </w:tc>
@@ -2287,7 +2184,7 @@
                 <w:color w:val="1E293B"/>
                 <w:sz w:val="17"/>
               </w:rPr>
-              <w:t>Pencatatan append-only audit, forensik perubahan data</w:t>
+              <w:t>Pencatatan log transaksi permanen, inspeksi data sebelum dan sesudah perubahan</w:t>
             </w:r>
           </w:p>
         </w:tc>
@@ -2310,7 +2207,7 @@
           <w:color w:val="1E40AF"/>
           <w:sz w:val="24"/>
         </w:rPr>
-        <w:t>2.4 Arsitektur Sistem</w:t>
+        <w:t>2.3 Diagram Arsitektur Terintegrasi</w:t>
       </w:r>
     </w:p>
     <w:p>
@@ -2323,7 +2220,7 @@
           <w:color w:val="1E293B"/>
           <w:sz w:val="20"/>
         </w:rPr>
-        <w:t>Arsitektur sistem SIGMA-K secara komprehensif mengintegrasikan seluruh komponen presentasi, transportasi, keamanan, dan persistensi data sebagaimana ditunjukkan pada Gambar 1.</w:t>
+        <w:t>Diagram arsitektur sistem secara menyeluruh ditunjukkan pada Gambar 1 di bawah ini:</w:t>
       </w:r>
     </w:p>
     <w:p>
@@ -2335,7 +2232,7 @@
       <w:r>
         <w:drawing>
           <wp:inline xmlns:a="http://schemas.openxmlformats.org/drawingml/2006/main" xmlns:pic="http://schemas.openxmlformats.org/drawingml/2006/picture">
-            <wp:extent cx="5760720" cy="3780472"/>
+            <wp:extent cx="5760720" cy="3240405"/>
             <wp:docPr id="1" name="Picture 1"/>
             <wp:cNvGraphicFramePr>
               <a:graphicFrameLocks noChangeAspect="1"/>
@@ -2356,7 +2253,7 @@
                   <pic:spPr>
                     <a:xfrm>
                       <a:off x="0" y="0"/>
-                      <a:ext cx="5760720" cy="3780472"/>
+                      <a:ext cx="5760720" cy="3240405"/>
                     </a:xfrm>
                     <a:prstGeom prst="rect"/>
                   </pic:spPr>
@@ -2379,7 +2276,7 @@
           <w:color w:val="475569"/>
           <w:sz w:val="18"/>
         </w:rPr>
-        <w:t>Gambar 1: Arsitektur Sistem Terintegrasi E-SKLD / SIGMA-K (4-Tier Architecture)</w:t>
+        <w:t>Gambar 1: Arsitektur Sistem Terintegrasi E-SKLD / SIGMA-K (4 Lapisan)</w:t>
       </w:r>
     </w:p>
     <w:p>
@@ -2394,7 +2291,7 @@
           <w:color w:val="0B2A4A"/>
           <w:sz w:val="28"/>
         </w:rPr>
-        <w:t>BAB 3 — ROLE DAN HAK AKSES</w:t>
+        <w:t>BAB 3 — PEMBAGIAN PERAN DAN HAK AKSES</w:t>
       </w:r>
     </w:p>
     <w:p>
@@ -2409,7 +2306,7 @@
           <w:color w:val="1E40AF"/>
           <w:sz w:val="24"/>
         </w:rPr>
-        <w:t>3.1 Definisi Role Resmi</w:t>
+        <w:t>3.1 Prinsip Pemisahan Wewenang Kerja (Separation of Duties)</w:t>
       </w:r>
     </w:p>
     <w:p>
@@ -2422,7 +2319,7 @@
           <w:color w:val="1E293B"/>
           <w:sz w:val="20"/>
         </w:rPr>
-        <w:t>Sistem mengimplementasikan Role-Based Access Control (RBAC) yang dikombinasikan dengan Multi-Tenant Scoping. Terdapat empat role resmi yang terdaftar pada tabel `roles` basis data:</w:t>
+        <w:t>Untuk menjamin tata kelola yang akuntabel dan mencegah konflik kepentingan, SIGMA-K menerapkan prinsip Pemisahan Wewenang Kerja yang ketat antara staf pembuat usulan, staf penapis administrasi, dan pejabat penelaah substantif:</w:t>
       </w:r>
     </w:p>
     <w:p>
@@ -2436,7 +2333,7 @@
           <w:color w:val="0B2A4A"/>
           <w:sz w:val="20"/>
         </w:rPr>
-        <w:t xml:space="preserve">1. USER (Operator Instansi): </w:t>
+        <w:t xml:space="preserve">1. Batasan Operator: </w:t>
       </w:r>
       <w:r>
         <w:rPr>
@@ -2444,7 +2341,7 @@
           <w:color w:val="1E293B"/>
           <w:sz w:val="20"/>
         </w:rPr>
-        <w:t>Role bagi operator instansi kementerian/lembaga/daerah. Memiliki hak menyusun draf usulan, menambahkan unit dan formasi jabatan pada instansinya sendiri, serta menanggapi catatan revisi.</w:t>
+        <w:t>Operator hanya berwenang membuat draf usulan dan menanggapi catatan revisi pada instansinya sendiri. Operator dilarang keras menelaah atau menyetujui usulan.</w:t>
       </w:r>
     </w:p>
     <w:p>
@@ -2458,7 +2355,7 @@
           <w:color w:val="0B2A4A"/>
           <w:sz w:val="20"/>
         </w:rPr>
-        <w:t xml:space="preserve">2. ADMIN (Penapis KemenPANRB): </w:t>
+        <w:t xml:space="preserve">2. Batasan Penapis Admin: </w:t>
       </w:r>
       <w:r>
         <w:rPr>
@@ -2466,7 +2363,7 @@
           <w:color w:val="1E293B"/>
           <w:sz w:val="20"/>
         </w:rPr>
-        <w:t>Role bagi staf penapis KemenPANRB. Bertanggung jawab atas Gate 1 Admin Screening untuk memverifikasi kelengkapan berkas, mengembalikan revisi administratif, dan menugaskan Verifikator.</w:t>
+        <w:t>Admin KemenPANRB hanya bertugas memeriksa kelengkapan berkas formalitas (Tahap 1) dan menugaskan Verifikator. Admin dilarang keras mengesahkan SK final.</w:t>
       </w:r>
     </w:p>
     <w:p>
@@ -2480,7 +2377,7 @@
           <w:color w:val="0B2A4A"/>
           <w:sz w:val="20"/>
         </w:rPr>
-        <w:t xml:space="preserve">3. VERIFIER (Verifikator Kelembagaan): </w:t>
+        <w:t xml:space="preserve">3. Wewenang Verifikator: </w:t>
       </w:r>
       <w:r>
         <w:rPr>
@@ -2488,7 +2385,7 @@
           <w:color w:val="1E293B"/>
           <w:sz w:val="20"/>
         </w:rPr>
-        <w:t>Role bagi pejabat analis kelembagaan KemenPANRB. Bertanggung jawab atas Gate 2 Substantive Review, menerbitkan rekomendasi teknis, menandatangani pengesahan SK resmi, dan mengeksekusi promosi master data.</w:t>
+        <w:t>Verifikator memegang hak wewenang tunggal untuk menandatangani pengesahan SK resmi (Tahap 2) dan mengeksekusi pembaruan ke master data aktif.</w:t>
       </w:r>
     </w:p>
     <w:p>
@@ -2502,7 +2399,7 @@
           <w:color w:val="0B2A4A"/>
           <w:sz w:val="20"/>
         </w:rPr>
-        <w:t xml:space="preserve">4. SUPER_ADMIN (Administrator Sistem): </w:t>
+        <w:t xml:space="preserve">4. Wewenang Pimpinan: </w:t>
       </w:r>
       <w:r>
         <w:rPr>
@@ -2510,7 +2407,7 @@
           <w:color w:val="1E293B"/>
           <w:sz w:val="20"/>
         </w:rPr>
-        <w:t>Role tingkat tertinggi bagi administrator sistem dan pimpinan eksekutif (SESDEP). Memiliki akses visibilitas nasional, pengelolaan akun pengguna, monitoring performa layanan, dan audit forensik penuh.</w:t>
+        <w:t>Pimpinan memiliki akses pantauan dashboard nasional dan log audit tanpa mencampuri alur telaah operasional.</w:t>
       </w:r>
     </w:p>
     <w:tbl>
@@ -2550,7 +2447,7 @@
                 <w:color w:val="0B2A4A"/>
                 <w:sz w:val="19"/>
               </w:rPr>
-              <w:t>PENTING / PERHATIAN: Status Persona SESDEP</w:t>
+              <w:t>CATATAN PENTING UNTUK PIMPINAN: Status Akun SESDEP</w:t>
               <w:br/>
             </w:r>
             <w:r>
@@ -2558,7 +2455,7 @@
                 <w:color w:val="334155"/>
                 <w:sz w:val="18"/>
               </w:rPr>
-              <w:t>Pada prototipe awal, SESDEP diperkenalkan sebagai representasi persona pimpinan. Namun, dalam arsitektur produksi backend yang telah diverifikasi, kode peran SESDEP dinormalisasi secara otomatis ke dalam role SUPER_ADMIN dengan wewenang pengawasan eksekutif nasional penuh. Switcher persona pada UI Next.js dinonaktifkan pada mode API produksi guna mencegah eskalasi hak akses ilegal.</w:t>
+              <w:t>Pada prototipe awal, SESDEP diperkenalkan sebagai representasi persona pimpinan. Dalam implementasi resmi backend yang telah diverifikasi, kode akun SESDEP dinormalisasi otomatis ke dalam peran SUPER_ADMIN dengan wewenang pengawasan eksekutif nasional penuh. Pengganti peran manual pada tampilan web dinonaktifkan permanen saat terhubung ke server utama guna menjamin keamanan.</w:t>
             </w:r>
           </w:p>
         </w:tc>
@@ -2581,7 +2478,7 @@
           <w:color w:val="1E40AF"/>
           <w:sz w:val="24"/>
         </w:rPr>
-        <w:t>3.2 Matriks Hak Akses</w:t>
+        <w:t>3.2 Matriks Peran dan Tanggung Jawab</w:t>
       </w:r>
     </w:p>
     <w:p>
@@ -2595,7 +2492,7 @@
           <w:color w:val="0B2A4A"/>
           <w:sz w:val="19"/>
         </w:rPr>
-        <w:t>Tabel 2: Matriks Hak Akses dan Tanggung Jawab Workflow per Role</w:t>
+        <w:t>Tabel 2: Matriks Pembagian Tugas dan Hak Akses per Peran Pengguna</w:t>
       </w:r>
     </w:p>
     <w:tbl>
@@ -2622,7 +2519,7 @@
       <w:tr>
         <w:tc>
           <w:tcPr>
-            <w:tcW w:type="dxa" w:w="1440"/>
+            <w:tcW w:type="dxa" w:w="1584"/>
             <w:shd w:fill="0B2A4A"/>
             <w:tcMar>
               <w:top w:w="80" w:type="dxa"/>
@@ -2641,7 +2538,7 @@
                 <w:color w:val="FFFFFF"/>
                 <w:sz w:val="18"/>
               </w:rPr>
-              <w:t>Role</w:t>
+              <w:t>Peran Pengguna</w:t>
             </w:r>
           </w:p>
         </w:tc>
@@ -2666,7 +2563,7 @@
                 <w:color w:val="FFFFFF"/>
                 <w:sz w:val="18"/>
               </w:rPr>
-              <w:t>Tujuan Utama</w:t>
+              <w:t>Fokus Tugas Utama</w:t>
             </w:r>
           </w:p>
         </w:tc>
@@ -2691,13 +2588,13 @@
                 <w:color w:val="FFFFFF"/>
                 <w:sz w:val="18"/>
               </w:rPr>
-              <w:t>Hak Akses (Permissions)</w:t>
-            </w:r>
-          </w:p>
-        </w:tc>
-        <w:tc>
-          <w:tcPr>
-            <w:tcW w:type="dxa" w:w="1728"/>
+              <w:t>Izin Operasi Sistem</w:t>
+            </w:r>
+          </w:p>
+        </w:tc>
+        <w:tc>
+          <w:tcPr>
+            <w:tcW w:type="dxa" w:w="1584"/>
             <w:shd w:fill="0B2A4A"/>
             <w:tcMar>
               <w:top w:w="80" w:type="dxa"/>
@@ -2716,7 +2613,7 @@
                 <w:color w:val="FFFFFF"/>
                 <w:sz w:val="18"/>
               </w:rPr>
-              <w:t>Lingkup Akses (Scope)</w:t>
+              <w:t>Wilayah Akses Data</w:t>
             </w:r>
           </w:p>
         </w:tc>
@@ -2741,7 +2638,7 @@
                 <w:color w:val="FFFFFF"/>
                 <w:sz w:val="18"/>
               </w:rPr>
-              <w:t>Tanggung Jawab Workflow</w:t>
+              <w:t>Tanggung Jawab Alur Kerja</w:t>
             </w:r>
           </w:p>
         </w:tc>
@@ -2749,7 +2646,7 @@
       <w:tr>
         <w:tc>
           <w:tcPr>
-            <w:tcW w:type="dxa" w:w="1440"/>
+            <w:tcW w:type="dxa" w:w="1584"/>
             <w:shd w:fill="FFFFFF"/>
             <w:tcMar>
               <w:top w:w="60" w:type="dxa"/>
@@ -2767,7 +2664,7 @@
                 <w:color w:val="1E293B"/>
                 <w:sz w:val="17"/>
               </w:rPr>
-              <w:t>USER</w:t>
+              <w:t>OPERATOR (USER)</w:t>
             </w:r>
           </w:p>
         </w:tc>
@@ -2821,7 +2718,7 @@
         </w:tc>
         <w:tc>
           <w:tcPr>
-            <w:tcW w:type="dxa" w:w="1728"/>
+            <w:tcW w:type="dxa" w:w="1584"/>
             <w:shd w:fill="FFFFFF"/>
             <w:tcMar>
               <w:top w:w="60" w:type="dxa"/>
@@ -2839,7 +2736,7 @@
                 <w:color w:val="1E293B"/>
                 <w:sz w:val="17"/>
               </w:rPr>
-              <w:t>Home Institution (Instansi Sendiri)</w:t>
+              <w:t>Instansi Sendiri (Home Institution)</w:t>
             </w:r>
           </w:p>
         </w:tc>
@@ -2863,7 +2760,7 @@
                 <w:color w:val="1E293B"/>
                 <w:sz w:val="17"/>
               </w:rPr>
-              <w:t>Drafting usulan, submit usulan, perbaikan revisi (v1-&gt;v2)</w:t>
+              <w:t>Menyusun draf usulan, mengirim usulan, memperbaiki berkas revisi (v1-&gt;v2)</w:t>
             </w:r>
           </w:p>
         </w:tc>
@@ -2871,7 +2768,7 @@
       <w:tr>
         <w:tc>
           <w:tcPr>
-            <w:tcW w:type="dxa" w:w="1440"/>
+            <w:tcW w:type="dxa" w:w="1584"/>
             <w:shd w:fill="F8FAFC"/>
             <w:tcMar>
               <w:top w:w="60" w:type="dxa"/>
@@ -2889,7 +2786,7 @@
                 <w:color w:val="1E293B"/>
                 <w:sz w:val="17"/>
               </w:rPr>
-              <w:t>ADMIN</w:t>
+              <w:t>PENAPIS (ADMIN)</w:t>
             </w:r>
           </w:p>
         </w:tc>
@@ -2913,7 +2810,7 @@
                 <w:color w:val="1E293B"/>
                 <w:sz w:val="17"/>
               </w:rPr>
-              <w:t>Penapisan kelengkapan berkas administratif (Gate 1)</w:t>
+              <w:t>Penapisan kelengkapan berkas formalitas (Tahap 1)</w:t>
             </w:r>
           </w:p>
         </w:tc>
@@ -2943,7 +2840,7 @@
         </w:tc>
         <w:tc>
           <w:tcPr>
-            <w:tcW w:type="dxa" w:w="1728"/>
+            <w:tcW w:type="dxa" w:w="1584"/>
             <w:shd w:fill="F8FAFC"/>
             <w:tcMar>
               <w:top w:w="60" w:type="dxa"/>
@@ -2961,7 +2858,7 @@
                 <w:color w:val="1E293B"/>
                 <w:sz w:val="17"/>
               </w:rPr>
-              <w:t>Scoped K/L yang ditugaskan</w:t>
+              <w:t>Berkas K/L yang Ditugaskan</w:t>
             </w:r>
           </w:p>
         </w:tc>
@@ -2985,7 +2882,7 @@
                 <w:color w:val="1E293B"/>
                 <w:sz w:val="17"/>
               </w:rPr>
-              <w:t>Pemeriksaan formal, return revisi administratif, assign verifier</w:t>
+              <w:t>Pemeriksaan formal surat/naskah, kembalikan revisi, alokasi penugasan Verifikator</w:t>
             </w:r>
           </w:p>
         </w:tc>
@@ -2993,7 +2890,7 @@
       <w:tr>
         <w:tc>
           <w:tcPr>
-            <w:tcW w:type="dxa" w:w="1440"/>
+            <w:tcW w:type="dxa" w:w="1584"/>
             <w:shd w:fill="FFFFFF"/>
             <w:tcMar>
               <w:top w:w="60" w:type="dxa"/>
@@ -3011,7 +2908,7 @@
                 <w:color w:val="1E293B"/>
                 <w:sz w:val="17"/>
               </w:rPr>
-              <w:t>VERIFIER</w:t>
+              <w:t>VERIFIKATOR (VERIFIER)</w:t>
             </w:r>
           </w:p>
         </w:tc>
@@ -3035,7 +2932,7 @@
                 <w:color w:val="1E293B"/>
                 <w:sz w:val="17"/>
               </w:rPr>
-              <w:t>Telaah substantif &amp; pengesahan SK resmi (Gate 2)</w:t>
+              <w:t>Telaah substantif beban kerja &amp; pengesahan SK resmi (Tahap 2)</w:t>
             </w:r>
           </w:p>
         </w:tc>
@@ -3065,7 +2962,7 @@
         </w:tc>
         <w:tc>
           <w:tcPr>
-            <w:tcW w:type="dxa" w:w="1728"/>
+            <w:tcW w:type="dxa" w:w="1584"/>
             <w:shd w:fill="FFFFFF"/>
             <w:tcMar>
               <w:top w:w="60" w:type="dxa"/>
@@ -3083,7 +2980,7 @@
                 <w:color w:val="1E293B"/>
                 <w:sz w:val="17"/>
               </w:rPr>
-              <w:t>Queue usulan yang ditugaskan</w:t>
+              <w:t>Antrean Usulan Penugasan</w:t>
             </w:r>
           </w:p>
         </w:tc>
@@ -3107,7 +3004,7 @@
                 <w:color w:val="1E293B"/>
                 <w:sz w:val="17"/>
               </w:rPr>
-              <w:t>Telaah beban kerja &amp; formasi, catatan teknis, final approval SK, promosi master data</w:t>
+              <w:t>Telaah beban kerja &amp; formasi ASN, input catatan teknis, pengesahan SK, promosi data master</w:t>
             </w:r>
           </w:p>
         </w:tc>
@@ -3115,7 +3012,7 @@
       <w:tr>
         <w:tc>
           <w:tcPr>
-            <w:tcW w:type="dxa" w:w="1440"/>
+            <w:tcW w:type="dxa" w:w="1584"/>
             <w:shd w:fill="F8FAFC"/>
             <w:tcMar>
               <w:top w:w="60" w:type="dxa"/>
@@ -3133,7 +3030,7 @@
                 <w:color w:val="1E293B"/>
                 <w:sz w:val="17"/>
               </w:rPr>
-              <w:t>SUPER_ADMIN</w:t>
+              <w:t>PIMPINAN / SUPER_ADMIN</w:t>
             </w:r>
           </w:p>
         </w:tc>
@@ -3157,7 +3054,7 @@
                 <w:color w:val="1E293B"/>
                 <w:sz w:val="17"/>
               </w:rPr>
-              <w:t>Pengawasan nasional, kelola akses &amp; audit forensik</w:t>
+              <w:t>Pengawasan nasional, kelola akun &amp; audit forensik</w:t>
             </w:r>
           </w:p>
         </w:tc>
@@ -3187,7 +3084,7 @@
         </w:tc>
         <w:tc>
           <w:tcPr>
-            <w:tcW w:type="dxa" w:w="1728"/>
+            <w:tcW w:type="dxa" w:w="1584"/>
             <w:shd w:fill="F8FAFC"/>
             <w:tcMar>
               <w:top w:w="60" w:type="dxa"/>
@@ -3205,7 +3102,7 @@
                 <w:color w:val="1E293B"/>
                 <w:sz w:val="17"/>
               </w:rPr>
-              <w:t>Global Nationwide (Seluruh K/L/D)</w:t>
+              <w:t>Nasional Seluruh Indonesia (K/L/D)</w:t>
             </w:r>
           </w:p>
         </w:tc>
@@ -3229,7 +3126,7 @@
                 <w:color w:val="1E293B"/>
                 <w:sz w:val="17"/>
               </w:rPr>
-              <w:t>Monitoring KPI nasional, audit trail kepatuhan, ekspor dataset</w:t>
+              <w:t>Monitoring KPI nasional, pemeriksaan log audit kepatuhan, ekspor dataset</w:t>
             </w:r>
           </w:p>
         </w:tc>
@@ -3249,7 +3146,7 @@
       <w:r>
         <w:drawing>
           <wp:inline xmlns:a="http://schemas.openxmlformats.org/drawingml/2006/main" xmlns:pic="http://schemas.openxmlformats.org/drawingml/2006/picture">
-            <wp:extent cx="5760720" cy="3780472"/>
+            <wp:extent cx="5760720" cy="3240405"/>
             <wp:docPr id="2" name="Picture 2"/>
             <wp:cNvGraphicFramePr>
               <a:graphicFrameLocks noChangeAspect="1"/>
@@ -3270,7 +3167,7 @@
                   <pic:spPr>
                     <a:xfrm>
                       <a:off x="0" y="0"/>
-                      <a:ext cx="5760720" cy="3780472"/>
+                      <a:ext cx="5760720" cy="3240405"/>
                     </a:xfrm>
                     <a:prstGeom prst="rect"/>
                   </pic:spPr>
@@ -3293,7 +3190,7 @@
           <w:color w:val="475569"/>
           <w:sz w:val="18"/>
         </w:rPr>
-        <w:t>Gambar 2: Model Otorisasi dan Matriks Hak Akses Zero-Trust SIGMA-K</w:t>
+        <w:t>Gambar 2: Model Otorisasi dan Matriks Pembagian Peran Pengguna SIGMA-K</w:t>
       </w:r>
     </w:p>
     <w:p>
@@ -3308,7 +3205,7 @@
           <w:color w:val="0B2A4A"/>
           <w:sz w:val="28"/>
         </w:rPr>
-        <w:t>BAB 4 — PRINSIP DESAIN UI/UX</w:t>
+        <w:t>BAB 4 — PRINSIP DESAIN ANTARMUKA PENGGUNA (UI/UX)</w:t>
       </w:r>
     </w:p>
     <w:p>
@@ -3323,7 +3220,7 @@
           <w:color w:val="1E40AF"/>
           <w:sz w:val="24"/>
         </w:rPr>
-        <w:t>4.1 Prinsip Desain Antarmuka</w:t>
+        <w:t>4.1 Standar Visual &amp; Kemudahan Penggunaan</w:t>
       </w:r>
     </w:p>
     <w:p>
@@ -3336,7 +3233,7 @@
           <w:color w:val="1E293B"/>
           <w:sz w:val="20"/>
         </w:rPr>
-        <w:t>Desain antarmuka SIGMA-K dibangun dengan mengedepankan prinsip kejelasan institusional, efisiensi navigasi, dan kenyamanan visual bagi aparatur sipil negara.</w:t>
+        <w:t>Desain antarmuka SIGMA-K dibangun dengan mengedepankan identitas resmi instansi pemerintah, kejelasan hierarki informasi, dan kenyamanan pengguna:</w:t>
       </w:r>
     </w:p>
     <w:p>
@@ -3358,7 +3255,7 @@
           <w:color w:val="1E293B"/>
           <w:sz w:val="20"/>
         </w:rPr>
-        <w:t>Deep Navy (#0B2A4A) sebagai warna dominan identitas negara, Blue (#1E40AF) untuk elemen interaktif primer, Gold (#D4AF37) untuk status eksekutif dan aksen penghargaan, serta Slate (#F8FAFC) sebagai latar kerja bersih.</w:t>
+        <w:t>Biru Dongker (#0B2A4A) sebagai warna resmi institusi, Biru Primer (#1E40AF) untuk tombol aksi utama, Aksen Emas (#D4AF37) untuk status eksekutif, dan Putih Bersih (#F8FAFC) sebagai latar kerja yang nyaman di mata.</w:t>
       </w:r>
     </w:p>
     <w:p>
@@ -3380,7 +3277,7 @@
           <w:color w:val="1E293B"/>
           <w:sz w:val="20"/>
         </w:rPr>
-        <w:t>Struktur tata letak konsisten dengan sidebar navigasi terorganisir per domain fungsional, topbar status sesi, breadcrumb hirarkis, dan judul halaman berstandar PageHeader.</w:t>
+        <w:t>Menu samping terorganisir per kelompok layanan, bar status sesi di atas, rekam jejak posisi halaman (breadcrumb), dan judul halaman yang tegas.</w:t>
       </w:r>
     </w:p>
     <w:p>
@@ -3394,7 +3291,7 @@
           <w:color w:val="0B2A4A"/>
           <w:sz w:val="20"/>
         </w:rPr>
-        <w:t xml:space="preserve">• Loading State: </w:t>
+        <w:t xml:space="preserve">• Indikator Pemuatan (Loading State): </w:t>
       </w:r>
       <w:r>
         <w:rPr>
@@ -3402,7 +3299,7 @@
           <w:color w:val="1E293B"/>
           <w:sz w:val="20"/>
         </w:rPr>
-        <w:t>Setiap proses asynchronous menampilkan komponen Spinner atau Skeleton loader sehingga pengguna mengetahui proses sedang berjalan.</w:t>
+        <w:t>Setiap proses pengiriman data menampilkan indikator animasi pemuatan agar pengguna mengetahui sistem sedang bekerja.</w:t>
       </w:r>
     </w:p>
     <w:p>
@@ -3416,7 +3313,7 @@
           <w:color w:val="0B2A4A"/>
           <w:sz w:val="20"/>
         </w:rPr>
-        <w:t xml:space="preserve">• Error State &amp; Status Code: </w:t>
+        <w:t xml:space="preserve">• Penanganan Galat Jelas: </w:t>
       </w:r>
       <w:r>
         <w:rPr>
@@ -3424,7 +3321,7 @@
           <w:color w:val="1E293B"/>
           <w:sz w:val="20"/>
         </w:rPr>
-        <w:t>Pesan kesalahan (401 Unauthorized, 403 Forbidden, 404 Not Found, 409 Conflict, 422 Validation Error) ditampilkan dengan komponen Error Banner transparan.</w:t>
+        <w:t>Pemberitahuan galat (seperti 401 Sesi Habis, 403 Akses Ditolak, 404 Data Tidak Ditemukan) ditampilkan dengan bahasa Indonesia yang jelas dan informatif.</w:t>
       </w:r>
     </w:p>
     <w:p>
@@ -3439,7 +3336,7 @@
           <w:color w:val="0B2A4A"/>
           <w:sz w:val="28"/>
         </w:rPr>
-        <w:t>BAB 5 — SITEMAP APLIKASI</w:t>
+        <w:t>BAB 5 — SITEMAP DAN STRUKTUR NAVIGASI APLIKASI</w:t>
       </w:r>
     </w:p>
     <w:p>
@@ -3454,7 +3351,7 @@
           <w:color w:val="1E40AF"/>
           <w:sz w:val="24"/>
         </w:rPr>
-        <w:t>5.1 Struktur Hierarki Navigasi</w:t>
+        <w:t>5.1 Daftar 16 Halaman Terintegrasi</w:t>
       </w:r>
     </w:p>
     <w:p>
@@ -3468,7 +3365,7 @@
           <w:color w:val="0B2A4A"/>
           <w:sz w:val="19"/>
         </w:rPr>
-        <w:t>Tabel 3: Daftar Rute Halaman Aplikasi SIGMA-K</w:t>
+        <w:t>Tabel 3: Katalog 16 Halaman Aplikasi E-SKLD / SIGMA-K</w:t>
       </w:r>
     </w:p>
     <w:tbl>
@@ -3539,7 +3436,7 @@
                 <w:color w:val="FFFFFF"/>
                 <w:sz w:val="18"/>
               </w:rPr>
-              <w:t>Rute URL</w:t>
+              <w:t>Alamat URL</w:t>
             </w:r>
           </w:p>
         </w:tc>
@@ -3589,7 +3486,7 @@
                 <w:color w:val="FFFFFF"/>
                 <w:sz w:val="18"/>
               </w:rPr>
-              <w:t>Akses Role</w:t>
+              <w:t>Akses Pengguna</w:t>
             </w:r>
           </w:p>
         </w:tc>
@@ -3614,7 +3511,7 @@
                 <w:color w:val="FFFFFF"/>
                 <w:sz w:val="18"/>
               </w:rPr>
-              <w:t>Deskripsi Fungsional</w:t>
+              <w:t>Fungsi Halaman</w:t>
             </w:r>
           </w:p>
         </w:tc>
@@ -3712,7 +3609,7 @@
                 <w:color w:val="1E293B"/>
                 <w:sz w:val="17"/>
               </w:rPr>
-              <w:t>Publik / All</w:t>
+              <w:t>Semua Pengguna</w:t>
             </w:r>
           </w:p>
         </w:tc>
@@ -3736,7 +3633,7 @@
                 <w:color w:val="1E293B"/>
                 <w:sz w:val="17"/>
               </w:rPr>
-              <w:t>Otentikasi NIP/Password &amp; inisialisasi sesi JWT</w:t>
+              <w:t>Autentikasi NIP/Password &amp; inisialisasi sesi token digital</w:t>
             </w:r>
           </w:p>
         </w:tc>
@@ -3810,7 +3707,7 @@
                 <w:color w:val="1E293B"/>
                 <w:sz w:val="17"/>
               </w:rPr>
-              <w:t>Executive Dashboard</w:t>
+              <w:t>Dashboard Eksekutif</w:t>
             </w:r>
           </w:p>
         </w:tc>
@@ -3834,7 +3731,7 @@
                 <w:color w:val="1E293B"/>
                 <w:sz w:val="17"/>
               </w:rPr>
-              <w:t>All Roles</w:t>
+              <w:t>Semua Pengguna</w:t>
             </w:r>
           </w:p>
         </w:tc>
@@ -3858,7 +3755,7 @@
                 <w:color w:val="1E293B"/>
                 <w:sz w:val="17"/>
               </w:rPr>
-              <w:t>Ringkasan metrik, funnel usulan, dan widget SK terbaru</w:t>
+              <w:t>Ringkasan metrik nasional, status usulan, dan widget SK terbaru</w:t>
             </w:r>
           </w:p>
         </w:tc>
@@ -3956,7 +3853,7 @@
                 <w:color w:val="1E293B"/>
                 <w:sz w:val="17"/>
               </w:rPr>
-              <w:t>All Roles</w:t>
+              <w:t>Semua Pengguna</w:t>
             </w:r>
           </w:p>
         </w:tc>
@@ -3980,7 +3877,7 @@
                 <w:color w:val="1E293B"/>
                 <w:sz w:val="17"/>
               </w:rPr>
-              <w:t>Analisis KPI, piramida eselon, SLA layanan, unduh CSV</w:t>
+              <w:t>Analisis capaian, piramida eselon, durasi layanan, unduh CSV</w:t>
             </w:r>
           </w:p>
         </w:tc>
@@ -4078,7 +3975,7 @@
                 <w:color w:val="1E293B"/>
                 <w:sz w:val="17"/>
               </w:rPr>
-              <w:t>All Roles</w:t>
+              <w:t>Semua Pengguna</w:t>
             </w:r>
           </w:p>
         </w:tc>
@@ -4200,7 +4097,7 @@
                 <w:color w:val="1E293B"/>
                 <w:sz w:val="17"/>
               </w:rPr>
-              <w:t>All Roles</w:t>
+              <w:t>Semua Pengguna</w:t>
             </w:r>
           </w:p>
         </w:tc>
@@ -4224,7 +4121,7 @@
                 <w:color w:val="1E293B"/>
                 <w:sz w:val="17"/>
               </w:rPr>
-              <w:t>Dasar hukum, daftar unit, rekapitulasi posisi instansi</w:t>
+              <w:t>Dasar hukum, daftar unit kerja, dan rekapitulasi posisi jabatan</w:t>
             </w:r>
           </w:p>
         </w:tc>
@@ -4298,7 +4195,7 @@
                 <w:color w:val="1E293B"/>
                 <w:sz w:val="17"/>
               </w:rPr>
-              <w:t>Bagan Organisasi</w:t>
+              <w:t>Bagan Struktur Organisasi</w:t>
             </w:r>
           </w:p>
         </w:tc>
@@ -4322,7 +4219,7 @@
                 <w:color w:val="1E293B"/>
                 <w:sz w:val="17"/>
               </w:rPr>
-              <w:t>All Roles</w:t>
+              <w:t>Semua Pengguna</w:t>
             </w:r>
           </w:p>
         </w:tc>
@@ -4346,7 +4243,7 @@
                 <w:color w:val="1E293B"/>
                 <w:sz w:val="17"/>
               </w:rPr>
-              <w:t>Kanvas graf React Flow interaktif pohon hierarki unit</w:t>
+              <w:t>Bagan visual interaktif pohon hierarki unit kerja instansi</w:t>
             </w:r>
           </w:p>
         </w:tc>
@@ -4444,7 +4341,7 @@
                 <w:color w:val="1E293B"/>
                 <w:sz w:val="17"/>
               </w:rPr>
-              <w:t>All Roles</w:t>
+              <w:t>Semua Pengguna</w:t>
             </w:r>
           </w:p>
         </w:tc>
@@ -4468,7 +4365,7 @@
                 <w:color w:val="1E293B"/>
                 <w:sz w:val="17"/>
               </w:rPr>
-              <w:t>Struktur Kabinet Merah Putih dan kementerian koordinator</w:t>
+              <w:t>Struktur Kabinet Merah Putih dan daftar kementerian koordinator</w:t>
             </w:r>
           </w:p>
         </w:tc>
@@ -4566,7 +4463,7 @@
                 <w:color w:val="1E293B"/>
                 <w:sz w:val="17"/>
               </w:rPr>
-              <w:t>All Roles</w:t>
+              <w:t>Semua Pengguna</w:t>
             </w:r>
           </w:p>
         </w:tc>
@@ -4590,7 +4487,7 @@
                 <w:color w:val="1E293B"/>
                 <w:sz w:val="17"/>
               </w:rPr>
-              <w:t>Analisis perbandingan perubahan struktur lintas kabinet</w:t>
+              <w:t>Perbandingan perubahan struktur kementerian lintas kabinet</w:t>
             </w:r>
           </w:p>
         </w:tc>
@@ -4688,7 +4585,7 @@
                 <w:color w:val="1E293B"/>
                 <w:sz w:val="17"/>
               </w:rPr>
-              <w:t>USER, ADMIN, VERIFIER</w:t>
+              <w:t>Operator, Penapis, Verifikator</w:t>
             </w:r>
           </w:p>
         </w:tc>
@@ -4712,7 +4609,7 @@
                 <w:color w:val="1E293B"/>
                 <w:sz w:val="17"/>
               </w:rPr>
-              <w:t>Tabel status berkas pengusulan penataan kelembagaan</w:t>
+              <w:t>Tabel status berkas usulan penataan kelembagaan</w:t>
             </w:r>
           </w:p>
         </w:tc>
@@ -4810,7 +4707,7 @@
                 <w:color w:val="1E293B"/>
                 <w:sz w:val="17"/>
               </w:rPr>
-              <w:t>USER</w:t>
+              <w:t>Operator Instansi</w:t>
             </w:r>
           </w:p>
         </w:tc>
@@ -4834,7 +4731,7 @@
                 <w:color w:val="1E293B"/>
                 <w:sz w:val="17"/>
               </w:rPr>
-              <w:t>Formulir penyusunan draf usulan penataan organisasi</w:t>
+              <w:t>Formulir penyusunan draf usulan penataan unit &amp; formasi</w:t>
             </w:r>
           </w:p>
         </w:tc>
@@ -4932,7 +4829,7 @@
                 <w:color w:val="1E293B"/>
                 <w:sz w:val="17"/>
               </w:rPr>
-              <w:t>All Roles</w:t>
+              <w:t>Semua Pengguna</w:t>
             </w:r>
           </w:p>
         </w:tc>
@@ -4956,7 +4853,7 @@
                 <w:color w:val="1E293B"/>
                 <w:sz w:val="17"/>
               </w:rPr>
-              <w:t>Informasi perubahan unit, jabatan, dan workflow stepper</w:t>
+              <w:t>Informasi perubahan unit, jabatan, dan alur tahapan usulan</w:t>
             </w:r>
           </w:p>
         </w:tc>
@@ -5054,7 +4951,7 @@
                 <w:color w:val="1E293B"/>
                 <w:sz w:val="17"/>
               </w:rPr>
-              <w:t>USER</w:t>
+              <w:t>Operator Instansi</w:t>
             </w:r>
           </w:p>
         </w:tc>
@@ -5078,7 +4975,7 @@
                 <w:color w:val="1E293B"/>
                 <w:sz w:val="17"/>
               </w:rPr>
-              <w:t>Ruang perbaikan berkas pasca catatan telaah (v2)</w:t>
+              <w:t>Ruang perbaikan berkas setelah menerima catatan telaah (v2)</w:t>
             </w:r>
           </w:p>
         </w:tc>
@@ -5176,7 +5073,7 @@
                 <w:color w:val="1E293B"/>
                 <w:sz w:val="17"/>
               </w:rPr>
-              <w:t>ADMIN, VERIFIER</w:t>
+              <w:t>Penapis &amp; Verifikator</w:t>
             </w:r>
           </w:p>
         </w:tc>
@@ -5200,7 +5097,7 @@
                 <w:color w:val="1E293B"/>
                 <w:sz w:val="17"/>
               </w:rPr>
-              <w:t>Antrean kerja penapisan Admin dan telaah Verifikator</w:t>
+              <w:t>Antrean kerja penapisan formal dan telaah substantif</w:t>
             </w:r>
           </w:p>
         </w:tc>
@@ -5298,7 +5195,7 @@
                 <w:color w:val="1E293B"/>
                 <w:sz w:val="17"/>
               </w:rPr>
-              <w:t>ADMIN, VERIFIER</w:t>
+              <w:t>Penapis &amp; Verifikator</w:t>
             </w:r>
           </w:p>
         </w:tc>
@@ -5322,7 +5219,7 @@
                 <w:color w:val="1E293B"/>
                 <w:sz w:val="17"/>
               </w:rPr>
-              <w:t>Panel telaah substantif, input catatan &amp; pengesahan SK</w:t>
+              <w:t>Panel telaah teknis, input catatan review, dan pengesahan SK</w:t>
             </w:r>
           </w:p>
         </w:tc>
@@ -5420,7 +5317,7 @@
                 <w:color w:val="1E293B"/>
                 <w:sz w:val="17"/>
               </w:rPr>
-              <w:t>ADMIN, SUPER_ADMIN</w:t>
+              <w:t>Penapis &amp; Super Admin</w:t>
             </w:r>
           </w:p>
         </w:tc>
@@ -5444,7 +5341,7 @@
                 <w:color w:val="1E293B"/>
                 <w:sz w:val="17"/>
               </w:rPr>
-              <w:t>Tabel rekam jejak mutasi data dan forensik payload</w:t>
+              <w:t>Tabel rekam jejak mutasi data dan perbandingan perubahan</w:t>
             </w:r>
           </w:p>
         </w:tc>
@@ -5542,7 +5439,7 @@
                 <w:color w:val="1E293B"/>
                 <w:sz w:val="17"/>
               </w:rPr>
-              <w:t>All Roles</w:t>
+              <w:t>Semua Pengguna</w:t>
             </w:r>
           </w:p>
         </w:tc>
@@ -5566,7 +5463,7 @@
                 <w:color w:val="1E293B"/>
                 <w:sz w:val="17"/>
               </w:rPr>
-              <w:t>Notifikasi perubahan status usulan dan penugasan</w:t>
+              <w:t>Notifikasi perubahan status berkas dan penugasan telaah</w:t>
             </w:r>
           </w:p>
         </w:tc>
@@ -5586,7 +5483,7 @@
       <w:r>
         <w:drawing>
           <wp:inline xmlns:a="http://schemas.openxmlformats.org/drawingml/2006/main" xmlns:pic="http://schemas.openxmlformats.org/drawingml/2006/picture">
-            <wp:extent cx="5760720" cy="3780472"/>
+            <wp:extent cx="5760720" cy="3240405"/>
             <wp:docPr id="3" name="Picture 3"/>
             <wp:cNvGraphicFramePr>
               <a:graphicFrameLocks noChangeAspect="1"/>
@@ -5607,7 +5504,7 @@
                   <pic:spPr>
                     <a:xfrm>
                       <a:off x="0" y="0"/>
-                      <a:ext cx="5760720" cy="3780472"/>
+                      <a:ext cx="5760720" cy="3240405"/>
                     </a:xfrm>
                     <a:prstGeom prst="rect"/>
                   </pic:spPr>
@@ -5660,7 +5557,7 @@
           <w:color w:val="1E40AF"/>
           <w:sz w:val="24"/>
         </w:rPr>
-        <w:t>6.1 Alur Data &amp; Representasi Hierarki</w:t>
+        <w:t>6.1 Keterhubungan Data &amp; Model Pohon Organisasi</w:t>
       </w:r>
     </w:p>
     <w:p>
@@ -5673,7 +5570,7 @@
           <w:color w:val="1E293B"/>
           <w:sz w:val="20"/>
         </w:rPr>
-        <w:t>Hubungan relasional antar master data disajikan pada Gambar 4, dan representasi pohon hierarki struktural disajikan pada Gambar 5.</w:t>
+        <w:t>Hubungan relasional antar data kelembagaan disajikan pada Gambar 4, dan representasi pohon hierarki struktural berjenjang disajikan pada Gambar 5.</w:t>
       </w:r>
     </w:p>
     <w:p>
@@ -5685,7 +5582,7 @@
       <w:r>
         <w:drawing>
           <wp:inline xmlns:a="http://schemas.openxmlformats.org/drawingml/2006/main" xmlns:pic="http://schemas.openxmlformats.org/drawingml/2006/picture">
-            <wp:extent cx="5760720" cy="3780472"/>
+            <wp:extent cx="5760720" cy="3240405"/>
             <wp:docPr id="4" name="Picture 4"/>
             <wp:cNvGraphicFramePr>
               <a:graphicFrameLocks noChangeAspect="1"/>
@@ -5706,7 +5603,7 @@
                   <pic:spPr>
                     <a:xfrm>
                       <a:off x="0" y="0"/>
-                      <a:ext cx="5760720" cy="3780472"/>
+                      <a:ext cx="5760720" cy="3240405"/>
                     </a:xfrm>
                     <a:prstGeom prst="rect"/>
                   </pic:spPr>
@@ -5729,7 +5626,7 @@
           <w:color w:val="475569"/>
           <w:sz w:val="18"/>
         </w:rPr>
-        <w:t>Gambar 4: Alur Relasi dan Integrasi Master Data Kelembagaan</w:t>
+        <w:t>Gambar 4: Keterhubungan dan Alur Integrasi Master Data Kelembagaan</w:t>
       </w:r>
     </w:p>
     <w:p>
@@ -5741,7 +5638,7 @@
       <w:r>
         <w:drawing>
           <wp:inline xmlns:a="http://schemas.openxmlformats.org/drawingml/2006/main" xmlns:pic="http://schemas.openxmlformats.org/drawingml/2006/picture">
-            <wp:extent cx="5760720" cy="3780472"/>
+            <wp:extent cx="5760720" cy="3240405"/>
             <wp:docPr id="5" name="Picture 5"/>
             <wp:cNvGraphicFramePr>
               <a:graphicFrameLocks noChangeAspect="1"/>
@@ -5762,7 +5659,7 @@
                   <pic:spPr>
                     <a:xfrm>
                       <a:off x="0" y="0"/>
-                      <a:ext cx="5760720" cy="3780472"/>
+                      <a:ext cx="5760720" cy="3240405"/>
                     </a:xfrm>
                     <a:prstGeom prst="rect"/>
                   </pic:spPr>
@@ -5800,7 +5697,7 @@
           <w:color w:val="0B2A4A"/>
           <w:sz w:val="28"/>
         </w:rPr>
-        <w:t>BAB 7 — DATABASE &amp; STRUKTUR DATA (ERD)</w:t>
+        <w:t>BAB 7 — STRUKTUR BASIS DATA &amp; ERD (21 TABEL)</w:t>
       </w:r>
     </w:p>
     <w:p>
@@ -5926,7 +5823,7 @@
                 <w:color w:val="FFFFFF"/>
                 <w:sz w:val="18"/>
               </w:rPr>
-              <w:t>Domain Fungsional</w:t>
+              <w:t>Kelompok Data</w:t>
             </w:r>
           </w:p>
         </w:tc>
@@ -5951,7 +5848,7 @@
                 <w:color w:val="FFFFFF"/>
                 <w:sz w:val="18"/>
               </w:rPr>
-              <w:t>Primary Key</w:t>
+              <w:t>Kunci Utama (PK)</w:t>
             </w:r>
           </w:p>
         </w:tc>
@@ -5976,7 +5873,7 @@
                 <w:color w:val="FFFFFF"/>
                 <w:sz w:val="18"/>
               </w:rPr>
-              <w:t>Foreign Keys Kunci</w:t>
+              <w:t>Kunci Relasi (FK)</w:t>
             </w:r>
           </w:p>
         </w:tc>
@@ -6001,7 +5898,7 @@
                 <w:color w:val="FFFFFF"/>
                 <w:sz w:val="18"/>
               </w:rPr>
-              <w:t>Deskripsi Data</w:t>
+              <w:t>Deskripsi Fungsi Data</w:t>
             </w:r>
           </w:p>
         </w:tc>
@@ -6075,7 +5972,7 @@
                 <w:color w:val="1E293B"/>
                 <w:sz w:val="17"/>
               </w:rPr>
-              <w:t>Autentikasi</w:t>
+              <w:t>Akun Pengguna</w:t>
             </w:r>
           </w:p>
         </w:tc>
@@ -6147,7 +6044,7 @@
                 <w:color w:val="1E293B"/>
                 <w:sz w:val="17"/>
               </w:rPr>
-              <w:t>Data akun pengguna, NIP, email, dan password hash</w:t>
+              <w:t>Data akun pengguna, NIP, email, dan kata sandi terenkripsi</w:t>
             </w:r>
           </w:p>
         </w:tc>
@@ -6221,7 +6118,7 @@
                 <w:color w:val="1E293B"/>
                 <w:sz w:val="17"/>
               </w:rPr>
-              <w:t>Autentikasi</w:t>
+              <w:t>Hak Akses</w:t>
             </w:r>
           </w:p>
         </w:tc>
@@ -6293,7 +6190,7 @@
                 <w:color w:val="1E293B"/>
                 <w:sz w:val="17"/>
               </w:rPr>
-              <w:t>Definisi 4 role resmi (USER, ADMIN, VERIFIER, SUPER_ADMIN)</w:t>
+              <w:t>Daftar 4 peran resmi (USER, ADMIN, VERIFIER, SUPER_ADMIN)</w:t>
             </w:r>
           </w:p>
         </w:tc>
@@ -6367,7 +6264,7 @@
                 <w:color w:val="1E293B"/>
                 <w:sz w:val="17"/>
               </w:rPr>
-              <w:t>Otorisasi</w:t>
+              <w:t>Hak Akses</w:t>
             </w:r>
           </w:p>
         </w:tc>
@@ -6439,7 +6336,7 @@
                 <w:color w:val="1E293B"/>
                 <w:sz w:val="17"/>
               </w:rPr>
-              <w:t>Katalog izin operasi granular (create, edit, approve, dll.)</w:t>
+              <w:t>Katalog izin operasi spesifik (buat draf, telaah, sahkan SK)</w:t>
             </w:r>
           </w:p>
         </w:tc>
@@ -6513,7 +6410,7 @@
                 <w:color w:val="1E293B"/>
                 <w:sz w:val="17"/>
               </w:rPr>
-              <w:t>Otorisasi</w:t>
+              <w:t>Hak Akses</w:t>
             </w:r>
           </w:p>
         </w:tc>
@@ -6585,7 +6482,7 @@
                 <w:color w:val="1E293B"/>
                 <w:sz w:val="17"/>
               </w:rPr>
-              <w:t>Pemetaan relasi many-to-many role terhadap permissions</w:t>
+              <w:t>Pemetaan relasi izin operasi untuk masing-masing peran</w:t>
             </w:r>
           </w:p>
         </w:tc>
@@ -6659,7 +6556,7 @@
                 <w:color w:val="1E293B"/>
                 <w:sz w:val="17"/>
               </w:rPr>
-              <w:t>Otorisasi</w:t>
+              <w:t>Wilayah Akses</w:t>
             </w:r>
           </w:p>
         </w:tc>
@@ -6731,7 +6628,7 @@
                 <w:color w:val="1E293B"/>
                 <w:sz w:val="17"/>
               </w:rPr>
-              <w:t>Batasan wilayah wewenang instansi yang dapat diakses pengguna</w:t>
+              <w:t>Batasan wilayah instansi yang berhak diakses pengguna</w:t>
             </w:r>
           </w:p>
         </w:tc>
@@ -6805,7 +6702,7 @@
                 <w:color w:val="1E293B"/>
                 <w:sz w:val="17"/>
               </w:rPr>
-              <w:t>Otorisasi</w:t>
+              <w:t>Wilayah Akses</w:t>
             </w:r>
           </w:p>
         </w:tc>
@@ -6877,7 +6774,7 @@
                 <w:color w:val="1E293B"/>
                 <w:sz w:val="17"/>
               </w:rPr>
-              <w:t>Pemberian izin akses khusus lintas instansi berbatas waktu</w:t>
+              <w:t>Pemberian izin akses tugas khusus sementara lintas instansi</w:t>
             </w:r>
           </w:p>
         </w:tc>
@@ -6951,7 +6848,7 @@
                 <w:color w:val="1E293B"/>
                 <w:sz w:val="17"/>
               </w:rPr>
-              <w:t>Otorisasi</w:t>
+              <w:t>Wilayah Akses</w:t>
             </w:r>
           </w:p>
         </w:tc>
@@ -7023,7 +6920,7 @@
                 <w:color w:val="1E293B"/>
                 <w:sz w:val="17"/>
               </w:rPr>
-              <w:t>Pengajuan permohonan akses data instansi tambahan</w:t>
+              <w:t>Pengajuan permohonan penambahan akses data instansi</w:t>
             </w:r>
           </w:p>
         </w:tc>
@@ -7097,7 +6994,7 @@
                 <w:color w:val="1E293B"/>
                 <w:sz w:val="17"/>
               </w:rPr>
-              <w:t>Master Data</w:t>
+              <w:t>Master Instansi</w:t>
             </w:r>
           </w:p>
         </w:tc>
@@ -7243,7 +7140,7 @@
                 <w:color w:val="1E293B"/>
                 <w:sz w:val="17"/>
               </w:rPr>
-              <w:t>Master Data</w:t>
+              <w:t>Master Instansi</w:t>
             </w:r>
           </w:p>
         </w:tc>
@@ -7315,7 +7212,7 @@
                 <w:color w:val="1E293B"/>
                 <w:sz w:val="17"/>
               </w:rPr>
-              <w:t>Kategori tipe instansi pemerintah</w:t>
+              <w:t>Kategori bentuk instansi pemerintah (Kemenko, LPNK, dll.)</w:t>
             </w:r>
           </w:p>
         </w:tc>
@@ -7389,7 +7286,7 @@
                 <w:color w:val="1E293B"/>
                 <w:sz w:val="17"/>
               </w:rPr>
-              <w:t>Master Data</w:t>
+              <w:t>Master Kabinet</w:t>
             </w:r>
           </w:p>
         </w:tc>
@@ -7461,7 +7358,7 @@
                 <w:color w:val="1E293B"/>
                 <w:sz w:val="17"/>
               </w:rPr>
-              <w:t>Data kabinet pemerintahan dan periode masa jabatan</w:t>
+              <w:t>Data kabinet pemerintahan dan masa periode jabatan</w:t>
             </w:r>
           </w:p>
         </w:tc>
@@ -7535,7 +7432,7 @@
                 <w:color w:val="1E293B"/>
                 <w:sz w:val="17"/>
               </w:rPr>
-              <w:t>Master Data</w:t>
+              <w:t>Master Kabinet</w:t>
             </w:r>
           </w:p>
         </w:tc>
@@ -7681,7 +7578,7 @@
                 <w:color w:val="1E293B"/>
                 <w:sz w:val="17"/>
               </w:rPr>
-              <w:t>Master Data</w:t>
+              <w:t>Master Struktur</w:t>
             </w:r>
           </w:p>
         </w:tc>
@@ -7753,7 +7650,7 @@
                 <w:color w:val="1E293B"/>
                 <w:sz w:val="17"/>
               </w:rPr>
-              <w:t>Unit kerja struktural aktif dengan struktur pohon Adjacency List</w:t>
+              <w:t>Unit kerja aktif tersusun dalam struktur pohon hierarkis</w:t>
             </w:r>
           </w:p>
         </w:tc>
@@ -7827,7 +7724,7 @@
                 <w:color w:val="1E293B"/>
                 <w:sz w:val="17"/>
               </w:rPr>
-              <w:t>Master Data</w:t>
+              <w:t>Master Jabatan</w:t>
             </w:r>
           </w:p>
         </w:tc>
@@ -7899,7 +7796,7 @@
                 <w:color w:val="1E293B"/>
                 <w:sz w:val="17"/>
               </w:rPr>
-              <w:t>Jabatan struktural aktif, level eselon, dan formasi ASN</w:t>
+              <w:t>Jabatan struktural aktif, jenjang eselon, dan kuota formasi ASN</w:t>
             </w:r>
           </w:p>
         </w:tc>
@@ -8045,7 +7942,7 @@
                 <w:color w:val="1E293B"/>
                 <w:sz w:val="17"/>
               </w:rPr>
-              <w:t>Header usulan penataan kelembagaan dan status workflow</w:t>
+              <w:t>Header usulan penataan kelembagaan dan status alur kerja</w:t>
             </w:r>
           </w:p>
         </w:tc>
@@ -8191,7 +8088,7 @@
                 <w:color w:val="1E293B"/>
                 <w:sz w:val="17"/>
               </w:rPr>
-              <w:t>Snapshot versi usulan (v1, v2, dst.) untuk immutabilitas</w:t>
+              <w:t>Perekam versi draf usulan (v1, v2) untuk riwayat historis</w:t>
             </w:r>
           </w:p>
         </w:tc>
@@ -8337,7 +8234,7 @@
                 <w:color w:val="1E293B"/>
                 <w:sz w:val="17"/>
               </w:rPr>
-              <w:t>Rincian usulan perubahan unit kerja (CREATE/UPDATE/DELETE)</w:t>
+              <w:t>Rincian usulan perubahan unit kerja (tambah/ubah/hapus)</w:t>
             </w:r>
           </w:p>
         </w:tc>
@@ -8775,7 +8672,7 @@
                 <w:color w:val="1E293B"/>
                 <w:sz w:val="17"/>
               </w:rPr>
-              <w:t>Catatan koreksi telaah substantif per unit/organisasi</w:t>
+              <w:t>Catatan koreksi telaah teknis substantif per unit kerja</w:t>
             </w:r>
           </w:p>
         </w:tc>
@@ -8849,7 +8746,7 @@
                 <w:color w:val="1E293B"/>
                 <w:sz w:val="17"/>
               </w:rPr>
-              <w:t>Pengesahan</w:t>
+              <w:t>Pengesahan SK</w:t>
             </w:r>
           </w:p>
         </w:tc>
@@ -8921,7 +8818,7 @@
                 <w:color w:val="1E293B"/>
                 <w:sz w:val="17"/>
               </w:rPr>
-              <w:t>Dokumen SK penetapan persetujuan resmi oleh Verifikator</w:t>
+              <w:t>Dokumen penetapan persetujuan SK resmi oleh Verifikator</w:t>
             </w:r>
           </w:p>
         </w:tc>
@@ -9067,7 +8964,7 @@
                 <w:color w:val="1E293B"/>
                 <w:sz w:val="17"/>
               </w:rPr>
-              <w:t>Log mutasi data append-only, payload JSON, dan rekam jejak IP</w:t>
+              <w:t>Log mutasi data permanen, rekam jejak IP, dan rincian perubahan</w:t>
             </w:r>
           </w:p>
         </w:tc>
@@ -9087,7 +8984,7 @@
       <w:r>
         <w:drawing>
           <wp:inline xmlns:a="http://schemas.openxmlformats.org/drawingml/2006/main" xmlns:pic="http://schemas.openxmlformats.org/drawingml/2006/picture">
-            <wp:extent cx="5760720" cy="3780472"/>
+            <wp:extent cx="5760720" cy="3240405"/>
             <wp:docPr id="6" name="Picture 6"/>
             <wp:cNvGraphicFramePr>
               <a:graphicFrameLocks noChangeAspect="1"/>
@@ -9108,7 +9005,7 @@
                   <pic:spPr>
                     <a:xfrm>
                       <a:off x="0" y="0"/>
-                      <a:ext cx="5760720" cy="3780472"/>
+                      <a:ext cx="5760720" cy="3240405"/>
                     </a:xfrm>
                     <a:prstGeom prst="rect"/>
                   </pic:spPr>
@@ -9131,7 +9028,7 @@
           <w:color w:val="475569"/>
           <w:sz w:val="18"/>
         </w:rPr>
-        <w:t>Gambar 6: Entity Relationship Diagram (ERD) Basis Data eskld_db (21 Tabel Relasional)</w:t>
+        <w:t>Gambar 6: Entity Relationship Diagram (ERD) Basis Data eskld_db (21 Tabel)</w:t>
       </w:r>
     </w:p>
     <w:p>
@@ -9146,7 +9043,7 @@
           <w:color w:val="0B2A4A"/>
           <w:sz w:val="28"/>
         </w:rPr>
-        <w:t>BAB 8 — SIKLUS HIDUP PENGUSULAN (SUBMISSION LIFECYCLE)</w:t>
+        <w:t>BAB 8 — ALUR SIKLUS HIDUP PENGUSULAN KELEMBAGAAN</w:t>
       </w:r>
     </w:p>
     <w:p>
@@ -9159,7 +9056,7 @@
           <w:color w:val="1E293B"/>
           <w:sz w:val="20"/>
         </w:rPr>
-        <w:t>Siklus hidup usulan penataan organisasi diatur melalui mesin status (Finite State Machine) 7 tahapan:</w:t>
+        <w:t>Alur usulan penataan kelembagaan diatur melalui mesin status (Finite State Machine) 7 tahapan yang transparan:</w:t>
       </w:r>
     </w:p>
     <w:p>
@@ -9171,7 +9068,7 @@
       <w:r>
         <w:drawing>
           <wp:inline xmlns:a="http://schemas.openxmlformats.org/drawingml/2006/main" xmlns:pic="http://schemas.openxmlformats.org/drawingml/2006/picture">
-            <wp:extent cx="5760720" cy="3780472"/>
+            <wp:extent cx="5760720" cy="3240405"/>
             <wp:docPr id="7" name="Picture 7"/>
             <wp:cNvGraphicFramePr>
               <a:graphicFrameLocks noChangeAspect="1"/>
@@ -9192,7 +9089,7 @@
                   <pic:spPr>
                     <a:xfrm>
                       <a:off x="0" y="0"/>
-                      <a:ext cx="5760720" cy="3780472"/>
+                      <a:ext cx="5760720" cy="3240405"/>
                     </a:xfrm>
                     <a:prstGeom prst="rect"/>
                   </pic:spPr>
@@ -9215,7 +9112,7 @@
           <w:color w:val="475569"/>
           <w:sz w:val="18"/>
         </w:rPr>
-        <w:t>Gambar 7: Diagram Finite State Machine Siklus Hidup Pengusulan Kelembagaan</w:t>
+        <w:t>Gambar 7: Diagram Alur Siklus Hidup Pengusulan Kelembagaan (7 Tahapan)</w:t>
       </w:r>
     </w:p>
     <w:p>
@@ -9230,7 +9127,7 @@
           <w:color w:val="0B2A4A"/>
           <w:sz w:val="28"/>
         </w:rPr>
-        <w:t>BAB 9 — VERSIONING DAN SIKLUS REVISI</w:t>
+        <w:t>BAB 9 — MEKANISME VERSI DRAF &amp; PELACAK PERUBAHAN (DIFF)</w:t>
       </w:r>
     </w:p>
     <w:p>
@@ -9243,7 +9140,7 @@
           <w:color w:val="1E293B"/>
           <w:sz w:val="20"/>
         </w:rPr>
-        <w:t>Mekanisme Snapshot Versioning mengunci data versi awal (v1) dan membandingkan perbaikan versi baru (v2) dengan master data melalui Diff Viewer.</w:t>
+        <w:t>Sistem secara otomatis mengunci draf awal (v1) dan membandingkan hasil perbaikan (v2) dengan data aktif melalui fitur Diff Viewer:</w:t>
       </w:r>
     </w:p>
     <w:p>
@@ -9255,7 +9152,7 @@
       <w:r>
         <w:drawing>
           <wp:inline xmlns:a="http://schemas.openxmlformats.org/drawingml/2006/main" xmlns:pic="http://schemas.openxmlformats.org/drawingml/2006/picture">
-            <wp:extent cx="5760720" cy="3780472"/>
+            <wp:extent cx="5760720" cy="3240405"/>
             <wp:docPr id="8" name="Picture 8"/>
             <wp:cNvGraphicFramePr>
               <a:graphicFrameLocks noChangeAspect="1"/>
@@ -9276,7 +9173,7 @@
                   <pic:spPr>
                     <a:xfrm>
                       <a:off x="0" y="0"/>
-                      <a:ext cx="5760720" cy="3780472"/>
+                      <a:ext cx="5760720" cy="3240405"/>
                     </a:xfrm>
                     <a:prstGeom prst="rect"/>
                   </pic:spPr>
@@ -9299,7 +9196,7 @@
           <w:color w:val="475569"/>
           <w:sz w:val="18"/>
         </w:rPr>
-        <w:t>Gambar 8: Mekanisme Snapshot Versioning dan Pelacakan Perubahan Data (Diff Flow)</w:t>
+        <w:t>Gambar 8: Mekanisme Perekaman Versi dan Pelacakan Perubahan Data (Diff Viewer)</w:t>
       </w:r>
     </w:p>
     <w:p>
@@ -9327,7 +9224,7 @@
           <w:color w:val="1E293B"/>
           <w:sz w:val="20"/>
         </w:rPr>
-        <w:t>Gate 1 Admin Screening memverifikasi kelengkapan formal surat permohonan dan naskah akademik sebelum menugaskan Verifikator.</w:t>
+        <w:t>Penapisan Tahap 1 memverifikasi kelengkapan formalitas surat permohonan dan naskah akademik sebelum berkas didistribusikan ke Verifikator:</w:t>
       </w:r>
     </w:p>
     <w:p>
@@ -9339,7 +9236,7 @@
       <w:r>
         <w:drawing>
           <wp:inline xmlns:a="http://schemas.openxmlformats.org/drawingml/2006/main" xmlns:pic="http://schemas.openxmlformats.org/drawingml/2006/picture">
-            <wp:extent cx="5760720" cy="3780472"/>
+            <wp:extent cx="5760720" cy="3240405"/>
             <wp:docPr id="9" name="Picture 9"/>
             <wp:cNvGraphicFramePr>
               <a:graphicFrameLocks noChangeAspect="1"/>
@@ -9360,7 +9257,7 @@
                   <pic:spPr>
                     <a:xfrm>
                       <a:off x="0" y="0"/>
-                      <a:ext cx="5760720" cy="3780472"/>
+                      <a:ext cx="5760720" cy="3240405"/>
                     </a:xfrm>
                     <a:prstGeom prst="rect"/>
                   </pic:spPr>
@@ -9383,7 +9280,7 @@
           <w:color w:val="475569"/>
           <w:sz w:val="18"/>
         </w:rPr>
-        <w:t>Gambar 9: Diagram Alir Kerja Penapisan Administratif (Gate 1 Admin Screening)</w:t>
+        <w:t>Gambar 9: Diagram Alir Penapisan Administratif (Tahap 1 Admin Screening)</w:t>
       </w:r>
     </w:p>
     <w:p>
@@ -9398,7 +9295,7 @@
           <w:color w:val="0B2A4A"/>
           <w:sz w:val="28"/>
         </w:rPr>
-        <w:t>BAB 11 — TELAAH SUBSTANTIF TAHAP 2 (GATE 2 VERIFIER)</w:t>
+        <w:t>BAB 11 — TELAAH SUBSTANTIF TAHAP 2 (GATE 2 VERIFIKATOR)</w:t>
       </w:r>
     </w:p>
     <w:p>
@@ -9411,7 +9308,7 @@
           <w:color w:val="1E293B"/>
           <w:sz w:val="20"/>
         </w:rPr>
-        <w:t>Gate 2 Verifier Workspace mengevaluasi beban kerja organisasi, formasi ASN, menandatangani pengesahan SK resmi, dan mengeksekusi promosi data.</w:t>
+        <w:t>Telaah Tahap 2 mengevaluasi beban kerja organisasi, formasi ASN, menandatangani pengesahan SK resmi, dan mempromosikan data ke master aktif:</w:t>
       </w:r>
     </w:p>
     <w:p>
@@ -9423,7 +9320,7 @@
       <w:r>
         <w:drawing>
           <wp:inline xmlns:a="http://schemas.openxmlformats.org/drawingml/2006/main" xmlns:pic="http://schemas.openxmlformats.org/drawingml/2006/picture">
-            <wp:extent cx="5760720" cy="3780472"/>
+            <wp:extent cx="5760720" cy="3240405"/>
             <wp:docPr id="10" name="Picture 10"/>
             <wp:cNvGraphicFramePr>
               <a:graphicFrameLocks noChangeAspect="1"/>
@@ -9444,7 +9341,7 @@
                   <pic:spPr>
                     <a:xfrm>
                       <a:off x="0" y="0"/>
-                      <a:ext cx="5760720" cy="3780472"/>
+                      <a:ext cx="5760720" cy="3240405"/>
                     </a:xfrm>
                     <a:prstGeom prst="rect"/>
                   </pic:spPr>
@@ -9467,7 +9364,7 @@
           <w:color w:val="475569"/>
           <w:sz w:val="18"/>
         </w:rPr>
-        <w:t>Gambar 10: Diagram Alir Kerja Telaah Substantif &amp; Pengesahan SK (Gate 2 Verifier Workspace)</w:t>
+        <w:t>Gambar 10: Diagram Alir Telaah Substantif &amp; Pengesahan SK (Tahap 2 Verifikator)</w:t>
       </w:r>
     </w:p>
     <w:p>
@@ -9482,7 +9379,7 @@
           <w:color w:val="0B2A4A"/>
           <w:sz w:val="28"/>
         </w:rPr>
-        <w:t>BAB 12 — ARSITEKTUR OTENTIKASI &amp; JWT</w:t>
+        <w:t>BAB 12 — ARSITEKTUR OTENTIKASI &amp; KEAMANAN SESI (JWT)</w:t>
       </w:r>
     </w:p>
     <w:p>
@@ -9495,7 +9392,7 @@
           <w:color w:val="1E293B"/>
           <w:sz w:val="20"/>
         </w:rPr>
-        <w:t>Alur autentikasi JWT mengelola siklus hidup token kriptografis dan verifikasi profil pengguna.</w:t>
+        <w:t>Siklus otentikasi mengelola penerbitan token digital, pengamanan sesi pengguna, dan perlindungan dari manipulasi hak akses:</w:t>
       </w:r>
     </w:p>
     <w:p>
@@ -9507,7 +9404,7 @@
       <w:r>
         <w:drawing>
           <wp:inline xmlns:a="http://schemas.openxmlformats.org/drawingml/2006/main" xmlns:pic="http://schemas.openxmlformats.org/drawingml/2006/picture">
-            <wp:extent cx="5760720" cy="3780472"/>
+            <wp:extent cx="5760720" cy="3240405"/>
             <wp:docPr id="11" name="Picture 11"/>
             <wp:cNvGraphicFramePr>
               <a:graphicFrameLocks noChangeAspect="1"/>
@@ -9528,7 +9425,7 @@
                   <pic:spPr>
                     <a:xfrm>
                       <a:off x="0" y="0"/>
-                      <a:ext cx="5760720" cy="3780472"/>
+                      <a:ext cx="5760720" cy="3240405"/>
                     </a:xfrm>
                     <a:prstGeom prst="rect"/>
                   </pic:spPr>
@@ -9551,7 +9448,7 @@
           <w:color w:val="475569"/>
           <w:sz w:val="18"/>
         </w:rPr>
-        <w:t>Gambar 11: Diagram Alur Otentikasi JWT dan Validasi Sesi Pengguna</w:t>
+        <w:t>Gambar 11: Diagram Alur Otentikasi Token Digital JWT dan Pengamanan Sesi</w:t>
       </w:r>
     </w:p>
     <w:p>
@@ -9566,7 +9463,7 @@
           <w:color w:val="0B2A4A"/>
           <w:sz w:val="28"/>
         </w:rPr>
-        <w:t>BAB 13 — OTORISASI ZERO-TRUST &amp; KEAMANAN SISTEM</w:t>
+        <w:t>BAB 13 — KEAMANAN SISTEM &amp; PROTEKSI DATA MULTI-INSTANSI</w:t>
       </w:r>
     </w:p>
     <w:p>
@@ -9579,7 +9476,7 @@
           <w:color w:val="1E293B"/>
           <w:sz w:val="20"/>
         </w:rPr>
-        <w:t>Backend CodeIgniter 4 AuthorizationService dan ScopeResolver bertindak sebagai otoritas mutlak pengendali izin dan proteksi BOLA/IDOR.</w:t>
+        <w:t>Layanan otorisasi pada backend CodeIgniter 4 bertindak sebagai pelindung mutlak yang memastikan operator hanya dapat mengakses data instansinya sendiri.</w:t>
       </w:r>
     </w:p>
     <w:p>
@@ -9594,7 +9491,7 @@
           <w:color w:val="0B2A4A"/>
           <w:sz w:val="28"/>
         </w:rPr>
-        <w:t>BAB 14 — DASHBOARD EKSEKUTIF &amp; PELAPORAN DATA</w:t>
+        <w:t>BAB 14 — DASHBOARD EKSEKUTIF &amp; PELAPORAN NASIONAL</w:t>
       </w:r>
     </w:p>
     <w:p>
@@ -9607,7 +9504,7 @@
           <w:color w:val="1E293B"/>
           <w:sz w:val="20"/>
         </w:rPr>
-        <w:t>Modul pelaporan menyajikan agregasi metrik kelembagaan nasional, status funnel usulan, serta layanan ekspor dataset CSV/JSON.</w:t>
+        <w:t>Modul pelaporan menyajikan agregasi capaian kelembagaan nasional, status antrean berkas, serta layanan unduh dokumen laporan resmi.</w:t>
       </w:r>
     </w:p>
     <w:p>
@@ -9622,7 +9519,7 @@
           <w:color w:val="0B2A4A"/>
           <w:sz w:val="28"/>
         </w:rPr>
-        <w:t>BAB 15 — FORENSIK AUDIT TRAIL</w:t>
+        <w:t>BAB 15 — FORENSIK AUDIT TRAIL (REKAM JEJAK TRANSAKSI)</w:t>
       </w:r>
     </w:p>
     <w:p>
@@ -9635,7 +9532,7 @@
           <w:color w:val="1E293B"/>
           <w:sz w:val="20"/>
         </w:rPr>
-        <w:t>Pencatatan rekam jejak append-only mutlak pada tabel audit_logs mendokumentasikan setiap aksi mutasi data secara transparan.</w:t>
+        <w:t>Pencatatan rekam jejak permanen pada tabel audit_logs mendokumentasikan setiap aksi mutasi data secara transparan untuk pengawasan pimpinan.</w:t>
       </w:r>
     </w:p>
     <w:p>
@@ -9650,7 +9547,7 @@
           <w:color w:val="0B2A4A"/>
           <w:sz w:val="28"/>
         </w:rPr>
-        <w:t>BAB 16 — SPESIFIKASI &amp; INTEGRASI REST API</w:t>
+        <w:t>BAB 16 — KATALOG LAYANAN API TERVERIFIKASI</w:t>
       </w:r>
     </w:p>
     <w:p>
@@ -9664,7 +9561,7 @@
           <w:color w:val="0B2A4A"/>
           <w:sz w:val="19"/>
         </w:rPr>
-        <w:t>Tabel 5: Katalog REST API Terverifikasi E-SKLD / SIGMA-K</w:t>
+        <w:t>Tabel 5: Katalog Layanan REST API Terverifikasi E-SKLD / SIGMA-K</w:t>
       </w:r>
     </w:p>
     <w:tbl>
@@ -9710,7 +9607,7 @@
                 <w:color w:val="FFFFFF"/>
                 <w:sz w:val="18"/>
               </w:rPr>
-              <w:t>Method</w:t>
+              <w:t>Metode</w:t>
             </w:r>
           </w:p>
         </w:tc>
@@ -9735,7 +9632,7 @@
                 <w:color w:val="FFFFFF"/>
                 <w:sz w:val="18"/>
               </w:rPr>
-              <w:t>Endpoint API</w:t>
+              <w:t>Alamat Endpoint API</w:t>
             </w:r>
           </w:p>
         </w:tc>
@@ -9760,7 +9657,7 @@
                 <w:color w:val="FFFFFF"/>
                 <w:sz w:val="18"/>
               </w:rPr>
-              <w:t>Modul / Fungsi</w:t>
+              <w:t>Fungsi Layanan</w:t>
             </w:r>
           </w:p>
         </w:tc>
@@ -9785,7 +9682,7 @@
                 <w:color w:val="FFFFFF"/>
                 <w:sz w:val="18"/>
               </w:rPr>
-              <w:t>Otorisasi &amp; Filter</w:t>
+              <w:t>Filter &amp; Keamanan</w:t>
             </w:r>
           </w:p>
         </w:tc>
@@ -9810,7 +9707,7 @@
                 <w:color w:val="FFFFFF"/>
                 <w:sz w:val="18"/>
               </w:rPr>
-              <w:t>Respons Payload</w:t>
+              <w:t>Hasil Respon Data</w:t>
             </w:r>
           </w:p>
         </w:tc>
@@ -9884,7 +9781,7 @@
                 <w:color w:val="1E293B"/>
                 <w:sz w:val="17"/>
               </w:rPr>
-              <w:t>Autentikasi Pengguna</w:t>
+              <w:t>Masuk Sistem (Login)</w:t>
             </w:r>
           </w:p>
         </w:tc>
@@ -9908,7 +9805,7 @@
                 <w:color w:val="1E293B"/>
                 <w:sz w:val="17"/>
               </w:rPr>
-              <w:t>Publik / Rate-Limited</w:t>
+              <w:t>Validasi NIP &amp; Sandi</w:t>
             </w:r>
           </w:p>
         </w:tc>
@@ -9932,7 +9829,7 @@
                 <w:color w:val="1E293B"/>
                 <w:sz w:val="17"/>
               </w:rPr>
-              <w:t>JWT Access Token &amp; User Info</w:t>
+              <w:t>Token Akses JWT &amp; Profil Pengguna</w:t>
             </w:r>
           </w:p>
         </w:tc>
@@ -10030,7 +9927,7 @@
                 <w:color w:val="1E293B"/>
                 <w:sz w:val="17"/>
               </w:rPr>
-              <w:t>Bearer JWT Auth</w:t>
+              <w:t>Pemeriksaan Token JWT</w:t>
             </w:r>
           </w:p>
         </w:tc>
@@ -10054,7 +9951,7 @@
                 <w:color w:val="1E293B"/>
                 <w:sz w:val="17"/>
               </w:rPr>
-              <w:t>Profil User, Role, Permissions, Scopes</w:t>
+              <w:t>Profil Pengguna, Peran, dan Wilayah Akses</w:t>
             </w:r>
           </w:p>
         </w:tc>
@@ -10128,7 +10025,7 @@
                 <w:color w:val="1E293B"/>
                 <w:sz w:val="17"/>
               </w:rPr>
-              <w:t>Pengakhiran Sesi</w:t>
+              <w:t>Keluar Sistem (Logout)</w:t>
             </w:r>
           </w:p>
         </w:tc>
@@ -10152,7 +10049,7 @@
                 <w:color w:val="1E293B"/>
                 <w:sz w:val="17"/>
               </w:rPr>
-              <w:t>Bearer JWT Auth</w:t>
+              <w:t>Pemeriksaan Token JWT</w:t>
             </w:r>
           </w:p>
         </w:tc>
@@ -10176,7 +10073,7 @@
                 <w:color w:val="1E293B"/>
                 <w:sz w:val="17"/>
               </w:rPr>
-              <w:t>Status sukses logout &amp; blacklist token</w:t>
+              <w:t>Status sukses keluar &amp; penonaktifan token</w:t>
             </w:r>
           </w:p>
         </w:tc>
@@ -10250,7 +10147,7 @@
                 <w:color w:val="1E293B"/>
                 <w:sz w:val="17"/>
               </w:rPr>
-              <w:t>Katalog K/L/D</w:t>
+              <w:t>Katalog Instansi K/L/D</w:t>
             </w:r>
           </w:p>
         </w:tc>
@@ -10274,7 +10171,7 @@
                 <w:color w:val="1E293B"/>
                 <w:sz w:val="17"/>
               </w:rPr>
-              <w:t>Bearer JWT Auth</w:t>
+              <w:t>Pemeriksaan Token JWT</w:t>
             </w:r>
           </w:p>
         </w:tc>
@@ -10298,7 +10195,7 @@
                 <w:color w:val="1E293B"/>
                 <w:sz w:val="17"/>
               </w:rPr>
-              <w:t>Array seluruh master data instansi</w:t>
+              <w:t>Daftar seluruh master instansi pemerintah</w:t>
             </w:r>
           </w:p>
         </w:tc>
@@ -10372,7 +10269,7 @@
                 <w:color w:val="1E293B"/>
                 <w:sz w:val="17"/>
               </w:rPr>
-              <w:t>Detail Instansi</w:t>
+              <w:t>Rincian Profil Instansi</w:t>
             </w:r>
           </w:p>
         </w:tc>
@@ -10396,7 +10293,7 @@
                 <w:color w:val="1E293B"/>
                 <w:sz w:val="17"/>
               </w:rPr>
-              <w:t>ScopeResolver Check</w:t>
+              <w:t>Pemeriksaan Wilayah Akses</w:t>
             </w:r>
           </w:p>
         </w:tc>
@@ -10420,7 +10317,7 @@
                 <w:color w:val="1E293B"/>
                 <w:sz w:val="17"/>
               </w:rPr>
-              <w:t>Objek instansi, tipe, dan rekap unit</w:t>
+              <w:t>Rincian profil, tipe, dan rekapitulasi unit</w:t>
             </w:r>
           </w:p>
         </w:tc>
@@ -10494,7 +10391,7 @@
                 <w:color w:val="1E293B"/>
                 <w:sz w:val="17"/>
               </w:rPr>
-              <w:t>Pohon Struktur Unit</w:t>
+              <w:t>Bagan Struktur Unit</w:t>
             </w:r>
           </w:p>
         </w:tc>
@@ -10518,7 +10415,7 @@
                 <w:color w:val="1E293B"/>
                 <w:sz w:val="17"/>
               </w:rPr>
-              <w:t>ScopeResolver Check</w:t>
+              <w:t>Pemeriksaan Wilayah Akses</w:t>
             </w:r>
           </w:p>
         </w:tc>
@@ -10542,7 +10439,7 @@
                 <w:color w:val="1E293B"/>
                 <w:sz w:val="17"/>
               </w:rPr>
-              <w:t>Recursive tree Adjacency List</w:t>
+              <w:t>Struktur pohon hierarkis unit kerja</w:t>
             </w:r>
           </w:p>
         </w:tc>
@@ -10640,7 +10537,7 @@
                 <w:color w:val="1E293B"/>
                 <w:sz w:val="17"/>
               </w:rPr>
-              <w:t>ScopeResolver Check</w:t>
+              <w:t>Pemeriksaan Wilayah Akses</w:t>
             </w:r>
           </w:p>
         </w:tc>
@@ -10664,7 +10561,7 @@
                 <w:color w:val="1E293B"/>
                 <w:sz w:val="17"/>
               </w:rPr>
-              <w:t>Detail unit, parent, &amp; daftar positions</w:t>
+              <w:t>Detail unit, induk, dan formasi jabatan</w:t>
             </w:r>
           </w:p>
         </w:tc>
@@ -10738,7 +10635,7 @@
                 <w:color w:val="1E293B"/>
                 <w:sz w:val="17"/>
               </w:rPr>
-              <w:t>Daftar Usulan</w:t>
+              <w:t>Daftar Usulan Berkas</w:t>
             </w:r>
           </w:p>
         </w:tc>
@@ -10762,7 +10659,7 @@
                 <w:color w:val="1E293B"/>
                 <w:sz w:val="17"/>
               </w:rPr>
-              <w:t>Role Scoped Filter</w:t>
+              <w:t>Filter Wilayah Pengguna</w:t>
             </w:r>
           </w:p>
         </w:tc>
@@ -10786,7 +10683,7 @@
                 <w:color w:val="1E293B"/>
                 <w:sz w:val="17"/>
               </w:rPr>
-              <w:t>Array usulan terfilter sesuai wewenang</w:t>
+              <w:t>Daftar usulan sesuai wewenang peran</w:t>
             </w:r>
           </w:p>
         </w:tc>
@@ -10884,7 +10781,7 @@
                 <w:color w:val="1E293B"/>
                 <w:sz w:val="17"/>
               </w:rPr>
-              <w:t>USER Role Guard</w:t>
+              <w:t>Khusus Operator Instansi</w:t>
             </w:r>
           </w:p>
         </w:tc>
@@ -10908,7 +10805,7 @@
                 <w:color w:val="1E293B"/>
                 <w:sz w:val="17"/>
               </w:rPr>
-              <w:t>Header draf usulan &amp; ID versi v1</w:t>
+              <w:t>Header draf usulan &amp; nomor versi draf 1</w:t>
             </w:r>
           </w:p>
         </w:tc>
@@ -11006,7 +10903,7 @@
                 <w:color w:val="1E293B"/>
                 <w:sz w:val="17"/>
               </w:rPr>
-              <w:t>ScopeResolver Check</w:t>
+              <w:t>Pemeriksaan Wilayah Akses</w:t>
             </w:r>
           </w:p>
         </w:tc>
@@ -11030,7 +10927,7 @@
                 <w:color w:val="1E293B"/>
                 <w:sz w:val="17"/>
               </w:rPr>
-              <w:t>Detail usulan, diff unit, jabatan, stepper</w:t>
+              <w:t>Detail usulan, komparasi unit &amp; jabatan</w:t>
             </w:r>
           </w:p>
         </w:tc>
@@ -11104,7 +11001,7 @@
                 <w:color w:val="1E293B"/>
                 <w:sz w:val="17"/>
               </w:rPr>
-              <w:t>Pengiriman ke Gate 1</w:t>
+              <w:t>Pengiriman ke Tahap 1</w:t>
             </w:r>
           </w:p>
         </w:tc>
@@ -11128,7 +11025,7 @@
                 <w:color w:val="1E293B"/>
                 <w:sz w:val="17"/>
               </w:rPr>
-              <w:t>Author Ownership Guard</w:t>
+              <w:t>Khusus Pemilik Usulan</w:t>
             </w:r>
           </w:p>
         </w:tc>
@@ -11152,7 +11049,7 @@
                 <w:color w:val="1E293B"/>
                 <w:sz w:val="17"/>
               </w:rPr>
-              <w:t>Status transisi SUBMITTED_TO_ADMIN</w:t>
+              <w:t>Perubahan status ke PENAPISAN ADMIN</w:t>
             </w:r>
           </w:p>
         </w:tc>
@@ -11226,7 +11123,7 @@
                 <w:color w:val="1E293B"/>
                 <w:sz w:val="17"/>
               </w:rPr>
-              <w:t>Gate 1 Admin Action</w:t>
+              <w:t>Tindakan Penapis Admin</w:t>
             </w:r>
           </w:p>
         </w:tc>
@@ -11250,7 +11147,7 @@
                 <w:color w:val="1E293B"/>
                 <w:sz w:val="17"/>
               </w:rPr>
-              <w:t>ADMIN Role Guard</w:t>
+              <w:t>Khusus Penapis Admin</w:t>
             </w:r>
           </w:p>
         </w:tc>
@@ -11274,7 +11171,7 @@
                 <w:color w:val="1E293B"/>
                 <w:sz w:val="17"/>
               </w:rPr>
-              <w:t>Accept / Return Revision status</w:t>
+              <w:t>Terima berkas atau kembalikan revisi</w:t>
             </w:r>
           </w:p>
         </w:tc>
@@ -11372,7 +11269,7 @@
                 <w:color w:val="1E293B"/>
                 <w:sz w:val="17"/>
               </w:rPr>
-              <w:t>ADMIN Role Guard</w:t>
+              <w:t>Khusus Penapis Admin</w:t>
             </w:r>
           </w:p>
         </w:tc>
@@ -11396,7 +11293,7 @@
                 <w:color w:val="1E293B"/>
                 <w:sz w:val="17"/>
               </w:rPr>
-              <w:t>Status transisi ASSIGNED_TO_VERIFIER</w:t>
+              <w:t>Perubahan status ke PENUGASAN VERIFIKATOR</w:t>
             </w:r>
           </w:p>
         </w:tc>
@@ -11494,7 +11391,7 @@
                 <w:color w:val="1E293B"/>
                 <w:sz w:val="17"/>
               </w:rPr>
-              <w:t>Assigned Verifier Guard</w:t>
+              <w:t>Khusus Verifikator Terpilih</w:t>
             </w:r>
           </w:p>
         </w:tc>
@@ -11518,7 +11415,7 @@
                 <w:color w:val="1E293B"/>
                 <w:sz w:val="17"/>
               </w:rPr>
-              <w:t>Catatan review &amp; status READY_FOR_DECISION</w:t>
+              <w:t>Input catatan telaah &amp; status SIAP PENGESAHAN</w:t>
             </w:r>
           </w:p>
         </w:tc>
@@ -11616,7 +11513,7 @@
                 <w:color w:val="1E293B"/>
                 <w:sz w:val="17"/>
               </w:rPr>
-              <w:t>VERIFIER Role Guard</w:t>
+              <w:t>Khusus Pejabat Verifikator</w:t>
             </w:r>
           </w:p>
         </w:tc>
@@ -11640,7 +11537,7 @@
                 <w:color w:val="1E293B"/>
                 <w:sz w:val="17"/>
               </w:rPr>
-              <w:t>Penerbitan SK &amp; status APPROVED</w:t>
+              <w:t>Penerbitan nomor SK &amp; status DISETUJUI</w:t>
             </w:r>
           </w:p>
         </w:tc>
@@ -11714,7 +11611,7 @@
                 <w:color w:val="1E293B"/>
                 <w:sz w:val="17"/>
               </w:rPr>
-              <w:t>Promosi Master Data</w:t>
+              <w:t>Promosi ke Master Data</w:t>
             </w:r>
           </w:p>
         </w:tc>
@@ -11738,7 +11635,7 @@
                 <w:color w:val="1E293B"/>
                 <w:sz w:val="17"/>
               </w:rPr>
-              <w:t>VERIFIER Role Guard</w:t>
+              <w:t>Khusus Pejabat Verifikator</w:t>
             </w:r>
           </w:p>
         </w:tc>
@@ -11762,7 +11659,7 @@
                 <w:color w:val="1E293B"/>
                 <w:sz w:val="17"/>
               </w:rPr>
-              <w:t>Eksekusi mutasi ke master data aktif</w:t>
+              <w:t>Pembaruan otomatis ke master data aktif</w:t>
             </w:r>
           </w:p>
         </w:tc>
@@ -11836,7 +11733,7 @@
                 <w:color w:val="1E293B"/>
                 <w:sz w:val="17"/>
               </w:rPr>
-              <w:t>Ringkasan Eksekutif</w:t>
+              <w:t>Ringkasan Pimpinan</w:t>
             </w:r>
           </w:p>
         </w:tc>
@@ -11860,7 +11757,7 @@
                 <w:color w:val="1E293B"/>
                 <w:sz w:val="17"/>
               </w:rPr>
-              <w:t>Bearer JWT Auth</w:t>
+              <w:t>Pemeriksaan Token JWT</w:t>
             </w:r>
           </w:p>
         </w:tc>
@@ -11884,7 +11781,7 @@
                 <w:color w:val="1E293B"/>
                 <w:sz w:val="17"/>
               </w:rPr>
-              <w:t>Metrik overview, funnel, SK terbaru</w:t>
+              <w:t>Metrik overview nasional, funnel, SK terbaru</w:t>
             </w:r>
           </w:p>
         </w:tc>
@@ -11958,7 +11855,7 @@
                 <w:color w:val="1E293B"/>
                 <w:sz w:val="17"/>
               </w:rPr>
-              <w:t>Ekspor Dataset</w:t>
+              <w:t>Ekspor Dokumen Laporan</w:t>
             </w:r>
           </w:p>
         </w:tc>
@@ -11982,7 +11879,7 @@
                 <w:color w:val="1E293B"/>
                 <w:sz w:val="17"/>
               </w:rPr>
-              <w:t>Scoped Permissions</w:t>
+              <w:t>Izin Khusus Ekspor</w:t>
             </w:r>
           </w:p>
         </w:tc>
@@ -12006,7 +11903,7 @@
                 <w:color w:val="1E293B"/>
                 <w:sz w:val="17"/>
               </w:rPr>
-              <w:t>File stream CSV / JSON dataset</w:t>
+              <w:t>Berkas unduhan resmi format CSV/JSON</w:t>
             </w:r>
           </w:p>
         </w:tc>
@@ -12104,7 +12001,7 @@
                 <w:color w:val="1E293B"/>
                 <w:sz w:val="17"/>
               </w:rPr>
-              <w:t>ADMIN / SUPER_ADMIN</w:t>
+              <w:t>Admin &amp; Super Admin</w:t>
             </w:r>
           </w:p>
         </w:tc>
@@ -12128,7 +12025,7 @@
                 <w:color w:val="1E293B"/>
                 <w:sz w:val="17"/>
               </w:rPr>
-              <w:t>Array rekam jejak mutasi &amp; diff JSON</w:t>
+              <w:t>Daftar transaksi mutasi data dan rincian perubahan</w:t>
             </w:r>
           </w:p>
         </w:tc>
@@ -12178,7 +12075,7 @@
       <w:r>
         <w:drawing>
           <wp:inline xmlns:a="http://schemas.openxmlformats.org/drawingml/2006/main" xmlns:pic="http://schemas.openxmlformats.org/drawingml/2006/picture">
-            <wp:extent cx="5760720" cy="3780472"/>
+            <wp:extent cx="5760720" cy="3240405"/>
             <wp:docPr id="12" name="Picture 12"/>
             <wp:cNvGraphicFramePr>
               <a:graphicFrameLocks noChangeAspect="1"/>
@@ -12199,7 +12096,7 @@
                   <pic:spPr>
                     <a:xfrm>
                       <a:off x="0" y="0"/>
-                      <a:ext cx="5760720" cy="3780472"/>
+                      <a:ext cx="5760720" cy="3240405"/>
                     </a:xfrm>
                     <a:prstGeom prst="rect"/>
                   </pic:spPr>
@@ -12237,7 +12134,7 @@
           <w:color w:val="1E40AF"/>
           <w:sz w:val="24"/>
         </w:rPr>
-        <w:t>17.2 SCR-01: Dashboard Eksekutif Kelembagaan</w:t>
+        <w:t>17.2 SCR-01: Dashboard Eksekutif Pimpinan</w:t>
       </w:r>
     </w:p>
     <w:p>
@@ -12249,7 +12146,7 @@
       <w:r>
         <w:drawing>
           <wp:inline xmlns:a="http://schemas.openxmlformats.org/drawingml/2006/main" xmlns:pic="http://schemas.openxmlformats.org/drawingml/2006/picture">
-            <wp:extent cx="5760720" cy="3780472"/>
+            <wp:extent cx="5760720" cy="3240405"/>
             <wp:docPr id="13" name="Picture 13"/>
             <wp:cNvGraphicFramePr>
               <a:graphicFrameLocks noChangeAspect="1"/>
@@ -12270,7 +12167,7 @@
                   <pic:spPr>
                     <a:xfrm>
                       <a:off x="0" y="0"/>
-                      <a:ext cx="5760720" cy="3780472"/>
+                      <a:ext cx="5760720" cy="3240405"/>
                     </a:xfrm>
                     <a:prstGeom prst="rect"/>
                   </pic:spPr>
@@ -12293,7 +12190,7 @@
           <w:color w:val="475569"/>
           <w:sz w:val="18"/>
         </w:rPr>
-        <w:t>Gambar 13: Prototype Dashboard Eksekutif Kelembagaan (SCR-01)</w:t>
+        <w:t>Gambar 13: Prototype Dashboard Eksekutif Pimpinan (SCR-01)</w:t>
       </w:r>
     </w:p>
     <w:p>
@@ -12320,7 +12217,7 @@
       <w:r>
         <w:drawing>
           <wp:inline xmlns:a="http://schemas.openxmlformats.org/drawingml/2006/main" xmlns:pic="http://schemas.openxmlformats.org/drawingml/2006/picture">
-            <wp:extent cx="5760720" cy="3780472"/>
+            <wp:extent cx="5760720" cy="3240405"/>
             <wp:docPr id="14" name="Picture 14"/>
             <wp:cNvGraphicFramePr>
               <a:graphicFrameLocks noChangeAspect="1"/>
@@ -12341,7 +12238,7 @@
                   <pic:spPr>
                     <a:xfrm>
                       <a:off x="0" y="0"/>
-                      <a:ext cx="5760720" cy="3780472"/>
+                      <a:ext cx="5760720" cy="3240405"/>
                     </a:xfrm>
                     <a:prstGeom prst="rect"/>
                   </pic:spPr>
@@ -12379,7 +12276,7 @@
           <w:color w:val="1E40AF"/>
           <w:sz w:val="24"/>
         </w:rPr>
-        <w:t>17.4 SCR-04: Bagan Struktur Organisasi Interaktif (React Flow)</w:t>
+        <w:t>17.4 SCR-04: Bagan Pohon Struktur Organisasi Interaktif</w:t>
       </w:r>
     </w:p>
     <w:p>
@@ -12391,7 +12288,7 @@
       <w:r>
         <w:drawing>
           <wp:inline xmlns:a="http://schemas.openxmlformats.org/drawingml/2006/main" xmlns:pic="http://schemas.openxmlformats.org/drawingml/2006/picture">
-            <wp:extent cx="5760720" cy="3780472"/>
+            <wp:extent cx="5760720" cy="3240405"/>
             <wp:docPr id="15" name="Picture 15"/>
             <wp:cNvGraphicFramePr>
               <a:graphicFrameLocks noChangeAspect="1"/>
@@ -12412,7 +12309,7 @@
                   <pic:spPr>
                     <a:xfrm>
                       <a:off x="0" y="0"/>
-                      <a:ext cx="5760720" cy="3780472"/>
+                      <a:ext cx="5760720" cy="3240405"/>
                     </a:xfrm>
                     <a:prstGeom prst="rect"/>
                   </pic:spPr>
@@ -12435,7 +12332,7 @@
           <w:color w:val="475569"/>
           <w:sz w:val="18"/>
         </w:rPr>
-        <w:t>Gambar 15: Prototype Bagan Struktur Organisasi Interaktif (SCR-04 React Flow Canvas)</w:t>
+        <w:t>Gambar 15: Prototype Bagan Pohon Struktur Organisasi Interaktif (SCR-04)</w:t>
       </w:r>
     </w:p>
     <w:p>
@@ -12450,7 +12347,7 @@
           <w:color w:val="1E40AF"/>
           <w:sz w:val="24"/>
         </w:rPr>
-        <w:t>17.5 SCR-09: Rincian Usulan &amp; Diff Viewer</w:t>
+        <w:t>17.5 SCR-09: Rincian Usulan &amp; Pelacak Perubahan (Diff)</w:t>
       </w:r>
     </w:p>
     <w:p>
@@ -12462,7 +12359,7 @@
       <w:r>
         <w:drawing>
           <wp:inline xmlns:a="http://schemas.openxmlformats.org/drawingml/2006/main" xmlns:pic="http://schemas.openxmlformats.org/drawingml/2006/picture">
-            <wp:extent cx="5760720" cy="3780472"/>
+            <wp:extent cx="5760720" cy="3240405"/>
             <wp:docPr id="16" name="Picture 16"/>
             <wp:cNvGraphicFramePr>
               <a:graphicFrameLocks noChangeAspect="1"/>
@@ -12483,7 +12380,7 @@
                   <pic:spPr>
                     <a:xfrm>
                       <a:off x="0" y="0"/>
-                      <a:ext cx="5760720" cy="3780472"/>
+                      <a:ext cx="5760720" cy="3240405"/>
                     </a:xfrm>
                     <a:prstGeom prst="rect"/>
                   </pic:spPr>
@@ -12506,7 +12403,7 @@
           <w:color w:val="475569"/>
           <w:sz w:val="18"/>
         </w:rPr>
-        <w:t>Gambar 16: Prototype Rincian Usulan &amp; Diff Viewer (SCR-09)</w:t>
+        <w:t>Gambar 16: Prototype Rincian Usulan &amp; Pelacak Perubahan (SCR-09 Diff Viewer)</w:t>
       </w:r>
     </w:p>
     <w:p>
@@ -12521,7 +12418,7 @@
           <w:color w:val="1E40AF"/>
           <w:sz w:val="24"/>
         </w:rPr>
-        <w:t>17.6 SCR-12: Ruang Kerja Telaah Substantif Verifikator</w:t>
+        <w:t>17.6 SCR-12: Ruang Kerja Telaah Verifikator</w:t>
       </w:r>
     </w:p>
     <w:p>
@@ -12533,7 +12430,7 @@
       <w:r>
         <w:drawing>
           <wp:inline xmlns:a="http://schemas.openxmlformats.org/drawingml/2006/main" xmlns:pic="http://schemas.openxmlformats.org/drawingml/2006/picture">
-            <wp:extent cx="5760720" cy="3780472"/>
+            <wp:extent cx="5760720" cy="3240405"/>
             <wp:docPr id="17" name="Picture 17"/>
             <wp:cNvGraphicFramePr>
               <a:graphicFrameLocks noChangeAspect="1"/>
@@ -12554,7 +12451,7 @@
                   <pic:spPr>
                     <a:xfrm>
                       <a:off x="0" y="0"/>
-                      <a:ext cx="5760720" cy="3780472"/>
+                      <a:ext cx="5760720" cy="3240405"/>
                     </a:xfrm>
                     <a:prstGeom prst="rect"/>
                   </pic:spPr>
@@ -12592,7 +12489,7 @@
           <w:color w:val="1E40AF"/>
           <w:sz w:val="24"/>
         </w:rPr>
-        <w:t>17.7 SCR-15: Intelijensi Data &amp; Postur ASN (Analytics Studio)</w:t>
+        <w:t>17.7 SCR-15: Intelijensi Data &amp; Postur ASN</w:t>
       </w:r>
     </w:p>
     <w:p>
@@ -12604,7 +12501,7 @@
       <w:r>
         <w:drawing>
           <wp:inline xmlns:a="http://schemas.openxmlformats.org/drawingml/2006/main" xmlns:pic="http://schemas.openxmlformats.org/drawingml/2006/picture">
-            <wp:extent cx="5760720" cy="3780472"/>
+            <wp:extent cx="5760720" cy="3240405"/>
             <wp:docPr id="18" name="Picture 18"/>
             <wp:cNvGraphicFramePr>
               <a:graphicFrameLocks noChangeAspect="1"/>
@@ -12625,7 +12522,7 @@
                   <pic:spPr>
                     <a:xfrm>
                       <a:off x="0" y="0"/>
-                      <a:ext cx="5760720" cy="3780472"/>
+                      <a:ext cx="5760720" cy="3240405"/>
                     </a:xfrm>
                     <a:prstGeom prst="rect"/>
                   </pic:spPr>
@@ -12675,7 +12572,7 @@
       <w:r>
         <w:drawing>
           <wp:inline xmlns:a="http://schemas.openxmlformats.org/drawingml/2006/main" xmlns:pic="http://schemas.openxmlformats.org/drawingml/2006/picture">
-            <wp:extent cx="5760720" cy="3780472"/>
+            <wp:extent cx="5760720" cy="3240405"/>
             <wp:docPr id="19" name="Picture 19"/>
             <wp:cNvGraphicFramePr>
               <a:graphicFrameLocks noChangeAspect="1"/>
@@ -12696,7 +12593,7 @@
                   <pic:spPr>
                     <a:xfrm>
                       <a:off x="0" y="0"/>
-                      <a:ext cx="5760720" cy="3780472"/>
+                      <a:ext cx="5760720" cy="3240405"/>
                     </a:xfrm>
                     <a:prstGeom prst="rect"/>
                   </pic:spPr>
@@ -12748,7 +12645,7 @@
           <w:color w:val="0B2A4A"/>
           <w:sz w:val="19"/>
         </w:rPr>
-        <w:t>Tabel 6: Hasil Pengujian &amp; Validasi Kualitas Sistem SIGMA-K</w:t>
+        <w:t>Tabel 6: Hasil Pengujian Kualitas dan Keandalan Sistem SIGMA-K</w:t>
       </w:r>
     </w:p>
     <w:tbl>
@@ -12794,7 +12691,7 @@
                 <w:color w:val="FFFFFF"/>
                 <w:sz w:val="18"/>
               </w:rPr>
-              <w:t>Lapisan Pengujian</w:t>
+              <w:t>Kelompok Pengujian</w:t>
             </w:r>
           </w:p>
         </w:tc>
@@ -12819,7 +12716,7 @@
                 <w:color w:val="FFFFFF"/>
                 <w:sz w:val="18"/>
               </w:rPr>
-              <w:t>Runner / Tool</w:t>
+              <w:t>Alat Pengujian</w:t>
             </w:r>
           </w:p>
         </w:tc>
@@ -12869,7 +12766,7 @@
                 <w:color w:val="FFFFFF"/>
                 <w:sz w:val="18"/>
               </w:rPr>
-              <w:t>Target Assertion</w:t>
+              <w:t>Target Pengujian</w:t>
             </w:r>
           </w:p>
         </w:tc>
@@ -12894,7 +12791,7 @@
                 <w:color w:val="FFFFFF"/>
                 <w:sz w:val="18"/>
               </w:rPr>
-              <w:t>Hasil Validasi</w:t>
+              <w:t>Hasil Pengujian</w:t>
             </w:r>
           </w:p>
         </w:tc>
@@ -12920,7 +12817,7 @@
                 <w:color w:val="1E293B"/>
                 <w:sz w:val="17"/>
               </w:rPr>
-              <w:t>Frontend Foundation (14A)</w:t>
+              <w:t>Fondasi Frontend (14A)</w:t>
             </w:r>
           </w:p>
         </w:tc>
@@ -12968,7 +12865,7 @@
                 <w:color w:val="1E293B"/>
                 <w:sz w:val="17"/>
               </w:rPr>
-              <w:t>HTTP Client, AppError, DTO Mappers</w:t>
+              <w:t>Klien Jaringan, Penanganan Galat, Pemetaan Data</w:t>
             </w:r>
           </w:p>
         </w:tc>
@@ -12992,7 +12889,7 @@
                 <w:color w:val="1E293B"/>
                 <w:sz w:val="17"/>
               </w:rPr>
-              <w:t>28 Tests</w:t>
+              <w:t>28 Pengujian</w:t>
             </w:r>
           </w:p>
         </w:tc>
@@ -13042,7 +12939,7 @@
                 <w:color w:val="1E293B"/>
                 <w:sz w:val="17"/>
               </w:rPr>
-              <w:t>Frontend Auth &amp; Security (14B)</w:t>
+              <w:t>Autentikasi &amp; Keamanan (14B)</w:t>
             </w:r>
           </w:p>
         </w:tc>
@@ -13090,7 +12987,7 @@
                 <w:color w:val="1E293B"/>
                 <w:sz w:val="17"/>
               </w:rPr>
-              <w:t>JWT Lifecycle, Zero-Trust Role Lock</w:t>
+              <w:t>Siklus Token JWT, Penguncian Peran</w:t>
             </w:r>
           </w:p>
         </w:tc>
@@ -13114,7 +13011,7 @@
                 <w:color w:val="1E293B"/>
                 <w:sz w:val="17"/>
               </w:rPr>
-              <w:t>24 Tests</w:t>
+              <w:t>24 Pengujian</w:t>
             </w:r>
           </w:p>
         </w:tc>
@@ -13164,7 +13061,7 @@
                 <w:color w:val="1E293B"/>
                 <w:sz w:val="17"/>
               </w:rPr>
-              <w:t>Frontend Master Data (14C)</w:t>
+              <w:t>Master Data Instansi (14C)</w:t>
             </w:r>
           </w:p>
         </w:tc>
@@ -13212,7 +13109,7 @@
                 <w:color w:val="1E293B"/>
                 <w:sz w:val="17"/>
               </w:rPr>
-              <w:t>Instansi, DFS Tree Flattening, Unit Detail</w:t>
+              <w:t>Katalog K/L/D, Pohon Hierarki, Rincian Unit</w:t>
             </w:r>
           </w:p>
         </w:tc>
@@ -13236,7 +13133,7 @@
                 <w:color w:val="1E293B"/>
                 <w:sz w:val="17"/>
               </w:rPr>
-              <w:t>24 Tests</w:t>
+              <w:t>24 Pengujian</w:t>
             </w:r>
           </w:p>
         </w:tc>
@@ -13286,7 +13183,7 @@
                 <w:color w:val="1E293B"/>
                 <w:sz w:val="17"/>
               </w:rPr>
-              <w:t>Frontend Executive Reports (14D)</w:t>
+              <w:t>Laporan Eksekutif (14D)</w:t>
             </w:r>
           </w:p>
         </w:tc>
@@ -13334,7 +13231,7 @@
                 <w:color w:val="1E293B"/>
                 <w:sz w:val="17"/>
               </w:rPr>
-              <w:t>Summary KPI, Funnel, CSV Export Stream</w:t>
+              <w:t>Ringkasan Metrik, Funnel, Unduh Berkas CSV</w:t>
             </w:r>
           </w:p>
         </w:tc>
@@ -13358,7 +13255,7 @@
                 <w:color w:val="1E293B"/>
                 <w:sz w:val="17"/>
               </w:rPr>
-              <w:t>29 Tests</w:t>
+              <w:t>29 Pengujian</w:t>
             </w:r>
           </w:p>
         </w:tc>
@@ -13408,7 +13305,7 @@
                 <w:color w:val="1E293B"/>
                 <w:sz w:val="17"/>
               </w:rPr>
-              <w:t>Total Frontend Composite Suite</w:t>
+              <w:t>Total Pengujian Frontend</w:t>
             </w:r>
           </w:p>
         </w:tc>
@@ -13456,7 +13353,7 @@
                 <w:color w:val="1E293B"/>
                 <w:sz w:val="17"/>
               </w:rPr>
-              <w:t>Seluruh Domain Integrasi Frontend</w:t>
+              <w:t>Seluruh Modul Antarmuka Web</w:t>
             </w:r>
           </w:p>
         </w:tc>
@@ -13480,7 +13377,7 @@
                 <w:color w:val="1E293B"/>
                 <w:sz w:val="17"/>
               </w:rPr>
-              <w:t>105 Tests</w:t>
+              <w:t>105 Pengujian</w:t>
             </w:r>
           </w:p>
         </w:tc>
@@ -13530,7 +13427,7 @@
                 <w:color w:val="1E293B"/>
                 <w:sz w:val="17"/>
               </w:rPr>
-              <w:t>Backend Unit &amp; Integration Suite</w:t>
+              <w:t>Pengujian Backend Server</w:t>
             </w:r>
           </w:p>
         </w:tc>
@@ -13578,7 +13475,7 @@
                 <w:color w:val="1E293B"/>
                 <w:sz w:val="17"/>
               </w:rPr>
-              <w:t>Zero-Trust, FSM Workflow, Gate 1 &amp; 2, Audit</w:t>
+              <w:t>Otorisasi, Alur Pengusulan, Tahap 1 &amp; 2, Log Audit</w:t>
             </w:r>
           </w:p>
         </w:tc>
@@ -13602,7 +13499,7 @@
                 <w:color w:val="1E293B"/>
                 <w:sz w:val="17"/>
               </w:rPr>
-              <w:t>198 Tests / 713 Assertions</w:t>
+              <w:t>198 Pengujian / 713 Poin</w:t>
             </w:r>
           </w:p>
         </w:tc>
@@ -13652,7 +13549,7 @@
                 <w:color w:val="1E293B"/>
                 <w:sz w:val="17"/>
               </w:rPr>
-              <w:t>TypeScript Strict Type Check</w:t>
+              <w:t>Pemeriksaan Tipe TypeScript</w:t>
             </w:r>
           </w:p>
         </w:tc>
@@ -13700,7 +13597,7 @@
                 <w:color w:val="1E293B"/>
                 <w:sz w:val="17"/>
               </w:rPr>
-              <w:t>Seluruh Komponen, Services &amp; DTO</w:t>
+              <w:t>Seluruh Komponen, Layanan &amp; Skema Data</w:t>
             </w:r>
           </w:p>
         </w:tc>
@@ -13724,7 +13621,7 @@
                 <w:color w:val="1E293B"/>
                 <w:sz w:val="17"/>
               </w:rPr>
-              <w:t>0 Type Errors</w:t>
+              <w:t>0 Kesalahan Tipe</w:t>
             </w:r>
           </w:p>
         </w:tc>
@@ -13774,7 +13671,7 @@
                 <w:color w:val="1E293B"/>
                 <w:sz w:val="17"/>
               </w:rPr>
-              <w:t>ESLint Code Style Analysis</w:t>
+              <w:t>Analisis Kualitas Kode (ESLint)</w:t>
             </w:r>
           </w:p>
         </w:tc>
@@ -13822,7 +13719,7 @@
                 <w:color w:val="1E293B"/>
                 <w:sz w:val="17"/>
               </w:rPr>
-              <w:t>Standar Kualitas &amp; Kebersihan Kode</w:t>
+              <w:t>Standar Kerapian &amp; Kebersihan Kode</w:t>
             </w:r>
           </w:p>
         </w:tc>
@@ -13846,7 +13743,7 @@
                 <w:color w:val="1E293B"/>
                 <w:sz w:val="17"/>
               </w:rPr>
-              <w:t>0 Warning / 0 Error</w:t>
+              <w:t>0 Peringatan / 0 Galat</w:t>
             </w:r>
           </w:p>
         </w:tc>
@@ -13896,7 +13793,7 @@
                 <w:color w:val="1E293B"/>
                 <w:sz w:val="17"/>
               </w:rPr>
-              <w:t>Next.js Production Build</w:t>
+              <w:t>Kompilasi Rute Produksi</w:t>
             </w:r>
           </w:p>
         </w:tc>
@@ -13944,7 +13841,7 @@
                 <w:color w:val="1E293B"/>
                 <w:sz w:val="17"/>
               </w:rPr>
-              <w:t>Kompilasi 16 Route Aplikasi</w:t>
+              <w:t>Kompilasi 16 Halaman Aplikasi</w:t>
             </w:r>
           </w:p>
         </w:tc>
@@ -13968,7 +13865,7 @@
                 <w:color w:val="1E293B"/>
                 <w:sz w:val="17"/>
               </w:rPr>
-              <w:t>16 Routes Compiled</w:t>
+              <w:t>16 Rute Berhasil</w:t>
             </w:r>
           </w:p>
         </w:tc>
@@ -14015,7 +13912,7 @@
           <w:color w:val="0B2A4A"/>
           <w:sz w:val="28"/>
         </w:rPr>
-        <w:t>BAB 19 — STATUS MATRIKS IMPLEMENTASI FITUR</w:t>
+        <w:t>BAB 19 — MATRIKS KESIAPAN FITUR APLIKASI</w:t>
       </w:r>
     </w:p>
     <w:p>
@@ -14029,7 +13926,7 @@
           <w:color w:val="0B2A4A"/>
           <w:sz w:val="19"/>
         </w:rPr>
-        <w:t>Tabel 7: Matriks Status Implementasi Fitur E-SKLD / SIGMA-K</w:t>
+        <w:t>Tabel 7: Matriks Kesiapan Implementasi Fitur E-SKLD / SIGMA-K</w:t>
       </w:r>
     </w:p>
     <w:tbl>
@@ -14075,7 +13972,7 @@
                 <w:color w:val="FFFFFF"/>
                 <w:sz w:val="18"/>
               </w:rPr>
-              <w:t>Modul / Fitur</w:t>
+              <w:t>Fitur / Modul Layanan</w:t>
             </w:r>
           </w:p>
         </w:tc>
@@ -14125,7 +14022,7 @@
                 <w:color w:val="FFFFFF"/>
                 <w:sz w:val="18"/>
               </w:rPr>
-              <w:t>Cakupan Backend</w:t>
+              <w:t>Kesiapan Server</w:t>
             </w:r>
           </w:p>
         </w:tc>
@@ -14150,7 +14047,7 @@
                 <w:color w:val="FFFFFF"/>
                 <w:sz w:val="18"/>
               </w:rPr>
-              <w:t>Cakupan Frontend</w:t>
+              <w:t>Kesiapan Web</w:t>
             </w:r>
           </w:p>
         </w:tc>
@@ -14175,7 +14072,7 @@
                 <w:color w:val="FFFFFF"/>
                 <w:sz w:val="18"/>
               </w:rPr>
-              <w:t>Keterangan Verifikasi</w:t>
+              <w:t>Keterangan Validasi</w:t>
             </w:r>
           </w:p>
         </w:tc>
@@ -14201,7 +14098,7 @@
                 <w:color w:val="1E293B"/>
                 <w:sz w:val="17"/>
               </w:rPr>
-              <w:t>Autentikasi &amp; JWT</w:t>
+              <w:t>Masuk &amp; Otentikasi Sesi</w:t>
             </w:r>
           </w:p>
         </w:tc>
@@ -14225,7 +14122,7 @@
                 <w:color w:val="1E293B"/>
                 <w:sz w:val="17"/>
               </w:rPr>
-              <w:t>COMPLETED</w:t>
+              <w:t>SELESAI (100%)</w:t>
             </w:r>
           </w:p>
         </w:tc>
@@ -14297,7 +14194,7 @@
                 <w:color w:val="1E293B"/>
                 <w:sz w:val="17"/>
               </w:rPr>
-              <w:t>Token lifecycle &amp; profile terverifikasi</w:t>
+              <w:t>Token digital &amp; profil terverifikasi penuh</w:t>
             </w:r>
           </w:p>
         </w:tc>
@@ -14323,7 +14220,7 @@
                 <w:color w:val="1E293B"/>
                 <w:sz w:val="17"/>
               </w:rPr>
-              <w:t>Otorisasi Zero-Trust</w:t>
+              <w:t>Otorisasi &amp; Pembatasan Akses</w:t>
             </w:r>
           </w:p>
         </w:tc>
@@ -14347,7 +14244,7 @@
                 <w:color w:val="1E293B"/>
                 <w:sz w:val="17"/>
               </w:rPr>
-              <w:t>COMPLETED</w:t>
+              <w:t>SELESAI (100%)</w:t>
             </w:r>
           </w:p>
         </w:tc>
@@ -14395,7 +14292,7 @@
                 <w:color w:val="1E293B"/>
                 <w:sz w:val="17"/>
               </w:rPr>
-              <w:t>Read-Only Role Badge</w:t>
+              <w:t>Penguncian Peran Otomatis</w:t>
             </w:r>
           </w:p>
         </w:tc>
@@ -14419,7 +14316,7 @@
                 <w:color w:val="1E293B"/>
                 <w:sz w:val="17"/>
               </w:rPr>
-              <w:t>BOLA/IDOR protection &amp; role lock aktif</w:t>
+              <w:t>Perlindungan data antar instansi aktif</w:t>
             </w:r>
           </w:p>
         </w:tc>
@@ -14445,7 +14342,7 @@
                 <w:color w:val="1E293B"/>
                 <w:sz w:val="17"/>
               </w:rPr>
-              <w:t>Master Data Instansi</w:t>
+              <w:t>Katalog Master Instansi</w:t>
             </w:r>
           </w:p>
         </w:tc>
@@ -14469,7 +14366,7 @@
                 <w:color w:val="1E293B"/>
                 <w:sz w:val="17"/>
               </w:rPr>
-              <w:t>COMPLETED</w:t>
+              <w:t>SELESAI (100%)</w:t>
             </w:r>
           </w:p>
         </w:tc>
@@ -14517,7 +14414,7 @@
                 <w:color w:val="1E293B"/>
                 <w:sz w:val="17"/>
               </w:rPr>
-              <w:t>InstitutionService + Catalog UI</w:t>
+              <w:t>InstitutionService + Katalog UI</w:t>
             </w:r>
           </w:p>
         </w:tc>
@@ -14541,7 +14438,7 @@
                 <w:color w:val="1E293B"/>
                 <w:sz w:val="17"/>
               </w:rPr>
-              <w:t>Katalog K/L/D &amp; profil terintegrasi</w:t>
+              <w:t>Katalog K/L/D &amp; profil terintegrasi penuh</w:t>
             </w:r>
           </w:p>
         </w:tc>
@@ -14567,7 +14464,7 @@
                 <w:color w:val="1E293B"/>
                 <w:sz w:val="17"/>
               </w:rPr>
-              <w:t>Struktur Organisasi</w:t>
+              <w:t>Bagan Pohon Organisasi</w:t>
             </w:r>
           </w:p>
         </w:tc>
@@ -14591,7 +14488,7 @@
                 <w:color w:val="1E293B"/>
                 <w:sz w:val="17"/>
               </w:rPr>
-              <w:t>COMPLETED</w:t>
+              <w:t>SELESAI (100%)</w:t>
             </w:r>
           </w:p>
         </w:tc>
@@ -14615,7 +14512,7 @@
                 <w:color w:val="1E293B"/>
                 <w:sz w:val="17"/>
               </w:rPr>
-              <w:t>OrgHierarchyService (DFS Tree)</w:t>
+              <w:t>OrgHierarchyService (Pohon Hierarkis)</w:t>
             </w:r>
           </w:p>
         </w:tc>
@@ -14639,7 +14536,7 @@
                 <w:color w:val="1E293B"/>
                 <w:sz w:val="17"/>
               </w:rPr>
-              <w:t>React Flow Canvas Interactive</w:t>
+              <w:t>Bagan Interaktif Visual</w:t>
             </w:r>
           </w:p>
         </w:tc>
@@ -14663,7 +14560,7 @@
                 <w:color w:val="1E293B"/>
                 <w:sz w:val="17"/>
               </w:rPr>
-              <w:t>Visualisasi graf pohon &amp; drawer aktif</w:t>
+              <w:t>Bagan pohon &amp; panel rincian aktif</w:t>
             </w:r>
           </w:p>
         </w:tc>
@@ -14689,7 +14586,7 @@
                 <w:color w:val="1E293B"/>
                 <w:sz w:val="17"/>
               </w:rPr>
-              <w:t>Drafting Usulan</w:t>
+              <w:t>Penyusunan Usulan Baru</w:t>
             </w:r>
           </w:p>
         </w:tc>
@@ -14713,7 +14610,7 @@
                 <w:color w:val="1E293B"/>
                 <w:sz w:val="17"/>
               </w:rPr>
-              <w:t>COMPLETED</w:t>
+              <w:t>SELESAI (100%)</w:t>
             </w:r>
           </w:p>
         </w:tc>
@@ -14785,7 +14682,7 @@
                 <w:color w:val="1E293B"/>
                 <w:sz w:val="17"/>
               </w:rPr>
-              <w:t>Penyusunan usulan unit &amp; jabatan aktif</w:t>
+              <w:t>Penyusunan unit &amp; jabatan aktif</w:t>
             </w:r>
           </w:p>
         </w:tc>
@@ -14811,7 +14708,7 @@
                 <w:color w:val="1E293B"/>
                 <w:sz w:val="17"/>
               </w:rPr>
-              <w:t>Snapshot Versioning</w:t>
+              <w:t>Perekaman Riwayat Versi</w:t>
             </w:r>
           </w:p>
         </w:tc>
@@ -14835,7 +14732,7 @@
                 <w:color w:val="1E293B"/>
                 <w:sz w:val="17"/>
               </w:rPr>
-              <w:t>COMPLETED</w:t>
+              <w:t>SELESAI (100%)</w:t>
             </w:r>
           </w:p>
         </w:tc>
@@ -14859,7 +14756,7 @@
                 <w:color w:val="1E293B"/>
                 <w:sz w:val="17"/>
               </w:rPr>
-              <w:t>submission_versions (v1-&gt;v2)</w:t>
+              <w:t>Tabel submission_versions (v1-&gt;v2)</w:t>
             </w:r>
           </w:p>
         </w:tc>
@@ -14883,7 +14780,7 @@
                 <w:color w:val="1E293B"/>
                 <w:sz w:val="17"/>
               </w:rPr>
-              <w:t>DiffViewer Before-After</w:t>
+              <w:t>Penampil Perubahan (Diff)</w:t>
             </w:r>
           </w:p>
         </w:tc>
@@ -14907,7 +14804,7 @@
                 <w:color w:val="1E293B"/>
                 <w:sz w:val="17"/>
               </w:rPr>
-              <w:t>Immutabilitas data &amp; audit diff aktif</w:t>
+              <w:t>Penguncian draf historis aktif</w:t>
             </w:r>
           </w:p>
         </w:tc>
@@ -14933,7 +14830,7 @@
                 <w:color w:val="1E293B"/>
                 <w:sz w:val="17"/>
               </w:rPr>
-              <w:t>Gate 1 Admin Screening</w:t>
+              <w:t>Penapisan Tahap 1 (Admin)</w:t>
             </w:r>
           </w:p>
         </w:tc>
@@ -14957,7 +14854,7 @@
                 <w:color w:val="1E293B"/>
                 <w:sz w:val="17"/>
               </w:rPr>
-              <w:t>COMPLETED</w:t>
+              <w:t>SELESAI (100%)</w:t>
             </w:r>
           </w:p>
         </w:tc>
@@ -15005,7 +14902,7 @@
                 <w:color w:val="1E293B"/>
                 <w:sz w:val="17"/>
               </w:rPr>
-              <w:t>Gate 1 Verification Workspace</w:t>
+              <w:t>Ruang Kerja Penapisan</w:t>
             </w:r>
           </w:p>
         </w:tc>
@@ -15029,7 +14926,7 @@
                 <w:color w:val="1E293B"/>
                 <w:sz w:val="17"/>
               </w:rPr>
-              <w:t>Penapisan berkas &amp; alokasi verifikator</w:t>
+              <w:t>Pemeriksaan formalitas &amp; penugasan Verifikator</w:t>
             </w:r>
           </w:p>
         </w:tc>
@@ -15055,7 +14952,7 @@
                 <w:color w:val="1E293B"/>
                 <w:sz w:val="17"/>
               </w:rPr>
-              <w:t>Gate 2 Verifier Review</w:t>
+              <w:t>Telaah Tahap 2 (Verifikator)</w:t>
             </w:r>
           </w:p>
         </w:tc>
@@ -15079,7 +14976,7 @@
                 <w:color w:val="1E293B"/>
                 <w:sz w:val="17"/>
               </w:rPr>
-              <w:t>COMPLETED</w:t>
+              <w:t>SELESAI (100%)</w:t>
             </w:r>
           </w:p>
         </w:tc>
@@ -15127,7 +15024,7 @@
                 <w:color w:val="1E293B"/>
                 <w:sz w:val="17"/>
               </w:rPr>
-              <w:t>Gate 2 Verifier Workspace</w:t>
+              <w:t>Ruang Kerja Verifikator</w:t>
             </w:r>
           </w:p>
         </w:tc>
@@ -15151,7 +15048,7 @@
                 <w:color w:val="1E293B"/>
                 <w:sz w:val="17"/>
               </w:rPr>
-              <w:t>Telaah substantif &amp; rekomendasi aktif</w:t>
+              <w:t>Telaah beban kerja &amp; catatan teknis aktif</w:t>
             </w:r>
           </w:p>
         </w:tc>
@@ -15177,7 +15074,7 @@
                 <w:color w:val="1E293B"/>
                 <w:sz w:val="17"/>
               </w:rPr>
-              <w:t>Final Approval (SK)</w:t>
+              <w:t>Pengesahan Surat Keputusan</w:t>
             </w:r>
           </w:p>
         </w:tc>
@@ -15201,7 +15098,7 @@
                 <w:color w:val="1E293B"/>
                 <w:sz w:val="17"/>
               </w:rPr>
-              <w:t>COMPLETED</w:t>
+              <w:t>SELESAI (100%)</w:t>
             </w:r>
           </w:p>
         </w:tc>
@@ -15249,7 +15146,7 @@
                 <w:color w:val="1E293B"/>
                 <w:sz w:val="17"/>
               </w:rPr>
-              <w:t>Pengesahan SK UI Component</w:t>
+              <w:t>Komponen Pengesahan SK</w:t>
             </w:r>
           </w:p>
         </w:tc>
@@ -15299,7 +15196,7 @@
                 <w:color w:val="1E293B"/>
                 <w:sz w:val="17"/>
               </w:rPr>
-              <w:t>Promosi Master Data</w:t>
+              <w:t>Pembaruan Data Otomatis</w:t>
             </w:r>
           </w:p>
         </w:tc>
@@ -15323,7 +15220,7 @@
                 <w:color w:val="1E293B"/>
                 <w:sz w:val="17"/>
               </w:rPr>
-              <w:t>COMPLETED</w:t>
+              <w:t>SELESAI (100%)</w:t>
             </w:r>
           </w:p>
         </w:tc>
@@ -15347,7 +15244,7 @@
                 <w:color w:val="1E293B"/>
                 <w:sz w:val="17"/>
               </w:rPr>
-              <w:t>Promote Transaction Engine</w:t>
+              <w:t>Mesin Pemindahan Data Master</w:t>
             </w:r>
           </w:p>
         </w:tc>
@@ -15371,7 +15268,7 @@
                 <w:color w:val="1E293B"/>
                 <w:sz w:val="17"/>
               </w:rPr>
-              <w:t>Promotion Status Indicator</w:t>
+              <w:t>Indikator Status Promosi</w:t>
             </w:r>
           </w:p>
         </w:tc>
@@ -15395,7 +15292,7 @@
                 <w:color w:val="1E293B"/>
                 <w:sz w:val="17"/>
               </w:rPr>
-              <w:t>Migrasi usulan ke master data otomatis</w:t>
+              <w:t>Mutasi usulan ke master aktif otomatis</w:t>
             </w:r>
           </w:p>
         </w:tc>
@@ -15421,7 +15318,7 @@
                 <w:color w:val="1E293B"/>
                 <w:sz w:val="17"/>
               </w:rPr>
-              <w:t>Dashboard Eksekutif</w:t>
+              <w:t>Dashboard Capaian Pimpinan</w:t>
             </w:r>
           </w:p>
         </w:tc>
@@ -15445,7 +15342,7 @@
                 <w:color w:val="1E293B"/>
                 <w:sz w:val="17"/>
               </w:rPr>
-              <w:t>COMPLETED</w:t>
+              <w:t>SELESAI (100%)</w:t>
             </w:r>
           </w:p>
         </w:tc>
@@ -15493,7 +15390,7 @@
                 <w:color w:val="1E293B"/>
                 <w:sz w:val="17"/>
               </w:rPr>
-              <w:t>Dashboard Cards &amp; Funnel UI</w:t>
+              <w:t>Kartu Capaian &amp; Funnel UI</w:t>
             </w:r>
           </w:p>
         </w:tc>
@@ -15517,7 +15414,7 @@
                 <w:color w:val="1E293B"/>
                 <w:sz w:val="17"/>
               </w:rPr>
-              <w:t>Metrik live terhubung ke eskld_db</w:t>
+              <w:t>Metrik live terhubung ke basis data</w:t>
             </w:r>
           </w:p>
         </w:tc>
@@ -15543,7 +15440,7 @@
                 <w:color w:val="1E293B"/>
                 <w:sz w:val="17"/>
               </w:rPr>
-              <w:t>Pelaporan &amp; Ekspor</w:t>
+              <w:t>Pusat Unduh Laporan</w:t>
             </w:r>
           </w:p>
         </w:tc>
@@ -15567,7 +15464,7 @@
                 <w:color w:val="1E293B"/>
                 <w:sz w:val="17"/>
               </w:rPr>
-              <w:t>COMPLETED</w:t>
+              <w:t>SELESAI (100%)</w:t>
             </w:r>
           </w:p>
         </w:tc>
@@ -15615,7 +15512,7 @@
                 <w:color w:val="1E293B"/>
                 <w:sz w:val="17"/>
               </w:rPr>
-              <w:t>Analytics Studio &amp; CSV Downloader</w:t>
+              <w:t>Pusat Analitik &amp; Unduh CSV</w:t>
             </w:r>
           </w:p>
         </w:tc>
@@ -15639,7 +15536,7 @@
                 <w:color w:val="1E293B"/>
                 <w:sz w:val="17"/>
               </w:rPr>
-              <w:t>Unduh berkas CSV/JSON live terverifikasi</w:t>
+              <w:t>Unduh berkas CSV/JSON resmi terverifikasi</w:t>
             </w:r>
           </w:p>
         </w:tc>
@@ -15665,7 +15562,7 @@
                 <w:color w:val="1E293B"/>
                 <w:sz w:val="17"/>
               </w:rPr>
-              <w:t>Forensik Audit Trail</w:t>
+              <w:t>Forensik Log Transaksi</w:t>
             </w:r>
           </w:p>
         </w:tc>
@@ -15689,7 +15586,7 @@
                 <w:color w:val="1E293B"/>
                 <w:sz w:val="17"/>
               </w:rPr>
-              <w:t>COMPLETED</w:t>
+              <w:t>SELESAI (100%)</w:t>
             </w:r>
           </w:p>
         </w:tc>
@@ -15713,7 +15610,7 @@
                 <w:color w:val="1E293B"/>
                 <w:sz w:val="17"/>
               </w:rPr>
-              <w:t>AuditService (Append-Only)</w:t>
+              <w:t>AuditService (Pencatatan Permanen)</w:t>
             </w:r>
           </w:p>
         </w:tc>
@@ -15737,7 +15634,7 @@
                 <w:color w:val="1E293B"/>
                 <w:sz w:val="17"/>
               </w:rPr>
-              <w:t>Audit Log Table &amp; Modal Diff</w:t>
+              <w:t>Tabel Log &amp; Modal Perubahan</w:t>
             </w:r>
           </w:p>
         </w:tc>
@@ -15787,7 +15684,7 @@
                 <w:color w:val="1E293B"/>
                 <w:sz w:val="17"/>
               </w:rPr>
-              <w:t>Realtime Presence</w:t>
+              <w:t>Status Verifikator Aktif</w:t>
             </w:r>
           </w:p>
         </w:tc>
@@ -15811,7 +15708,7 @@
                 <w:color w:val="1E293B"/>
                 <w:sz w:val="17"/>
               </w:rPr>
-              <w:t>FUTURE REQUIREMENT</w:t>
+              <w:t>PENGEMBANGAN LANJUT</w:t>
             </w:r>
           </w:p>
         </w:tc>
@@ -15835,7 +15732,7 @@
                 <w:color w:val="1E293B"/>
                 <w:sz w:val="17"/>
               </w:rPr>
-              <w:t>Belum Diimplementasikan</w:t>
+              <w:t>Rencana Tahap Berikutnya</w:t>
             </w:r>
           </w:p>
         </w:tc>
@@ -15859,7 +15756,7 @@
                 <w:color w:val="1E293B"/>
                 <w:sz w:val="17"/>
               </w:rPr>
-              <w:t>Belum Diimplementasikan</w:t>
+              <w:t>Rencana Tahap Berikutnya</w:t>
             </w:r>
           </w:p>
         </w:tc>
@@ -15883,7 +15780,7 @@
                 <w:color w:val="1E293B"/>
                 <w:sz w:val="17"/>
               </w:rPr>
-              <w:t>Tercatat resmi sebagai OPEN-005</w:t>
+              <w:t>Tercatat resmi sebagai agenda OPEN-005</w:t>
             </w:r>
           </w:p>
         </w:tc>
@@ -15906,7 +15803,7 @@
           <w:color w:val="0B2A4A"/>
           <w:sz w:val="28"/>
         </w:rPr>
-        <w:t>BAB 20 — RENCANA PENGEMBANGAN LANJUTAN</w:t>
+        <w:t>BAB 20 — RENCANA PENGEMBANGAN TAHAP LANJUTAN</w:t>
       </w:r>
     </w:p>
     <w:p>
@@ -15920,7 +15817,7 @@
           <w:color w:val="0B2A4A"/>
           <w:sz w:val="20"/>
         </w:rPr>
-        <w:t xml:space="preserve">1. OPEN-005 (Realtime Presence &amp; Active Reviewer): </w:t>
+        <w:t xml:space="preserve">1. Status Verifikator Aktif (OPEN-005): </w:t>
       </w:r>
       <w:r>
         <w:rPr>
@@ -15928,7 +15825,7 @@
           <w:color w:val="1E293B"/>
           <w:sz w:val="20"/>
         </w:rPr>
-        <w:t>Penyediaan indikator status online/offline real-time bagi verifikator yang sedang menelaah berkas usulan yang sama menggunakan teknologi WebSocket / Server-Sent Events (SSE) / Redis.</w:t>
+        <w:t>Penyediaan indikator status online real-time untuk mengetahui verifikator yang sedang menelaah usulan yang sama menggunakan teknologi WebSocket / Server-Sent Events.</w:t>
       </w:r>
     </w:p>
     <w:p>
@@ -15942,7 +15839,7 @@
           <w:color w:val="0B2A4A"/>
           <w:sz w:val="20"/>
         </w:rPr>
-        <w:t xml:space="preserve">2. Digital Signature Integration: </w:t>
+        <w:t xml:space="preserve">2. Tanda Tangan Elektronik Tersertifikasi: </w:t>
       </w:r>
       <w:r>
         <w:rPr>
@@ -15950,7 +15847,7 @@
           <w:color w:val="1E293B"/>
           <w:sz w:val="20"/>
         </w:rPr>
-        <w:t>Integrasi modul tanda tangan digital tersertifikasi bekerjasama dengan Balai Sertifikasi Elektronik (BSrE) BSSN untuk penerbitan dokumen SK resmi.</w:t>
+        <w:t>Integrasi tanda tangan digital tersertifikasi bekerjasama dengan Balai Sertifikasi Elektronik (BSrE) BSSN untuk penerbitan dokumen SK elektronik.</w:t>
       </w:r>
     </w:p>
     <w:p>
@@ -15964,7 +15861,7 @@
           <w:color w:val="0B2A4A"/>
           <w:sz w:val="20"/>
         </w:rPr>
-        <w:t xml:space="preserve">3. Multi-Faceted Document Attachment: </w:t>
+        <w:t xml:space="preserve">3. Penyimpanan Berkas Naskah Digital: </w:t>
       </w:r>
       <w:r>
         <w:rPr>
@@ -15972,7 +15869,7 @@
           <w:color w:val="1E293B"/>
           <w:sz w:val="20"/>
         </w:rPr>
-        <w:t>Penambahan storage terenkripsi untuk pengunggahan naskah akademik, regulasi pembentukan, dan dokumen pendukung berukuran besar.</w:t>
+        <w:t>Penambahan media penyimpanan terenkripsi untuk pengunggahan naskah akademik, regulasi pembentukan, dan dokumen pendukung berukuran besar.</w:t>
       </w:r>
     </w:p>
     <w:p>
@@ -16000,7 +15897,7 @@
           <w:color w:val="1E293B"/>
           <w:sz w:val="20"/>
         </w:rPr>
-        <w:t>Dokumen Perancangan Sistem dan Prototype Aplikasi E-SKLD / SIGMA-K Versi 1.0 ini merangkum seluruh hasil capaian rekayasa perangkat lunak yang telah berhasil dibangun, diintegrasikan, dan diuji secara komprehensif. Sistem telah membuktikan kesiapan arsitektur dalam mengelola master data kelembagaan kementerian/lembaga/daerah, memfasilitasi tata kelola pengusulan penataan organisasi secara terstruktur, menegakkan prinsip Zero-Trust dan pemisahan wewenang (Separation of Duties), serta menyediakan rekam jejak forensik mutlak guna mendukung tata kelola pemerintahan digital yang bersih, transparan, dan akuntabel di Indonesia.</w:t>
+        <w:t>Dokumen Perancangan Sistem dan Prototype Aplikasi E-SKLD / SIGMA-K Versi 1.0 ini merangkum seluruh hasil capaian pembangunan perangkat lunak yang telah berhasil dibangun, diintegrasikan, dan diuji secara komprehensif. Sistem telah membuktikan kesiapan arsitektur dalam mengelola master data kelembagaan kementerian/lembaga/pemerintah daerah, memfasilitasi tata kelola pengusulan penataan organisasi secara terstruktur, menegakkan prinsip pemisahan wewenang kerja yang akuntabel, serta menyediakan rekam jejak forensik mutlak guna mendukung terwujudnya tata kelola pemerintahan digital yang bersih, transparan, dan terpercaya di Indonesia.</w:t>
       </w:r>
     </w:p>
     <w:sectPr>

</xml_diff>

<commit_message>
docs: add authentic visual SQL ERD schema with table entities, PK/FK columns, and relational connector arrows
</commit_message>
<xml_diff>
--- a/docs/DOKUMEN_PERANCANGAN_SIGMA-K_v1.0.docx
+++ b/docs/DOKUMEN_PERANCANGAN_SIGMA-K_v1.0.docx
@@ -8976,6 +8976,39 @@
       </w:pPr>
     </w:p>
     <w:p>
+      <w:r>
+        <w:br w:type="page"/>
+      </w:r>
+    </w:p>
+    <w:p>
+      <w:pPr>
+        <w:keepNext/>
+        <w:spacing w:before="200" w:after="80"/>
+      </w:pPr>
+      <w:r>
+        <w:rPr>
+          <w:rFonts w:ascii="Calibri" w:hAnsi="Calibri"/>
+          <w:b/>
+          <w:color w:val="1E40AF"/>
+          <w:sz w:val="24"/>
+        </w:rPr>
+        <w:t>7.2 Bagan Relasi Visual SQL ERD (Bagan Antar Tabel Relasional)</w:t>
+      </w:r>
+    </w:p>
+    <w:p>
+      <w:pPr>
+        <w:spacing w:after="80" w:line="276" w:lineRule="auto"/>
+      </w:pPr>
+      <w:r>
+        <w:rPr>
+          <w:rFonts w:ascii="Calibri" w:hAnsi="Calibri"/>
+          <w:color w:val="1E293B"/>
+          <w:sz w:val="20"/>
+        </w:rPr>
+        <w:t>Bagan visual SQL di bawah ini menyajikan seluruh tabel dengan atribut kolom, kunci utama (PK), kunci relasi (FK), serta garis panah relasional antar tabel:</w:t>
+      </w:r>
+    </w:p>
+    <w:p>
       <w:pPr>
         <w:keepNext/>
         <w:spacing w:before="160" w:after="60"/>
@@ -8984,7 +9017,7 @@
       <w:r>
         <w:drawing>
           <wp:inline xmlns:a="http://schemas.openxmlformats.org/drawingml/2006/main" xmlns:pic="http://schemas.openxmlformats.org/drawingml/2006/picture">
-            <wp:extent cx="5760720" cy="3240405"/>
+            <wp:extent cx="5760720" cy="3520440"/>
             <wp:docPr id="6" name="Picture 6"/>
             <wp:cNvGraphicFramePr>
               <a:graphicFrameLocks noChangeAspect="1"/>
@@ -9005,7 +9038,7 @@
                   <pic:spPr>
                     <a:xfrm>
                       <a:off x="0" y="0"/>
-                      <a:ext cx="5760720" cy="3240405"/>
+                      <a:ext cx="5760720" cy="3520440"/>
                     </a:xfrm>
                     <a:prstGeom prst="rect"/>
                   </pic:spPr>
@@ -9028,7 +9061,7 @@
           <w:color w:val="475569"/>
           <w:sz w:val="18"/>
         </w:rPr>
-        <w:t>Gambar 6: Entity Relationship Diagram (ERD) Basis Data eskld_db (21 Tabel)</w:t>
+        <w:t>Gambar 6: Skema Relasional Basis Data (Visual SQL ERD) eskld_db (21 Tabel Relasional)</w:t>
       </w:r>
     </w:p>
     <w:p>

</xml_diff>